<commit_message>
docs: especificacion v2 aprobada (ERS 3.2, HU y RE 3.1, RN 2.1) y plan del modulo M0
</commit_message>
<xml_diff>
--- a/public/docs/descargas/ers.docx
+++ b/public/docs/descargas/ers.docx
@@ -29,7 +29,7 @@
         <w:pStyle w:val="PortadaRevision"/>
       </w:pPr>
       <w:r>
-        <w:t>Revisión 3.1 · ISO/IEC/IEEE 29148:2018</w:t>
+        <w:t>Revisión 3.2 · ISO/IEC/IEEE 29148:2018</w:t>
       </w:r>
     </w:p>
     <w:p>
@@ -93,7 +93,7 @@
           <w:noProof/>
         </w:rPr>
         <w:drawing>
-          <wp:inline distT="0" distB="0" distL="0" distR="0" wp14:anchorId="729C49A1" wp14:editId="729C49A2">
+          <wp:inline distT="0" distB="0" distL="0" distR="0" wp14:anchorId="2A2F3B35" wp14:editId="2A2F3B36">
             <wp:extent cx="395999" cy="405503"/>
             <wp:effectExtent l="0" t="0" r="0" b="0"/>
             <wp:docPr id="10" name="Picture"/>
@@ -486,6 +486,7 @@
           <w:p>
             <w:pPr>
               <w:pStyle w:val="Celda"/>
+              <w:keepNext/>
             </w:pPr>
             <w:r>
               <w:t>05/10/2026</w:t>
@@ -499,9 +500,69 @@
           <w:p>
             <w:pPr>
               <w:pStyle w:val="Celda"/>
+              <w:keepNext/>
             </w:pPr>
             <w:r>
               <w:t>3.1</w:t>
+            </w:r>
+          </w:p>
+        </w:tc>
+        <w:tc>
+          <w:tcPr>
+            <w:tcW w:w="1623" w:type="pct"/>
+          </w:tcPr>
+          <w:p>
+            <w:pPr>
+              <w:pStyle w:val="Celda"/>
+              <w:keepNext/>
+            </w:pPr>
+            <w:r>
+              <w:t>ISO/IEC/IEEE 29148:2018</w:t>
+            </w:r>
+          </w:p>
+        </w:tc>
+        <w:tc>
+          <w:tcPr>
+            <w:tcW w:w="1948" w:type="pct"/>
+          </w:tcPr>
+          <w:p>
+            <w:pPr>
+              <w:pStyle w:val="Celda"/>
+              <w:keepNext/>
+            </w:pPr>
+            <w:r>
+              <w:t>Juan Sebastián Carvajal Home</w:t>
+            </w:r>
+          </w:p>
+        </w:tc>
+      </w:tr>
+      <w:tr>
+        <w:trPr>
+          <w:cantSplit/>
+        </w:trPr>
+        <w:tc>
+          <w:tcPr>
+            <w:tcW w:w="779" w:type="pct"/>
+          </w:tcPr>
+          <w:p>
+            <w:pPr>
+              <w:pStyle w:val="Celda"/>
+            </w:pPr>
+            <w:r>
+              <w:t>06/10/2026</w:t>
+            </w:r>
+          </w:p>
+        </w:tc>
+        <w:tc>
+          <w:tcPr>
+            <w:tcW w:w="649" w:type="pct"/>
+          </w:tcPr>
+          <w:p>
+            <w:pPr>
+              <w:pStyle w:val="Celda"/>
+            </w:pPr>
+            <w:r>
+              <w:t>3.2</w:t>
             </w:r>
           </w:p>
         </w:tc>
@@ -681,7 +742,7 @@
       <w:r>
         <w:fldChar w:fldCharType="separate"/>
       </w:r>
-      <w:hyperlink w:anchor="_Toc242135396" w:history="1">
+      <w:hyperlink w:anchor="_Toc242196654" w:history="1">
         <w:r>
           <w:rPr>
             <w:rStyle w:val="Hipervnculo"/>
@@ -708,7 +769,7 @@
             <w:noProof/>
             <w:webHidden/>
           </w:rPr>
-          <w:instrText xml:space="preserve"> PAGEREF _Toc242135396 \h </w:instrText>
+          <w:instrText xml:space="preserve"> PAGEREF _Toc242196654 \h </w:instrText>
         </w:r>
         <w:r>
           <w:rPr>
@@ -751,7 +812,7 @@
           <w14:ligatures w14:val="standardContextual"/>
         </w:rPr>
       </w:pPr>
-      <w:hyperlink w:anchor="_Toc242135397" w:history="1">
+      <w:hyperlink w:anchor="_Toc242196655" w:history="1">
         <w:r>
           <w:rPr>
             <w:rStyle w:val="Hipervnculo"/>
@@ -778,7 +839,7 @@
             <w:noProof/>
             <w:webHidden/>
           </w:rPr>
-          <w:instrText xml:space="preserve"> PAGEREF _Toc242135397 \h </w:instrText>
+          <w:instrText xml:space="preserve"> PAGEREF _Toc242196655 \h </w:instrText>
         </w:r>
         <w:r>
           <w:rPr>
@@ -821,7 +882,7 @@
           <w14:ligatures w14:val="standardContextual"/>
         </w:rPr>
       </w:pPr>
-      <w:hyperlink w:anchor="_Toc242135398" w:history="1">
+      <w:hyperlink w:anchor="_Toc242196656" w:history="1">
         <w:r>
           <w:rPr>
             <w:rStyle w:val="Hipervnculo"/>
@@ -848,7 +909,7 @@
             <w:noProof/>
             <w:webHidden/>
           </w:rPr>
-          <w:instrText xml:space="preserve"> PAGEREF _Toc242135398 \h </w:instrText>
+          <w:instrText xml:space="preserve"> PAGEREF _Toc242196656 \h </w:instrText>
         </w:r>
         <w:r>
           <w:rPr>
@@ -891,7 +952,7 @@
           <w14:ligatures w14:val="standardContextual"/>
         </w:rPr>
       </w:pPr>
-      <w:hyperlink w:anchor="_Toc242135399" w:history="1">
+      <w:hyperlink w:anchor="_Toc242196657" w:history="1">
         <w:r>
           <w:rPr>
             <w:rStyle w:val="Hipervnculo"/>
@@ -918,7 +979,7 @@
             <w:noProof/>
             <w:webHidden/>
           </w:rPr>
-          <w:instrText xml:space="preserve"> PAGEREF _Toc242135399 \h </w:instrText>
+          <w:instrText xml:space="preserve"> PAGEREF _Toc242196657 \h </w:instrText>
         </w:r>
         <w:r>
           <w:rPr>
@@ -961,7 +1022,7 @@
           <w14:ligatures w14:val="standardContextual"/>
         </w:rPr>
       </w:pPr>
-      <w:hyperlink w:anchor="_Toc242135400" w:history="1">
+      <w:hyperlink w:anchor="_Toc242196658" w:history="1">
         <w:r>
           <w:rPr>
             <w:rStyle w:val="Hipervnculo"/>
@@ -988,7 +1049,7 @@
             <w:noProof/>
             <w:webHidden/>
           </w:rPr>
-          <w:instrText xml:space="preserve"> PAGEREF _Toc242135400 \h </w:instrText>
+          <w:instrText xml:space="preserve"> PAGEREF _Toc242196658 \h </w:instrText>
         </w:r>
         <w:r>
           <w:rPr>
@@ -1031,7 +1092,7 @@
           <w14:ligatures w14:val="standardContextual"/>
         </w:rPr>
       </w:pPr>
-      <w:hyperlink w:anchor="_Toc242135401" w:history="1">
+      <w:hyperlink w:anchor="_Toc242196659" w:history="1">
         <w:r>
           <w:rPr>
             <w:rStyle w:val="Hipervnculo"/>
@@ -1058,7 +1119,7 @@
             <w:noProof/>
             <w:webHidden/>
           </w:rPr>
-          <w:instrText xml:space="preserve"> PAGEREF _Toc242135401 \h </w:instrText>
+          <w:instrText xml:space="preserve"> PAGEREF _Toc242196659 \h </w:instrText>
         </w:r>
         <w:r>
           <w:rPr>
@@ -1104,7 +1165,7 @@
           <w14:ligatures w14:val="standardContextual"/>
         </w:rPr>
       </w:pPr>
-      <w:hyperlink w:anchor="_Toc242135402" w:history="1">
+      <w:hyperlink w:anchor="_Toc242196660" w:history="1">
         <w:r>
           <w:rPr>
             <w:rStyle w:val="Hipervnculo"/>
@@ -1131,7 +1192,7 @@
             <w:noProof/>
             <w:webHidden/>
           </w:rPr>
-          <w:instrText xml:space="preserve"> PAGEREF _Toc242135402 \h </w:instrText>
+          <w:instrText xml:space="preserve"> PAGEREF _Toc242196660 \h </w:instrText>
         </w:r>
         <w:r>
           <w:rPr>
@@ -1174,7 +1235,7 @@
           <w14:ligatures w14:val="standardContextual"/>
         </w:rPr>
       </w:pPr>
-      <w:hyperlink w:anchor="_Toc242135403" w:history="1">
+      <w:hyperlink w:anchor="_Toc242196661" w:history="1">
         <w:r>
           <w:rPr>
             <w:rStyle w:val="Hipervnculo"/>
@@ -1201,7 +1262,7 @@
             <w:noProof/>
             <w:webHidden/>
           </w:rPr>
-          <w:instrText xml:space="preserve"> PAGEREF _Toc242135403 \h </w:instrText>
+          <w:instrText xml:space="preserve"> PAGEREF _Toc242196661 \h </w:instrText>
         </w:r>
         <w:r>
           <w:rPr>
@@ -1244,7 +1305,7 @@
           <w14:ligatures w14:val="standardContextual"/>
         </w:rPr>
       </w:pPr>
-      <w:hyperlink w:anchor="_Toc242135404" w:history="1">
+      <w:hyperlink w:anchor="_Toc242196662" w:history="1">
         <w:r>
           <w:rPr>
             <w:rStyle w:val="Hipervnculo"/>
@@ -1271,7 +1332,7 @@
             <w:noProof/>
             <w:webHidden/>
           </w:rPr>
-          <w:instrText xml:space="preserve"> PAGEREF _Toc242135404 \h </w:instrText>
+          <w:instrText xml:space="preserve"> PAGEREF _Toc242196662 \h </w:instrText>
         </w:r>
         <w:r>
           <w:rPr>
@@ -1314,7 +1375,7 @@
           <w14:ligatures w14:val="standardContextual"/>
         </w:rPr>
       </w:pPr>
-      <w:hyperlink w:anchor="_Toc242135405" w:history="1">
+      <w:hyperlink w:anchor="_Toc242196663" w:history="1">
         <w:r>
           <w:rPr>
             <w:rStyle w:val="Hipervnculo"/>
@@ -1341,7 +1402,7 @@
             <w:noProof/>
             <w:webHidden/>
           </w:rPr>
-          <w:instrText xml:space="preserve"> PAGEREF _Toc242135405 \h </w:instrText>
+          <w:instrText xml:space="preserve"> PAGEREF _Toc242196663 \h </w:instrText>
         </w:r>
         <w:r>
           <w:rPr>
@@ -1384,7 +1445,7 @@
           <w14:ligatures w14:val="standardContextual"/>
         </w:rPr>
       </w:pPr>
-      <w:hyperlink w:anchor="_Toc242135406" w:history="1">
+      <w:hyperlink w:anchor="_Toc242196664" w:history="1">
         <w:r>
           <w:rPr>
             <w:rStyle w:val="Hipervnculo"/>
@@ -1411,7 +1472,7 @@
             <w:noProof/>
             <w:webHidden/>
           </w:rPr>
-          <w:instrText xml:space="preserve"> PAGEREF _Toc242135406 \h </w:instrText>
+          <w:instrText xml:space="preserve"> PAGEREF _Toc242196664 \h </w:instrText>
         </w:r>
         <w:r>
           <w:rPr>
@@ -1454,7 +1515,7 @@
           <w14:ligatures w14:val="standardContextual"/>
         </w:rPr>
       </w:pPr>
-      <w:hyperlink w:anchor="_Toc242135407" w:history="1">
+      <w:hyperlink w:anchor="_Toc242196665" w:history="1">
         <w:r>
           <w:rPr>
             <w:rStyle w:val="Hipervnculo"/>
@@ -1481,7 +1542,7 @@
             <w:noProof/>
             <w:webHidden/>
           </w:rPr>
-          <w:instrText xml:space="preserve"> PAGEREF _Toc242135407 \h </w:instrText>
+          <w:instrText xml:space="preserve"> PAGEREF _Toc242196665 \h </w:instrText>
         </w:r>
         <w:r>
           <w:rPr>
@@ -1524,7 +1585,7 @@
           <w14:ligatures w14:val="standardContextual"/>
         </w:rPr>
       </w:pPr>
-      <w:hyperlink w:anchor="_Toc242135408" w:history="1">
+      <w:hyperlink w:anchor="_Toc242196666" w:history="1">
         <w:r>
           <w:rPr>
             <w:rStyle w:val="Hipervnculo"/>
@@ -1551,7 +1612,7 @@
             <w:noProof/>
             <w:webHidden/>
           </w:rPr>
-          <w:instrText xml:space="preserve"> PAGEREF _Toc242135408 \h </w:instrText>
+          <w:instrText xml:space="preserve"> PAGEREF _Toc242196666 \h </w:instrText>
         </w:r>
         <w:r>
           <w:rPr>
@@ -1597,7 +1658,7 @@
           <w14:ligatures w14:val="standardContextual"/>
         </w:rPr>
       </w:pPr>
-      <w:hyperlink w:anchor="_Toc242135409" w:history="1">
+      <w:hyperlink w:anchor="_Toc242196667" w:history="1">
         <w:r>
           <w:rPr>
             <w:rStyle w:val="Hipervnculo"/>
@@ -1624,7 +1685,7 @@
             <w:noProof/>
             <w:webHidden/>
           </w:rPr>
-          <w:instrText xml:space="preserve"> PAGEREF _Toc242135409 \h </w:instrText>
+          <w:instrText xml:space="preserve"> PAGEREF _Toc242196667 \h </w:instrText>
         </w:r>
         <w:r>
           <w:rPr>
@@ -1667,7 +1728,7 @@
           <w14:ligatures w14:val="standardContextual"/>
         </w:rPr>
       </w:pPr>
-      <w:hyperlink w:anchor="_Toc242135410" w:history="1">
+      <w:hyperlink w:anchor="_Toc242196668" w:history="1">
         <w:r>
           <w:rPr>
             <w:rStyle w:val="Hipervnculo"/>
@@ -1694,7 +1755,7 @@
             <w:noProof/>
             <w:webHidden/>
           </w:rPr>
-          <w:instrText xml:space="preserve"> PAGEREF _Toc242135410 \h </w:instrText>
+          <w:instrText xml:space="preserve"> PAGEREF _Toc242196668 \h </w:instrText>
         </w:r>
         <w:r>
           <w:rPr>
@@ -1737,7 +1798,7 @@
           <w14:ligatures w14:val="standardContextual"/>
         </w:rPr>
       </w:pPr>
-      <w:hyperlink w:anchor="_Toc242135411" w:history="1">
+      <w:hyperlink w:anchor="_Toc242196669" w:history="1">
         <w:r>
           <w:rPr>
             <w:rStyle w:val="Hipervnculo"/>
@@ -1764,7 +1825,7 @@
             <w:noProof/>
             <w:webHidden/>
           </w:rPr>
-          <w:instrText xml:space="preserve"> PAGEREF _Toc242135411 \h </w:instrText>
+          <w:instrText xml:space="preserve"> PAGEREF _Toc242196669 \h </w:instrText>
         </w:r>
         <w:r>
           <w:rPr>
@@ -1807,7 +1868,7 @@
           <w14:ligatures w14:val="standardContextual"/>
         </w:rPr>
       </w:pPr>
-      <w:hyperlink w:anchor="_Toc242135412" w:history="1">
+      <w:hyperlink w:anchor="_Toc242196670" w:history="1">
         <w:r>
           <w:rPr>
             <w:rStyle w:val="Hipervnculo"/>
@@ -1834,7 +1895,7 @@
             <w:noProof/>
             <w:webHidden/>
           </w:rPr>
-          <w:instrText xml:space="preserve"> PAGEREF _Toc242135412 \h </w:instrText>
+          <w:instrText xml:space="preserve"> PAGEREF _Toc242196670 \h </w:instrText>
         </w:r>
         <w:r>
           <w:rPr>
@@ -1880,7 +1941,7 @@
           <w14:ligatures w14:val="standardContextual"/>
         </w:rPr>
       </w:pPr>
-      <w:hyperlink w:anchor="_Toc242135413" w:history="1">
+      <w:hyperlink w:anchor="_Toc242196671" w:history="1">
         <w:r>
           <w:rPr>
             <w:rStyle w:val="Hipervnculo"/>
@@ -1907,7 +1968,7 @@
             <w:noProof/>
             <w:webHidden/>
           </w:rPr>
-          <w:instrText xml:space="preserve"> PAGEREF _Toc242135413 \h </w:instrText>
+          <w:instrText xml:space="preserve"> PAGEREF _Toc242196671 \h </w:instrText>
         </w:r>
         <w:r>
           <w:rPr>
@@ -1953,7 +2014,7 @@
           <w14:ligatures w14:val="standardContextual"/>
         </w:rPr>
       </w:pPr>
-      <w:hyperlink w:anchor="_Toc242135414" w:history="1">
+      <w:hyperlink w:anchor="_Toc242196672" w:history="1">
         <w:r>
           <w:rPr>
             <w:rStyle w:val="Hipervnculo"/>
@@ -1980,7 +2041,7 @@
             <w:noProof/>
             <w:webHidden/>
           </w:rPr>
-          <w:instrText xml:space="preserve"> PAGEREF _Toc242135414 \h </w:instrText>
+          <w:instrText xml:space="preserve"> PAGEREF _Toc242196672 \h </w:instrText>
         </w:r>
         <w:r>
           <w:rPr>
@@ -2023,7 +2084,7 @@
           <w14:ligatures w14:val="standardContextual"/>
         </w:rPr>
       </w:pPr>
-      <w:hyperlink w:anchor="_Toc242135415" w:history="1">
+      <w:hyperlink w:anchor="_Toc242196673" w:history="1">
         <w:r>
           <w:rPr>
             <w:rStyle w:val="Hipervnculo"/>
@@ -2050,7 +2111,7 @@
             <w:noProof/>
             <w:webHidden/>
           </w:rPr>
-          <w:instrText xml:space="preserve"> PAGEREF _Toc242135415 \h </w:instrText>
+          <w:instrText xml:space="preserve"> PAGEREF _Toc242196673 \h </w:instrText>
         </w:r>
         <w:r>
           <w:rPr>
@@ -2093,7 +2154,7 @@
           <w14:ligatures w14:val="standardContextual"/>
         </w:rPr>
       </w:pPr>
-      <w:hyperlink w:anchor="_Toc242135416" w:history="1">
+      <w:hyperlink w:anchor="_Toc242196674" w:history="1">
         <w:r>
           <w:rPr>
             <w:rStyle w:val="Hipervnculo"/>
@@ -2120,7 +2181,7 @@
             <w:noProof/>
             <w:webHidden/>
           </w:rPr>
-          <w:instrText xml:space="preserve"> PAGEREF _Toc242135416 \h </w:instrText>
+          <w:instrText xml:space="preserve"> PAGEREF _Toc242196674 \h </w:instrText>
         </w:r>
         <w:r>
           <w:rPr>
@@ -2163,7 +2224,7 @@
           <w14:ligatures w14:val="standardContextual"/>
         </w:rPr>
       </w:pPr>
-      <w:hyperlink w:anchor="_Toc242135417" w:history="1">
+      <w:hyperlink w:anchor="_Toc242196675" w:history="1">
         <w:r>
           <w:rPr>
             <w:rStyle w:val="Hipervnculo"/>
@@ -2190,7 +2251,7 @@
             <w:noProof/>
             <w:webHidden/>
           </w:rPr>
-          <w:instrText xml:space="preserve"> PAGEREF _Toc242135417 \h </w:instrText>
+          <w:instrText xml:space="preserve"> PAGEREF _Toc242196675 \h </w:instrText>
         </w:r>
         <w:r>
           <w:rPr>
@@ -2233,7 +2294,7 @@
           <w14:ligatures w14:val="standardContextual"/>
         </w:rPr>
       </w:pPr>
-      <w:hyperlink w:anchor="_Toc242135418" w:history="1">
+      <w:hyperlink w:anchor="_Toc242196676" w:history="1">
         <w:r>
           <w:rPr>
             <w:rStyle w:val="Hipervnculo"/>
@@ -2260,7 +2321,7 @@
             <w:noProof/>
             <w:webHidden/>
           </w:rPr>
-          <w:instrText xml:space="preserve"> PAGEREF _Toc242135418 \h </w:instrText>
+          <w:instrText xml:space="preserve"> PAGEREF _Toc242196676 \h </w:instrText>
         </w:r>
         <w:r>
           <w:rPr>
@@ -2303,7 +2364,7 @@
           <w14:ligatures w14:val="standardContextual"/>
         </w:rPr>
       </w:pPr>
-      <w:hyperlink w:anchor="_Toc242135419" w:history="1">
+      <w:hyperlink w:anchor="_Toc242196677" w:history="1">
         <w:r>
           <w:rPr>
             <w:rStyle w:val="Hipervnculo"/>
@@ -2330,7 +2391,7 @@
             <w:noProof/>
             <w:webHidden/>
           </w:rPr>
-          <w:instrText xml:space="preserve"> PAGEREF _Toc242135419 \h </w:instrText>
+          <w:instrText xml:space="preserve"> PAGEREF _Toc242196677 \h </w:instrText>
         </w:r>
         <w:r>
           <w:rPr>
@@ -2350,7 +2411,7 @@
             <w:noProof/>
             <w:webHidden/>
           </w:rPr>
-          <w:t>32</w:t>
+          <w:t>33</w:t>
         </w:r>
         <w:r>
           <w:rPr>
@@ -2487,7 +2548,26 @@
         <w:t>numérico como clave (§5.2); especifica el cálculo del triage y la agenda inteligente completa (RF-2.12, RF-4.11 a RF-4.15, RF-7.5); protege el registro de clínicas, el carnet QR y la reputación (RF-0.3, RF-5.7, RF-5.8, RF-8.3); fija los límites del plan gratuito, el comportamiento al bajar de plan y la excepción de las urgencias (RF-0.4 a RF-0.6); agrega el derecho de supresión, el dashboard y la página pública (RF-5.9, RF-6.1, RF-6.2, RF-9.1); endurece la sesión (RNF-12 a RNF-15); completa el modelo de dat</w:t>
       </w:r>
       <w:r>
-        <w:t>os (§5.2) y registra las capas avanzadas del plan profesional como requisito futuro (RF-F.8).</w:t>
+        <w:t>os (§5.2) y registra las capas avanzadas del plan profesional como requisito futuro (RF-F.8). La</w:t>
+      </w:r>
+      <w:r>
+        <w:t xml:space="preserve"> </w:t>
+      </w:r>
+      <w:r>
+        <w:rPr>
+          <w:b/>
+          <w:bCs/>
+        </w:rPr>
+        <w:t>revisión 3.2</w:t>
+      </w:r>
+      <w:r>
+        <w:t xml:space="preserve"> </w:t>
+      </w:r>
+      <w:r>
+        <w:t>corrige las incoherencias detectadas al preparar la construcción: el alcance se reparte entre las entregas v2.0 y v2.1 y los criterios de aceptación se evalúan por entrega (§5.4); el aislamiento declara sus excepciones globales y la alerta genérica de interacción con medicación protegida de otra clínica (RNF-11); la urgencia presencial sin identidad verificada usa una ficha provisional (RF-4.10); entre sobrecupos naranja rige el orden de llegada (RF-4.7); y las ausencias del veterinario se registran por fec</w:t>
+      </w:r>
+      <w:r>
+        <w:t>ha y hora (§5.2).</w:t>
       </w:r>
     </w:p>
     <w:p>
@@ -2495,7 +2575,7 @@
         <w:pStyle w:val="Ttulo1"/>
       </w:pPr>
       <w:bookmarkStart w:id="0" w:name="_0e2973c2e3c317285bf344b2034a52754788c6d"/>
-      <w:bookmarkStart w:id="1" w:name="_Toc242135396"/>
+      <w:bookmarkStart w:id="1" w:name="_Toc242196654"/>
       <w:r>
         <w:lastRenderedPageBreak/>
         <w:t>1. Introducción</w:t>
@@ -2507,7 +2587,7 @@
         <w:pStyle w:val="Ttulo2"/>
       </w:pPr>
       <w:bookmarkStart w:id="2" w:name="_53ca1eb396407438b910fbafb578b446b614ca3"/>
-      <w:bookmarkStart w:id="3" w:name="_Toc242135397"/>
+      <w:bookmarkStart w:id="3" w:name="_Toc242196655"/>
       <w:r>
         <w:t>1.1 Propósito</w:t>
       </w:r>
@@ -2518,17 +2598,40 @@
         <w:pStyle w:val="FirstParagraph"/>
       </w:pPr>
       <w:r>
-        <w:t xml:space="preserve">Este documento especifica, de forma precisa, completa y verificable, los requisitos funcionales y no funcionales del sistema </w:t>
+        <w:t xml:space="preserve">Este documento especifica, de forma precisa, completa y verificable, los requisitos funcionales y no funcionales de </w:t>
       </w:r>
       <w:r>
         <w:rPr>
           <w:b/>
           <w:bCs/>
         </w:rPr>
-        <w:t>Zooki v2.0</w:t>
-      </w:r>
-      <w:r>
-        <w:t>, y sirve como referente principal para el diseño, la implementación, las pruebas y la validación. Cada requisito se enuncia siguiendo las características de calidad del estándar ISO/IEC/IEEE 29148:2018 (necesario, verificable, no ambiguo, singular y trazable), con un identificador único y un criterio de verificación asociado.</w:t>
+        <w:t>Zooki v2</w:t>
+      </w:r>
+      <w:r>
+        <w:t xml:space="preserve">, repartidos entre las entregas </w:t>
+      </w:r>
+      <w:r>
+        <w:rPr>
+          <w:b/>
+          <w:bCs/>
+        </w:rPr>
+        <w:t>v2.0</w:t>
+      </w:r>
+      <w:r>
+        <w:t xml:space="preserve"> y </w:t>
+      </w:r>
+      <w:r>
+        <w:rPr>
+          <w:b/>
+          <w:bCs/>
+        </w:rPr>
+        <w:t>v2.1</w:t>
+      </w:r>
+      <w:r>
+        <w:t xml:space="preserve"> </w:t>
+      </w:r>
+      <w:r>
+        <w:t>del plan de historias. Sirve como referente para el diseño, la implementación, las pruebas y la validación. Cada requisito se enuncia siguiendo las características de calidad del estándar ISO/IEC/IEEE 29148:2018 (necesario, verificable, no ambiguo, singular y trazable), con un identificador único y un criterio de verificación asociado.</w:t>
       </w:r>
     </w:p>
     <w:p>
@@ -2536,7 +2639,7 @@
         <w:pStyle w:val="Ttulo2"/>
       </w:pPr>
       <w:bookmarkStart w:id="4" w:name="_807e0e4b2e93a972a9fa0860b3c406e1abe614d"/>
-      <w:bookmarkStart w:id="5" w:name="_Toc242135398"/>
+      <w:bookmarkStart w:id="5" w:name="_Toc242196656"/>
       <w:bookmarkEnd w:id="2"/>
       <w:r>
         <w:t>1.2 Alcance</w:t>
@@ -2558,7 +2661,10 @@
         <w:t>aplicación web SaaS multi-inquilino</w:t>
       </w:r>
       <w:r>
-        <w:t xml:space="preserve"> que permite a varias clínicas veterinarias pequeñas gestionar su operación clínica sobre una misma plataforma, con los datos de cada clínica aislados entre sí. La versión v2.0 abarca:</w:t>
+        <w:t xml:space="preserve"> </w:t>
+      </w:r>
+      <w:r>
+        <w:t>que permite a varias clínicas veterinarias pequeñas gestionar su operación clínica sobre una misma plataforma, con los datos de cada clínica aislados entre sí. El alcance completo de la v2 abarca las capacidades siguientes. Su reparto entre v2.0 y v2.1 lo fija el plan de entregas; una capacidad descrita aquí no se presume incluida en la primera entrega.</w:t>
       </w:r>
     </w:p>
     <w:p>
@@ -2577,7 +2683,10 @@
         <w:t>Plataforma y clínicas:</w:t>
       </w:r>
       <w:r>
-        <w:t xml:space="preserve"> registro autónomo (self-service) de clínicas, panel del super-administrador, suscripción por planes con control de límites (freemium) y configuración por clínica.</w:t>
+        <w:t xml:space="preserve"> </w:t>
+      </w:r>
+      <w:r>
+        <w:t>registro autónomo (self-service) de clínicas, panel del super-administrador, suscripción por planes con control de límites (freemium) y configuración por clínica.</w:t>
       </w:r>
     </w:p>
     <w:p>
@@ -2596,10 +2705,7 @@
         <w:t>Pacientes e historia clínica:</w:t>
       </w:r>
       <w:r>
-        <w:t xml:space="preserve"> </w:t>
-      </w:r>
-      <w:r>
-        <w:t xml:space="preserve">registro de mascotas y propietarios, historia clínica con consultas, tratamientos y archivos adjuntos. La mascota es </w:t>
+        <w:t xml:space="preserve"> registro de mascotas y propietarios, historia clínica con consultas, tratamientos y archivos adjuntos. La mascota es </w:t>
       </w:r>
       <w:r>
         <w:rPr>
@@ -2628,7 +2734,10 @@
         <w:t>Soporte a la decisión clínica (Grafo I):</w:t>
       </w:r>
       <w:r>
-        <w:t xml:space="preserve"> copiloto que, durante la consulta, sugiere diagnósticos ordenados por peso y advierte sobre toxicidades e interacciones mediante un grafo de conocimiento con signo.</w:t>
+        <w:t xml:space="preserve"> </w:t>
+      </w:r>
+      <w:r>
+        <w:t>copiloto que, durante la consulta, sugiere diagnósticos ordenados por peso y advierte sobre toxicidades e interacciones mediante un grafo de conocimiento con signo.</w:t>
       </w:r>
     </w:p>
     <w:p>
@@ -2647,10 +2756,7 @@
         <w:t>Agenda inteligente (Grafo II):</w:t>
       </w:r>
       <w:r>
-        <w:t xml:space="preserve"> </w:t>
-      </w:r>
-      <w:r>
-        <w:t>agendamiento que detecta conflictos, propaga retrasos de forma controlada, reasigna citas y prioriza por urgencia.</w:t>
+        <w:t xml:space="preserve"> agendamiento que detecta conflictos, propaga retrasos de forma controlada, reasigna citas y prioriza por urgencia.</w:t>
       </w:r>
     </w:p>
     <w:p>
@@ -2688,7 +2794,10 @@
         <w:t>Portal del propietario:</w:t>
       </w:r>
       <w:r>
-        <w:t xml:space="preserve"> auto-registro, vinculación a las clínicas que él elige, auto-agendamiento y cancelación de citas, centro de notificaciones, </w:t>
+        <w:t xml:space="preserve"> </w:t>
+      </w:r>
+      <w:r>
+        <w:t xml:space="preserve">auto-registro, vinculación a las clínicas que él elige, auto-agendamiento y cancelación de citas, centro de notificaciones, </w:t>
       </w:r>
       <w:r>
         <w:rPr>
@@ -2717,10 +2826,7 @@
         <w:t>Dashboard y reportes:</w:t>
       </w:r>
       <w:r>
-        <w:t xml:space="preserve"> </w:t>
-      </w:r>
-      <w:r>
-        <w:t>indicadores del día por rol, panel de operación del administrador y estadísticas.</w:t>
+        <w:t xml:space="preserve"> indicadores del día por rol, panel de operación del administrador y estadísticas.</w:t>
       </w:r>
     </w:p>
     <w:p>
@@ -2758,7 +2864,10 @@
         <w:t>Acceso y seguridad:</w:t>
       </w:r>
       <w:r>
-        <w:t xml:space="preserve"> autenticación local y federada (Google), control de acceso por roles y </w:t>
+        <w:t xml:space="preserve"> </w:t>
+      </w:r>
+      <w:r>
+        <w:t xml:space="preserve">autenticación local y federada (Google), control de acceso por roles y </w:t>
       </w:r>
       <w:r>
         <w:rPr>
@@ -2780,7 +2889,8 @@
           <w:b/>
           <w:bCs/>
         </w:rPr>
-        <w:t>Fuera de alcance (v2.0):</w:t>
+        <w:lastRenderedPageBreak/>
+        <w:t>Fuera del alcance de la v2:</w:t>
       </w:r>
       <w:r>
         <w:t xml:space="preserve"> inventario de medicamentos completo, facturación electrónica / punto de venta y telemedicina con video. El </w:t>
@@ -2803,10 +2913,7 @@
         <w:t>deseables</w:t>
       </w:r>
       <w:r>
-        <w:t xml:space="preserve"> </w:t>
-      </w:r>
-      <w:r>
-        <w:t>(recetas en PDF, motor de salud preventiva por protocolos y PWA instalable) se contemplan como evolución (§2.6).</w:t>
+        <w:t xml:space="preserve"> (recetas en PDF, motor de salud preventiva por protocolos y PWA instalable) se contemplan como evolución (§2.6).</w:t>
       </w:r>
     </w:p>
     <w:p>
@@ -2814,10 +2921,9 @@
         <w:pStyle w:val="Ttulo2"/>
       </w:pPr>
       <w:bookmarkStart w:id="6" w:name="_3c32702167a50f9f1e47f548e3fd9a17f4efae6"/>
-      <w:bookmarkStart w:id="7" w:name="_Toc242135399"/>
+      <w:bookmarkStart w:id="7" w:name="_Toc242196657"/>
       <w:bookmarkEnd w:id="4"/>
       <w:r>
-        <w:lastRenderedPageBreak/>
         <w:t>1.3 Personal involucrado</w:t>
       </w:r>
       <w:bookmarkEnd w:id="7"/>
@@ -3065,7 +3171,7 @@
         <w:pStyle w:val="Ttulo2"/>
       </w:pPr>
       <w:bookmarkStart w:id="8" w:name="_202ce33122313366988e60811cd45f2e3fac5ed"/>
-      <w:bookmarkStart w:id="9" w:name="_Toc242135400"/>
+      <w:bookmarkStart w:id="9" w:name="_Toc242196658"/>
       <w:bookmarkEnd w:id="6"/>
       <w:r>
         <w:lastRenderedPageBreak/>
@@ -3741,7 +3847,7 @@
         <w:pStyle w:val="Ttulo2"/>
       </w:pPr>
       <w:bookmarkStart w:id="10" w:name="_f02bdecee650c876b7f695bd90111aab7702c00"/>
-      <w:bookmarkStart w:id="11" w:name="_Toc242135401"/>
+      <w:bookmarkStart w:id="11" w:name="_Toc242196659"/>
       <w:bookmarkEnd w:id="8"/>
       <w:r>
         <w:t>1.5 Referencias normativas</w:t>
@@ -3764,7 +3870,10 @@
         <w:t>ISO/IEC/IEEE 29148:2018</w:t>
       </w:r>
       <w:r>
-        <w:t xml:space="preserve"> — Systems and software engineering — Requirements engineering (estándar principal de este documento).</w:t>
+        <w:t xml:space="preserve"> </w:t>
+      </w:r>
+      <w:r>
+        <w:t>— Systems and software engineering — Requirements engineering (estándar principal de este documento).</w:t>
       </w:r>
     </w:p>
     <w:p>
@@ -3821,7 +3930,7 @@
         <w:pStyle w:val="Ttulo1"/>
       </w:pPr>
       <w:bookmarkStart w:id="12" w:name="_272b38cfc2ff6ab53ecdbfe24b7ba0e5f181bd6"/>
-      <w:bookmarkStart w:id="13" w:name="_Toc242135402"/>
+      <w:bookmarkStart w:id="13" w:name="_Toc242196660"/>
       <w:bookmarkEnd w:id="0"/>
       <w:bookmarkEnd w:id="10"/>
       <w:r>
@@ -3835,7 +3944,7 @@
         <w:pStyle w:val="Ttulo2"/>
       </w:pPr>
       <w:bookmarkStart w:id="14" w:name="_530c4174996bbc2c9398cdddea6478430b49400"/>
-      <w:bookmarkStart w:id="15" w:name="_Toc242135403"/>
+      <w:bookmarkStart w:id="15" w:name="_Toc242196661"/>
       <w:r>
         <w:t>2.1 Perspectiva del producto</w:t>
       </w:r>
@@ -3856,10 +3965,7 @@
         <w:t>autónoma de tres capas</w:t>
       </w:r>
       <w:r>
-        <w:t xml:space="preserve"> </w:t>
-      </w:r>
-      <w:r>
-        <w:t xml:space="preserve">(presentación, lógica y datos) construida con tecnologías nativas (PHP 8.2 con arquitectura MVC propia y MySQL 8), desplegada en infraestructura propia. A diferencia de las versiones 1.x —de instalación para una sola clínica—, la v2.0 opera como </w:t>
+        <w:t xml:space="preserve"> (presentación, lógica y datos) construida con tecnologías nativas (PHP 8.2 con arquitectura MVC propia y MySQL 8), desplegada en infraestructura propia. A diferencia de las versiones 1.x —de instalación para una sola clínica—, la v2.0 opera como </w:t>
       </w:r>
       <w:r>
         <w:rPr>
@@ -3903,10 +4009,7 @@
         <w:t>Diagrama de contexto.</w:t>
       </w:r>
       <w:r>
-        <w:t xml:space="preserve"> </w:t>
-      </w:r>
-      <w:r>
-        <w:t>El sistema y sus actores y servicios externos:</w:t>
+        <w:t xml:space="preserve"> El sistema y sus actores y servicios externos:</w:t>
       </w:r>
     </w:p>
     <w:p>
@@ -3934,7 +4037,7 @@
           <w:noProof/>
         </w:rPr>
         <w:drawing>
-          <wp:inline distT="0" distB="0" distL="0" distR="0" wp14:anchorId="729C49A3" wp14:editId="729C49A4">
+          <wp:inline distT="0" distB="0" distL="0" distR="0" wp14:anchorId="2A2F3B37" wp14:editId="2A2F3B38">
             <wp:extent cx="5939999" cy="2903365"/>
             <wp:effectExtent l="0" t="0" r="0" b="0"/>
             <wp:docPr id="20" name="Picture"/>
@@ -3943,7 +4046,7 @@
               <a:graphicData uri="http://schemas.openxmlformats.org/drawingml/2006/picture">
                 <pic:pic xmlns:pic="http://schemas.openxmlformats.org/drawingml/2006/picture">
                   <pic:nvPicPr>
-                    <pic:cNvPr id="21" name="Picture" descr="C:\Users\Usuario\AppData\Local\Temp\zooki-docs-2DQu3b\ers-figura-1.png"/>
+                    <pic:cNvPr id="21" name="Picture" descr="C:\Users\Usuario\AppData\Local\Temp\zooki-docs-oeMX1P\ers-figura-1.png"/>
                     <pic:cNvPicPr>
                       <a:picLocks noChangeAspect="1" noChangeArrowheads="1"/>
                     </pic:cNvPicPr>
@@ -4017,7 +4120,7 @@
           <w:noProof/>
         </w:rPr>
         <w:drawing>
-          <wp:inline distT="0" distB="0" distL="0" distR="0" wp14:anchorId="729C49A5" wp14:editId="729C49A6">
+          <wp:inline distT="0" distB="0" distL="0" distR="0" wp14:anchorId="2A2F3B39" wp14:editId="2A2F3B3A">
             <wp:extent cx="5939999" cy="3650624"/>
             <wp:effectExtent l="0" t="0" r="0" b="0"/>
             <wp:docPr id="23" name="Picture"/>
@@ -4026,7 +4129,7 @@
               <a:graphicData uri="http://schemas.openxmlformats.org/drawingml/2006/picture">
                 <pic:pic xmlns:pic="http://schemas.openxmlformats.org/drawingml/2006/picture">
                   <pic:nvPicPr>
-                    <pic:cNvPr id="24" name="Picture" descr="C:\Users\Usuario\AppData\Local\Temp\zooki-docs-2DQu3b\ers-figura-2.png"/>
+                    <pic:cNvPr id="24" name="Picture" descr="C:\Users\Usuario\AppData\Local\Temp\zooki-docs-oeMX1P\ers-figura-2.png"/>
                     <pic:cNvPicPr>
                       <a:picLocks noChangeAspect="1" noChangeArrowheads="1"/>
                     </pic:cNvPicPr>
@@ -4064,7 +4167,7 @@
         <w:pStyle w:val="Ttulo2"/>
       </w:pPr>
       <w:bookmarkStart w:id="16" w:name="_8fb72911118d5239a4ddf916fa7f6994c841597"/>
-      <w:bookmarkStart w:id="17" w:name="_Toc242135404"/>
+      <w:bookmarkStart w:id="17" w:name="_Toc242196662"/>
       <w:bookmarkEnd w:id="14"/>
       <w:r>
         <w:t>2.2 Funciones principales</w:t>
@@ -4133,7 +4236,10 @@
         <w:t>Historia clínica + ★ soporte a la decisión clínica (Grafo I):</w:t>
       </w:r>
       <w:r>
-        <w:t xml:space="preserve"> consultas, tratamientos y archivos; sugerencia de diagnósticos y alertas de toxicidad/interacción.</w:t>
+        <w:t xml:space="preserve"> </w:t>
+      </w:r>
+      <w:r>
+        <w:t>consultas, tratamientos y archivos; sugerencia de diagnósticos y alertas de toxicidad/interacción.</w:t>
       </w:r>
     </w:p>
     <w:p>
@@ -4190,10 +4296,7 @@
         <w:t>★ Portal del propietario:</w:t>
       </w:r>
       <w:r>
-        <w:t xml:space="preserve"> </w:t>
-      </w:r>
-      <w:r>
-        <w:t xml:space="preserve">auto-registro, auto-agendamiento y cancelación, notificaciones y </w:t>
+        <w:t xml:space="preserve"> auto-registro, auto-agendamiento y cancelación, notificaciones y </w:t>
       </w:r>
       <w:r>
         <w:rPr>
@@ -4298,7 +4401,7 @@
         <w:pStyle w:val="Ttulo2"/>
       </w:pPr>
       <w:bookmarkStart w:id="18" w:name="_a6c21597a6595bc146d22c17741d693a713bfb2"/>
-      <w:bookmarkStart w:id="19" w:name="_Toc242135405"/>
+      <w:bookmarkStart w:id="19" w:name="_Toc242196663"/>
       <w:bookmarkEnd w:id="16"/>
       <w:r>
         <w:t>2.3 Características de los usuarios (clases de usuario)</w:t>
@@ -4772,7 +4875,7 @@
         <w:pStyle w:val="Ttulo2"/>
       </w:pPr>
       <w:bookmarkStart w:id="20" w:name="_11fda6f447d6f2a37cc502977dae18f9e3ad8b3"/>
-      <w:bookmarkStart w:id="21" w:name="_Toc242135406"/>
+      <w:bookmarkStart w:id="21" w:name="_Toc242196664"/>
       <w:bookmarkEnd w:id="18"/>
       <w:r>
         <w:t>2.4 Restricciones</w:t>
@@ -4924,7 +5027,7 @@
         <w:pStyle w:val="Ttulo2"/>
       </w:pPr>
       <w:bookmarkStart w:id="22" w:name="_26d80a1bad7ec0339e80ed2e634398510a6938c"/>
-      <w:bookmarkStart w:id="23" w:name="_Toc242135407"/>
+      <w:bookmarkStart w:id="23" w:name="_Toc242196665"/>
       <w:bookmarkEnd w:id="20"/>
       <w:r>
         <w:t>2.5 Suposiciones y dependencias</w:t>
@@ -5008,7 +5111,7 @@
         <w:pStyle w:val="Ttulo2"/>
       </w:pPr>
       <w:bookmarkStart w:id="24" w:name="_fdd8f268017d5796a6252a81775e10e2c2202be"/>
-      <w:bookmarkStart w:id="25" w:name="_Toc242135408"/>
+      <w:bookmarkStart w:id="25" w:name="_Toc242196666"/>
       <w:bookmarkEnd w:id="22"/>
       <w:r>
         <w:t>2.6 Requisitos futuros y evolución previsible</w:t>
@@ -5526,7 +5629,7 @@
         <w:pStyle w:val="Ttulo1"/>
       </w:pPr>
       <w:bookmarkStart w:id="26" w:name="_e16cbc17efb9516401e41690962f9175e4cde1d"/>
-      <w:bookmarkStart w:id="27" w:name="_Toc242135409"/>
+      <w:bookmarkStart w:id="27" w:name="_Toc242196667"/>
       <w:bookmarkEnd w:id="12"/>
       <w:bookmarkEnd w:id="24"/>
       <w:r>
@@ -5587,7 +5690,7 @@
         <w:pStyle w:val="Ttulo2"/>
       </w:pPr>
       <w:bookmarkStart w:id="28" w:name="_b1c2f4b7e2eba5d64c8f3d3850d1e5e5653bfa3"/>
-      <w:bookmarkStart w:id="29" w:name="_Toc242135410"/>
+      <w:bookmarkStart w:id="29" w:name="_Toc242196668"/>
       <w:r>
         <w:t>3.1 Interfaces externas</w:t>
       </w:r>
@@ -6414,7 +6517,7 @@
         <w:pStyle w:val="Ttulo2"/>
       </w:pPr>
       <w:bookmarkStart w:id="33" w:name="_965d05d004114bc2ee0e90669218ec0da0e554f"/>
-      <w:bookmarkStart w:id="34" w:name="_Toc242135411"/>
+      <w:bookmarkStart w:id="34" w:name="_Toc242196669"/>
       <w:bookmarkEnd w:id="28"/>
       <w:bookmarkEnd w:id="32"/>
       <w:r>
@@ -10164,7 +10267,7 @@
               <w:t>calculado por el Grafo I</w:t>
             </w:r>
             <w:r>
-              <w:t xml:space="preserve"> (RF-2.12): rojo deriva a urgencia, naranja toma sobrecupo hasta el tope del bloque (con desempate por severidad y luego por llegada), amarillo el primer espacio y verde se agenda por elección.</w:t>
+              <w:t xml:space="preserve"> (RF-2.12): rojo deriva a urgencia, naranja toma sobrecupo hasta el tope del bloque (entre naranjas, orden de llegada modificable por veterinario con motivo y auditoría), amarillo el primer espacio y verde se agenda por elección.</w:t>
             </w:r>
           </w:p>
         </w:tc>
@@ -10192,7 +10295,7 @@
               <w:keepNext/>
             </w:pPr>
             <w:r>
-              <w:t>El nivel lo fija el Grafo I; cada nivel se ubica según su regla (RN-411, RN-422).</w:t>
+              <w:t>El nivel lo fija el Grafo I; cada nivel se ubica según su regla y el cambio manual de orden cumple RN-422.</w:t>
             </w:r>
           </w:p>
         </w:tc>
@@ -10366,7 +10469,10 @@
               <w:keepNext/>
             </w:pPr>
             <w:r>
-              <w:t>Atender una urgencia (triage rojo o llegada directa) fuera de la agenda en línea: asignar un veterinario de inmediato —interrumpiendo una cita cuyo tipo sea pausable si no hay ninguno libre, que se retoma al terminar la urgencia— y, si todos están en atención no pausable, dejarla en espera por prioridad.</w:t>
+              <w:t>Atender una urgencia (triage rojo o llegada directa) fuera de la agenda en línea: asignar un veterinario de inmediato —interrumpiendo una cita cuyo tipo sea pausable si no hay ninguno libre, que se retoma al terminar la urgencia— y, si todos están en atención no pausable, dejarla en espera por prioridad. El rojo del portal autenticado usa la identidad de la sesión y su mascota seleccionada. Solo en un ingreso presencial sin ficha verificable a tiempo se registra una ficha provisional, sin crear cuenta ni at</w:t>
+            </w:r>
+            <w:r>
+              <w:t>ribuir propiedad al acompañante; después se completa o consolida.</w:t>
             </w:r>
           </w:p>
         </w:tc>
@@ -10394,7 +10500,25 @@
               <w:keepNext/>
             </w:pPr>
             <w:r>
-              <w:t>Un caso rojo no se agenda en línea: se deriva a atención de urgencia y la toma un veterinario según disponibilidad.</w:t>
+              <w:t xml:space="preserve">El rojo del portal conserva </w:t>
+            </w:r>
+            <w:r>
+              <w:rPr>
+                <w:rStyle w:val="VerbatimChar"/>
+              </w:rPr>
+              <w:t>id_usuario</w:t>
+            </w:r>
+            <w:r>
+              <w:t xml:space="preserve"> e </w:t>
+            </w:r>
+            <w:r>
+              <w:rPr>
+                <w:rStyle w:val="VerbatimChar"/>
+              </w:rPr>
+              <w:t>id_mascota</w:t>
+            </w:r>
+            <w:r>
+              <w:t xml:space="preserve"> sin nueva verificación. El ingreso presencial no se bloquea por identidad o consentimiento pendiente: usa la ficha existente verificada o una provisional con carnet inactivo, sin perder actos clínicos al conciliarla.</w:t>
             </w:r>
           </w:p>
         </w:tc>
@@ -12910,7 +13034,7 @@
         <w:pStyle w:val="Ttulo2"/>
       </w:pPr>
       <w:bookmarkStart w:id="46" w:name="_91faa842a79df0e34112c2e349ad0681a2800df"/>
-      <w:bookmarkStart w:id="47" w:name="_Toc242135412"/>
+      <w:bookmarkStart w:id="47" w:name="_Toc242196670"/>
       <w:bookmarkEnd w:id="33"/>
       <w:bookmarkEnd w:id="45"/>
       <w:r>
@@ -13852,7 +13976,7 @@
               <w:t xml:space="preserve"> </w:t>
             </w:r>
             <w:r>
-              <w:t>ninguna operación de negocio devuelve ni modifica datos de una clínica distinta a la del usuario, salvo las excepciones explícitas de la mascota global: toda clínica vinculada ve sus datos de seguridad (alergias, alertas, vacunas y desparasitaciones) y las consultas de otra clínica solo con autorización del propietario (RF-2.6).</w:t>
+              <w:t>ninguna operación devuelve ni modifica registros de otra clínica fuera de las excepciones explícitas. Son globales usuarios, mascotas, catálogos taxonómicos y Grafo I. Toda clínica vinculada ve alergias, alertas, vacunas y desparasitaciones de la mascota; las consultas y tratamientos de otra clínica se muestran solo con autorización del propietario (RF-2.6). El motor de prescripción puede leer internamente medicación protegida solo para emitir la alerta genérica de RN-211, sin devolver el tratamiento.</w:t>
             </w:r>
           </w:p>
         </w:tc>
@@ -13880,7 +14004,7 @@
               <w:keepNext/>
             </w:pPr>
             <w:r>
-              <w:t>Un usuario de la clínica A no obtiene registros de la clínica B fuera de esas excepciones y nunca modifica registros de otra clínica.</w:t>
+              <w:t>Un usuario de la clínica A no obtiene registros protegidos de B por interfaz ni petición directa, ni los modifica; una alerta de interacción detectada en B no revela el fármaco, la dosis ni el contenido del tratamiento.</w:t>
             </w:r>
           </w:p>
         </w:tc>
@@ -14033,6 +14157,7 @@
               <w:keepNext/>
             </w:pPr>
             <w:r>
+              <w:lastRenderedPageBreak/>
               <w:t>RNF</w:t>
             </w:r>
             <w:r>
@@ -14099,7 +14224,6 @@
               <w:pStyle w:val="Celda"/>
             </w:pPr>
             <w:r>
-              <w:lastRenderedPageBreak/>
               <w:t>RNF</w:t>
             </w:r>
             <w:r>
@@ -14919,7 +15043,7 @@
         <w:pStyle w:val="Ttulo1"/>
       </w:pPr>
       <w:bookmarkStart w:id="53" w:name="_8872f59400eca311bb7b0740442423f0a836d6f"/>
-      <w:bookmarkStart w:id="54" w:name="_Toc242135413"/>
+      <w:bookmarkStart w:id="54" w:name="_Toc242196671"/>
       <w:bookmarkEnd w:id="26"/>
       <w:bookmarkEnd w:id="46"/>
       <w:bookmarkEnd w:id="52"/>
@@ -15246,7 +15370,7 @@
         <w:pStyle w:val="Ttulo1"/>
       </w:pPr>
       <w:bookmarkStart w:id="55" w:name="_11f3dc26fe4f135be80b976bfe46d60e018a5ba"/>
-      <w:bookmarkStart w:id="56" w:name="_Toc242135414"/>
+      <w:bookmarkStart w:id="56" w:name="_Toc242196672"/>
       <w:bookmarkEnd w:id="53"/>
       <w:r>
         <w:lastRenderedPageBreak/>
@@ -15259,7 +15383,7 @@
         <w:pStyle w:val="Ttulo2"/>
       </w:pPr>
       <w:bookmarkStart w:id="57" w:name="_f7580e8bc275eea58d00a0ff871ef60674ed780"/>
-      <w:bookmarkStart w:id="58" w:name="_Toc242135415"/>
+      <w:bookmarkStart w:id="58" w:name="_Toc242196673"/>
       <w:r>
         <w:t>5.1 Casos de uso</w:t>
       </w:r>
@@ -17053,7 +17177,7 @@
         <w:pStyle w:val="Ttulo2"/>
       </w:pPr>
       <w:bookmarkStart w:id="59" w:name="_5580fd549b2ecd3c29ad00fe23a279932ebe402"/>
-      <w:bookmarkStart w:id="60" w:name="_Toc242135416"/>
+      <w:bookmarkStart w:id="60" w:name="_Toc242196674"/>
       <w:bookmarkEnd w:id="57"/>
       <w:r>
         <w:t>5.2 Modelo de datos y diccionario de datos (v2.0)</w:t>
@@ -17065,7 +17189,7 @@
         <w:pStyle w:val="FirstParagraph"/>
       </w:pPr>
       <w:r>
-        <w:t xml:space="preserve">El modelo v1.11.0 (27 tablas) evoluciona con: (a) la columna </w:t>
+        <w:t xml:space="preserve">El modelo de la línea base v1.12.0 evoluciona con: (a) la columna </w:t>
       </w:r>
       <w:r>
         <w:rPr>
@@ -17077,7 +17201,7 @@
         <w:t xml:space="preserve"> </w:t>
       </w:r>
       <w:r>
-        <w:t>en las tablas de negocio para el aislamiento por inquilino, y (b) nuevas entidades para la plataforma, los grafos, la reputación y las comunicaciones. El MER completo en Mermaid se especifica en el documento Modelo Entidad-Relación (MER).</w:t>
+        <w:t>en los registros que pertenecen a una clínica, con excepciones globales explícitas para personas, mascotas, catálogos y Grafo I, y (b) nuevas entidades para la plataforma, los grafos, la reputación y las comunicaciones. El MER completo en Mermaid se especifica en el documento Modelo Entidad-Relación (MER).</w:t>
       </w:r>
     </w:p>
     <w:p>
@@ -17705,7 +17829,7 @@
               <w:pStyle w:val="Celda"/>
             </w:pPr>
             <w:r>
-              <w:t>Ausencias por clínica y fecha, y su cobertura. (id PK, id_veterinario FK, id_clinica FK, fecha_inicio, fecha_fin, id_cobertura FK, motivo)</w:t>
+              <w:t>Ausencias por clínica y rango de fecha/hora, y su cobertura. (id PK, id_veterinario FK, id_clinica FK, fecha_hora_inicio, fecha_hora_fin, id_cobertura FK, motivo)</w:t>
             </w:r>
           </w:p>
         </w:tc>
@@ -17768,6 +17892,37 @@
             </w:pPr>
             <w:r>
               <w:t>Alergias, condiciones crónicas y medicación continua de la mascota, visibles para toda clínica vinculada y en el carnet. (id_alerta PK, id_mascota FK, id_clinica FK, id_veterinario FK, tipo, id_nodo FK, descripcion, activa, fecha)</w:t>
+            </w:r>
+          </w:p>
+        </w:tc>
+      </w:tr>
+      <w:tr>
+        <w:trPr>
+          <w:cantSplit/>
+        </w:trPr>
+        <w:tc>
+          <w:tcPr>
+            <w:tcW w:w="2099" w:type="pct"/>
+          </w:tcPr>
+          <w:p>
+            <w:pPr>
+              <w:pStyle w:val="Celda"/>
+            </w:pPr>
+            <w:r>
+              <w:t>ingresos_emergencia</w:t>
+            </w:r>
+          </w:p>
+        </w:tc>
+        <w:tc>
+          <w:tcPr>
+            <w:tcW w:w="2901" w:type="pct"/>
+          </w:tcPr>
+          <w:p>
+            <w:pPr>
+              <w:pStyle w:val="Celda"/>
+            </w:pPr>
+            <w:r>
+              <w:t>Ingreso de una mascota provisional sin titular verificado. (id_ingreso PK, id_clinica FK, id_mascota_provisional FK, id_mascota_final FK nullable, datos disponibles del acompañante, estado, fecha_ingreso)</w:t>
             </w:r>
           </w:p>
         </w:tc>
@@ -17919,7 +18074,7 @@
         <w:t>horarios_clinica</w:t>
       </w:r>
       <w:r>
-        <w:t xml:space="preserve">, catálogos y tablas de auditoría; </w:t>
+        <w:t xml:space="preserve">, catálogos propios de la clínica y tablas de auditoría; </w:t>
       </w:r>
       <w:r>
         <w:rPr>
@@ -17955,7 +18110,7 @@
         <w:t>citas</w:t>
       </w:r>
       <w:r>
-        <w:t xml:space="preserve"> suma </w:t>
+        <w:t xml:space="preserve"> guarda la duración y el margen aplicados al reservar, </w:t>
       </w:r>
       <w:r>
         <w:rPr>
@@ -18081,10 +18236,7 @@
         <w:t>id_clinica</w:t>
       </w:r>
       <w:r>
-        <w:t xml:space="preserve"> </w:t>
-      </w:r>
-      <w:r>
-        <w:t xml:space="preserve">NULL en los avisos de la plataforma; </w:t>
+        <w:t xml:space="preserve"> NULL en los avisos de la plataforma; </w:t>
       </w:r>
       <w:r>
         <w:rPr>
@@ -18102,7 +18254,10 @@
         <w:t>verificaciones_email</w:t>
       </w:r>
       <w:r>
-        <w:t xml:space="preserve"> se ligan a </w:t>
+        <w:t xml:space="preserve"> se ligan a</w:t>
+      </w:r>
+      <w:r>
+        <w:t xml:space="preserve"> </w:t>
       </w:r>
       <w:r>
         <w:rPr>
@@ -18147,7 +18302,11 @@
         <w:t>citas.prioridad</w:t>
       </w:r>
       <w:r>
-        <w:t xml:space="preserve"> pasa a ser el nivel de triage de 4 niveles; </w:t>
+        <w:t xml:space="preserve"> </w:t>
+      </w:r>
+      <w:r>
+        <w:lastRenderedPageBreak/>
+        <w:t xml:space="preserve">pasa a ser el nivel de triage de 4 niveles; </w:t>
       </w:r>
       <w:r>
         <w:rPr>
@@ -18216,20 +18375,10 @@
         <w:rPr>
           <w:rStyle w:val="VerbatimChar"/>
         </w:rPr>
-        <w:lastRenderedPageBreak/>
         <w:t>usuarios</w:t>
       </w:r>
       <w:r>
-        <w:t xml:space="preserve">; </w:t>
-      </w:r>
-      <w:r>
-        <w:rPr>
-          <w:rStyle w:val="VerbatimChar"/>
-        </w:rPr>
-        <w:t>mascotas</w:t>
-      </w:r>
-      <w:r>
-        <w:t xml:space="preserve"> guarda la clínica que la registró; y se </w:t>
+        <w:t xml:space="preserve">; y se </w:t>
       </w:r>
       <w:r>
         <w:rPr>
@@ -18294,7 +18443,7 @@
         <w:t>id_clinica</w:t>
       </w:r>
       <w:r>
-        <w:t xml:space="preserve">: es global del propietario, se vincula a cada clínica por </w:t>
+        <w:t xml:space="preserve">: es global, se vincula a cada clínica por </w:t>
       </w:r>
       <w:r>
         <w:rPr>
@@ -18303,10 +18452,7 @@
         <w:t>mascota_clinica</w:t>
       </w:r>
       <w:r>
-        <w:t xml:space="preserve"> </w:t>
-      </w:r>
-      <w:r>
-        <w:t xml:space="preserve">y suma </w:t>
+        <w:t xml:space="preserve"> y suma </w:t>
       </w:r>
       <w:r>
         <w:rPr>
@@ -18324,7 +18470,7 @@
         <w:t>carnet_activo</w:t>
       </w:r>
       <w:r>
-        <w:t xml:space="preserve"> y </w:t>
+        <w:t xml:space="preserve">, </w:t>
       </w:r>
       <w:r>
         <w:rPr>
@@ -18333,7 +18479,16 @@
         <w:t>esterilizado</w:t>
       </w:r>
       <w:r>
-        <w:t xml:space="preserve">; </w:t>
+        <w:t xml:space="preserve"> y </w:t>
+      </w:r>
+      <w:r>
+        <w:rPr>
+          <w:rStyle w:val="VerbatimChar"/>
+        </w:rPr>
+        <w:t>ficha_por_completar</w:t>
+      </w:r>
+      <w:r>
+        <w:t xml:space="preserve">; solo una ficha provisional de urgencia puede carecer temporalmente de propietario y datos completos, y su carnet permanece inactivo. </w:t>
       </w:r>
       <w:r>
         <w:rPr>
@@ -18359,7 +18514,7 @@
         <w:pStyle w:val="Ttulo2"/>
       </w:pPr>
       <w:bookmarkStart w:id="61" w:name="_fbf38eebe414c78cb475c989b20e7851be1b9a4"/>
-      <w:bookmarkStart w:id="62" w:name="_Toc242135417"/>
+      <w:bookmarkStart w:id="62" w:name="_Toc242196675"/>
       <w:bookmarkEnd w:id="59"/>
       <w:r>
         <w:t>5.3 Matriz de trazabilidad (requisito → módulo → verificación)</w:t>
@@ -19347,7 +19502,7 @@
         <w:pStyle w:val="Ttulo2"/>
       </w:pPr>
       <w:bookmarkStart w:id="63" w:name="_af48f3c1dcd6ad7c9bf690234a607d52526f60f"/>
-      <w:bookmarkStart w:id="64" w:name="_Toc242135418"/>
+      <w:bookmarkStart w:id="64" w:name="_Toc242196676"/>
       <w:bookmarkEnd w:id="61"/>
       <w:r>
         <w:t>5.4 Criterios de aceptación global</w:t>
@@ -19359,7 +19514,17 @@
         <w:pStyle w:val="FirstParagraph"/>
       </w:pPr>
       <w:r>
-        <w:t xml:space="preserve">El sistema v2.0 se considera conforme cuando: (a) el 100% de los RF de prioridad Alta están implementados y superan su verificación; (b) el 80% o más de los RF de prioridad Media están implementados; (c) el </w:t>
+        <w:t xml:space="preserve">Cada entrega se evalúa solo contra las historias que el plan de entregas le asigna y los RF/RE que esas historias satisfacen. La </w:t>
+      </w:r>
+      <w:r>
+        <w:rPr>
+          <w:b/>
+          <w:bCs/>
+        </w:rPr>
+        <w:t>v2.0</w:t>
+      </w:r>
+      <w:r>
+        <w:t xml:space="preserve"> se considera conforme cuando: (a) el 100% de los RF de prioridad Alta asignados a sus historias están implementados y superan su verificación; (b) el 80% o más de los RF de prioridad Media asignados a sus historias están implementados; (c) el </w:t>
       </w:r>
       <w:r>
         <w:rPr>
@@ -19369,7 +19534,24 @@
         <w:t>aislamiento multi-inquilino (RNF-11)</w:t>
       </w:r>
       <w:r>
-        <w:t xml:space="preserve"> se verifica sin fugas entre clínicas; (d) los dos grafos (I y II) se demuestran funcionando en el flujo de consulta y de agenda; (e) no existen defectos críticos ni mayores sin cerrar; y (f) la documentación técnica (README, ERS, MER y manual) está en el repositorio.</w:t>
+        <w:t xml:space="preserve"> </w:t>
+      </w:r>
+      <w:r>
+        <w:t xml:space="preserve">se verifica sin fugas entre clínicas; (d) los dos grafos (I y II) se demuestran </w:t>
+      </w:r>
+      <w:r>
+        <w:lastRenderedPageBreak/>
+        <w:t xml:space="preserve">funcionando en el flujo de consulta y de agenda; (e) no existen defectos críticos ni mayores sin cerrar; y (f) la documentación técnica (README, ERS, MER y manual) está en el repositorio. La </w:t>
+      </w:r>
+      <w:r>
+        <w:rPr>
+          <w:b/>
+          <w:bCs/>
+        </w:rPr>
+        <w:t>v2.1</w:t>
+      </w:r>
+      <w:r>
+        <w:t xml:space="preserve"> se considera conforme cuando también se implementan y verifican las historias diferidas; los RF de prioridad Alta vinculados a ellas no son condición para declarar conforme la v2.0.</w:t>
       </w:r>
     </w:p>
     <w:p>
@@ -19377,7 +19559,7 @@
         <w:pStyle w:val="Ttulo2"/>
       </w:pPr>
       <w:bookmarkStart w:id="65" w:name="_0d285be43461a565caa5d7afb2af5b21132b4e6"/>
-      <w:bookmarkStart w:id="66" w:name="_Toc242135419"/>
+      <w:bookmarkStart w:id="66" w:name="_Toc242196677"/>
       <w:bookmarkEnd w:id="63"/>
       <w:r>
         <w:t>5.5 Equivalencia de identificadores (Revisión 3.1)</w:t>
@@ -19397,7 +19579,6 @@
         <w:pStyle w:val="Rotulo"/>
       </w:pPr>
       <w:r>
-        <w:lastRenderedPageBreak/>
         <w:t>Tabla 26</w:t>
       </w:r>
     </w:p>
@@ -20877,6 +21058,7 @@
               <w:pStyle w:val="Celda"/>
             </w:pPr>
             <w:r>
+              <w:lastRenderedPageBreak/>
               <w:t>RF</w:t>
             </w:r>
             <w:r>
@@ -21282,7 +21464,6 @@
               <w:pStyle w:val="Celda"/>
             </w:pPr>
             <w:r>
-              <w:lastRenderedPageBreak/>
               <w:t>RF</w:t>
             </w:r>
             <w:r>
@@ -22648,6 +22829,7 @@
         <w:pStyle w:val="Rotulo"/>
       </w:pPr>
       <w:r>
+        <w:lastRenderedPageBreak/>
         <w:t>Tabla 27</w:t>
       </w:r>
     </w:p>
@@ -22973,7 +23155,6 @@
               <w:pStyle w:val="Celda"/>
             </w:pPr>
             <w:r>
-              <w:lastRenderedPageBreak/>
               <w:t>RNF</w:t>
             </w:r>
             <w:r>
@@ -23573,7 +23754,7 @@
           <w:i/>
           <w:iCs/>
         </w:rPr>
-        <w:t>Fin del ERS v3.8. Los modelos referenciados (MER v2, procesos de negocio, flujos del sistema y modelo de los grafos) están en MER y Modelos y diagramas.</w:t>
+        <w:t>Fin del ERS, revisión 3.2. Los modelos referenciados (MER v2, procesos de negocio, flujos del sistema y modelo de los grafos) están en MER y Modelos y diagramas.</w:t>
       </w:r>
       <w:bookmarkEnd w:id="55"/>
       <w:bookmarkEnd w:id="65"/>
@@ -23711,7 +23892,7 @@
               <w:noProof/>
             </w:rPr>
             <w:drawing>
-              <wp:inline distT="0" distB="0" distL="0" distR="0" wp14:anchorId="729C49B1" wp14:editId="729C49B2">
+              <wp:inline distT="0" distB="0" distL="0" distR="0" wp14:anchorId="2A2F3B45" wp14:editId="2A2F3B46">
                 <wp:extent cx="324000" cy="324000"/>
                 <wp:effectExtent l="0" t="0" r="0" b="0"/>
                 <wp:docPr id="9001" name="Logo Zooki"/>
@@ -23805,7 +23986,7 @@
               <w:sz w:val="17"/>
               <w:szCs w:val="17"/>
             </w:rPr>
-            <w:t>Rev. 3.1</w:t>
+            <w:t>Rev. 3.2</w:t>
           </w:r>
         </w:p>
         <w:p>
@@ -23878,7 +24059,7 @@
   <w:abstractNum w:abstractNumId="0" w15:restartNumberingAfterBreak="0">
     <w:nsid w:val="0000A990"/>
     <w:multiLevelType w:val="multilevel"/>
-    <w:tmpl w:val="DFA0C250"/>
+    <w:tmpl w:val="E01ADCBE"/>
     <w:lvl w:ilvl="0">
       <w:numFmt w:val="bullet"/>
       <w:lvlText w:val=" "/>
@@ -23955,7 +24136,7 @@
   <w:abstractNum w:abstractNumId="1" w15:restartNumberingAfterBreak="0">
     <w:nsid w:val="0000A991"/>
     <w:multiLevelType w:val="multilevel"/>
-    <w:tmpl w:val="4614F676"/>
+    <w:tmpl w:val="7E52AB84"/>
     <w:lvl w:ilvl="0">
       <w:numFmt w:val="bullet"/>
       <w:lvlText w:val=""/>
@@ -24056,22 +24237,22 @@
       </w:rPr>
     </w:lvl>
   </w:abstractNum>
-  <w:num w:numId="1" w16cid:durableId="2027560954">
+  <w:num w:numId="1" w16cid:durableId="700781850">
     <w:abstractNumId w:val="0"/>
   </w:num>
-  <w:num w:numId="2" w16cid:durableId="808325400">
+  <w:num w:numId="2" w16cid:durableId="737750427">
     <w:abstractNumId w:val="1"/>
   </w:num>
-  <w:num w:numId="3" w16cid:durableId="287206305">
+  <w:num w:numId="3" w16cid:durableId="1171408192">
     <w:abstractNumId w:val="1"/>
   </w:num>
-  <w:num w:numId="4" w16cid:durableId="1461724822">
+  <w:num w:numId="4" w16cid:durableId="219943046">
     <w:abstractNumId w:val="1"/>
   </w:num>
-  <w:num w:numId="5" w16cid:durableId="1524703695">
+  <w:num w:numId="5" w16cid:durableId="2101632567">
     <w:abstractNumId w:val="1"/>
   </w:num>
-  <w:num w:numId="6" w16cid:durableId="385373129">
+  <w:num w:numId="6" w16cid:durableId="1640303430">
     <w:abstractNumId w:val="1"/>
   </w:num>
 </w:numbering>

</xml_diff>

<commit_message>
feat(M5): cierre del modulo portal multi-clinica y version 2.0.0-alpha.3 (RE-T.19.1, HU-5.9)
</commit_message>
<xml_diff>
--- a/public/docs/descargas/ers.docx
+++ b/public/docs/descargas/ers.docx
@@ -29,7 +29,7 @@
         <w:pStyle w:val="PortadaRevision"/>
       </w:pPr>
       <w:r>
-        <w:t>Revisión 3.3 · ISO/IEC/IEEE 29148:2018</w:t>
+        <w:t>Revisión 3.4 · ISO/IEC/IEEE 29148:2018</w:t>
       </w:r>
     </w:p>
     <w:p>
@@ -93,7 +93,7 @@
           <w:noProof/>
         </w:rPr>
         <w:drawing>
-          <wp:inline distT="0" distB="0" distL="0" distR="0" wp14:anchorId="2FD7A879" wp14:editId="2FD7A87A">
+          <wp:inline distT="0" distB="0" distL="0" distR="0" wp14:anchorId="10970B07" wp14:editId="10970B08">
             <wp:extent cx="395999" cy="405503"/>
             <wp:effectExtent l="0" t="0" r="0" b="0"/>
             <wp:docPr id="10" name="Picture"/>
@@ -803,7 +803,7 @@
       <w:r>
         <w:fldChar w:fldCharType="separate"/>
       </w:r>
-      <w:hyperlink w:anchor="_Toc242641030" w:history="1">
+      <w:hyperlink w:anchor="_Toc242830767" w:history="1">
         <w:r>
           <w:rPr>
             <w:rStyle w:val="Hipervnculo"/>
@@ -830,7 +830,7 @@
             <w:noProof/>
             <w:webHidden/>
           </w:rPr>
-          <w:instrText xml:space="preserve"> PAGEREF _Toc242641030 \h </w:instrText>
+          <w:instrText xml:space="preserve"> PAGEREF _Toc242830767 \h </w:instrText>
         </w:r>
         <w:r>
           <w:rPr>
@@ -873,7 +873,7 @@
           <w14:ligatures w14:val="standardContextual"/>
         </w:rPr>
       </w:pPr>
-      <w:hyperlink w:anchor="_Toc242641031" w:history="1">
+      <w:hyperlink w:anchor="_Toc242830768" w:history="1">
         <w:r>
           <w:rPr>
             <w:rStyle w:val="Hipervnculo"/>
@@ -900,7 +900,7 @@
             <w:noProof/>
             <w:webHidden/>
           </w:rPr>
-          <w:instrText xml:space="preserve"> PAGEREF _Toc242641031 \h </w:instrText>
+          <w:instrText xml:space="preserve"> PAGEREF _Toc242830768 \h </w:instrText>
         </w:r>
         <w:r>
           <w:rPr>
@@ -943,7 +943,7 @@
           <w14:ligatures w14:val="standardContextual"/>
         </w:rPr>
       </w:pPr>
-      <w:hyperlink w:anchor="_Toc242641032" w:history="1">
+      <w:hyperlink w:anchor="_Toc242830769" w:history="1">
         <w:r>
           <w:rPr>
             <w:rStyle w:val="Hipervnculo"/>
@@ -970,7 +970,7 @@
             <w:noProof/>
             <w:webHidden/>
           </w:rPr>
-          <w:instrText xml:space="preserve"> PAGEREF _Toc242641032 \h </w:instrText>
+          <w:instrText xml:space="preserve"> PAGEREF _Toc242830769 \h </w:instrText>
         </w:r>
         <w:r>
           <w:rPr>
@@ -1013,7 +1013,7 @@
           <w14:ligatures w14:val="standardContextual"/>
         </w:rPr>
       </w:pPr>
-      <w:hyperlink w:anchor="_Toc242641033" w:history="1">
+      <w:hyperlink w:anchor="_Toc242830770" w:history="1">
         <w:r>
           <w:rPr>
             <w:rStyle w:val="Hipervnculo"/>
@@ -1040,7 +1040,7 @@
             <w:noProof/>
             <w:webHidden/>
           </w:rPr>
-          <w:instrText xml:space="preserve"> PAGEREF _Toc242641033 \h </w:instrText>
+          <w:instrText xml:space="preserve"> PAGEREF _Toc242830770 \h </w:instrText>
         </w:r>
         <w:r>
           <w:rPr>
@@ -1083,7 +1083,7 @@
           <w14:ligatures w14:val="standardContextual"/>
         </w:rPr>
       </w:pPr>
-      <w:hyperlink w:anchor="_Toc242641034" w:history="1">
+      <w:hyperlink w:anchor="_Toc242830771" w:history="1">
         <w:r>
           <w:rPr>
             <w:rStyle w:val="Hipervnculo"/>
@@ -1110,7 +1110,7 @@
             <w:noProof/>
             <w:webHidden/>
           </w:rPr>
-          <w:instrText xml:space="preserve"> PAGEREF _Toc242641034 \h </w:instrText>
+          <w:instrText xml:space="preserve"> PAGEREF _Toc242830771 \h </w:instrText>
         </w:r>
         <w:r>
           <w:rPr>
@@ -1153,7 +1153,7 @@
           <w14:ligatures w14:val="standardContextual"/>
         </w:rPr>
       </w:pPr>
-      <w:hyperlink w:anchor="_Toc242641035" w:history="1">
+      <w:hyperlink w:anchor="_Toc242830772" w:history="1">
         <w:r>
           <w:rPr>
             <w:rStyle w:val="Hipervnculo"/>
@@ -1180,7 +1180,7 @@
             <w:noProof/>
             <w:webHidden/>
           </w:rPr>
-          <w:instrText xml:space="preserve"> PAGEREF _Toc242641035 \h </w:instrText>
+          <w:instrText xml:space="preserve"> PAGEREF _Toc242830772 \h </w:instrText>
         </w:r>
         <w:r>
           <w:rPr>
@@ -1226,7 +1226,7 @@
           <w14:ligatures w14:val="standardContextual"/>
         </w:rPr>
       </w:pPr>
-      <w:hyperlink w:anchor="_Toc242641036" w:history="1">
+      <w:hyperlink w:anchor="_Toc242830773" w:history="1">
         <w:r>
           <w:rPr>
             <w:rStyle w:val="Hipervnculo"/>
@@ -1253,7 +1253,7 @@
             <w:noProof/>
             <w:webHidden/>
           </w:rPr>
-          <w:instrText xml:space="preserve"> PAGEREF _Toc242641036 \h </w:instrText>
+          <w:instrText xml:space="preserve"> PAGEREF _Toc242830773 \h </w:instrText>
         </w:r>
         <w:r>
           <w:rPr>
@@ -1296,7 +1296,7 @@
           <w14:ligatures w14:val="standardContextual"/>
         </w:rPr>
       </w:pPr>
-      <w:hyperlink w:anchor="_Toc242641037" w:history="1">
+      <w:hyperlink w:anchor="_Toc242830774" w:history="1">
         <w:r>
           <w:rPr>
             <w:rStyle w:val="Hipervnculo"/>
@@ -1323,7 +1323,7 @@
             <w:noProof/>
             <w:webHidden/>
           </w:rPr>
-          <w:instrText xml:space="preserve"> PAGEREF _Toc242641037 \h </w:instrText>
+          <w:instrText xml:space="preserve"> PAGEREF _Toc242830774 \h </w:instrText>
         </w:r>
         <w:r>
           <w:rPr>
@@ -1366,7 +1366,7 @@
           <w14:ligatures w14:val="standardContextual"/>
         </w:rPr>
       </w:pPr>
-      <w:hyperlink w:anchor="_Toc242641038" w:history="1">
+      <w:hyperlink w:anchor="_Toc242830775" w:history="1">
         <w:r>
           <w:rPr>
             <w:rStyle w:val="Hipervnculo"/>
@@ -1393,7 +1393,7 @@
             <w:noProof/>
             <w:webHidden/>
           </w:rPr>
-          <w:instrText xml:space="preserve"> PAGEREF _Toc242641038 \h </w:instrText>
+          <w:instrText xml:space="preserve"> PAGEREF _Toc242830775 \h </w:instrText>
         </w:r>
         <w:r>
           <w:rPr>
@@ -1436,7 +1436,7 @@
           <w14:ligatures w14:val="standardContextual"/>
         </w:rPr>
       </w:pPr>
-      <w:hyperlink w:anchor="_Toc242641039" w:history="1">
+      <w:hyperlink w:anchor="_Toc242830776" w:history="1">
         <w:r>
           <w:rPr>
             <w:rStyle w:val="Hipervnculo"/>
@@ -1463,7 +1463,7 @@
             <w:noProof/>
             <w:webHidden/>
           </w:rPr>
-          <w:instrText xml:space="preserve"> PAGEREF _Toc242641039 \h </w:instrText>
+          <w:instrText xml:space="preserve"> PAGEREF _Toc242830776 \h </w:instrText>
         </w:r>
         <w:r>
           <w:rPr>
@@ -1506,7 +1506,7 @@
           <w14:ligatures w14:val="standardContextual"/>
         </w:rPr>
       </w:pPr>
-      <w:hyperlink w:anchor="_Toc242641040" w:history="1">
+      <w:hyperlink w:anchor="_Toc242830777" w:history="1">
         <w:r>
           <w:rPr>
             <w:rStyle w:val="Hipervnculo"/>
@@ -1533,7 +1533,7 @@
             <w:noProof/>
             <w:webHidden/>
           </w:rPr>
-          <w:instrText xml:space="preserve"> PAGEREF _Toc242641040 \h </w:instrText>
+          <w:instrText xml:space="preserve"> PAGEREF _Toc242830777 \h </w:instrText>
         </w:r>
         <w:r>
           <w:rPr>
@@ -1576,7 +1576,7 @@
           <w14:ligatures w14:val="standardContextual"/>
         </w:rPr>
       </w:pPr>
-      <w:hyperlink w:anchor="_Toc242641041" w:history="1">
+      <w:hyperlink w:anchor="_Toc242830778" w:history="1">
         <w:r>
           <w:rPr>
             <w:rStyle w:val="Hipervnculo"/>
@@ -1603,7 +1603,7 @@
             <w:noProof/>
             <w:webHidden/>
           </w:rPr>
-          <w:instrText xml:space="preserve"> PAGEREF _Toc242641041 \h </w:instrText>
+          <w:instrText xml:space="preserve"> PAGEREF _Toc242830778 \h </w:instrText>
         </w:r>
         <w:r>
           <w:rPr>
@@ -1646,7 +1646,7 @@
           <w14:ligatures w14:val="standardContextual"/>
         </w:rPr>
       </w:pPr>
-      <w:hyperlink w:anchor="_Toc242641042" w:history="1">
+      <w:hyperlink w:anchor="_Toc242830779" w:history="1">
         <w:r>
           <w:rPr>
             <w:rStyle w:val="Hipervnculo"/>
@@ -1673,7 +1673,7 @@
             <w:noProof/>
             <w:webHidden/>
           </w:rPr>
-          <w:instrText xml:space="preserve"> PAGEREF _Toc242641042 \h </w:instrText>
+          <w:instrText xml:space="preserve"> PAGEREF _Toc242830779 \h </w:instrText>
         </w:r>
         <w:r>
           <w:rPr>
@@ -1719,7 +1719,7 @@
           <w14:ligatures w14:val="standardContextual"/>
         </w:rPr>
       </w:pPr>
-      <w:hyperlink w:anchor="_Toc242641043" w:history="1">
+      <w:hyperlink w:anchor="_Toc242830780" w:history="1">
         <w:r>
           <w:rPr>
             <w:rStyle w:val="Hipervnculo"/>
@@ -1746,7 +1746,7 @@
             <w:noProof/>
             <w:webHidden/>
           </w:rPr>
-          <w:instrText xml:space="preserve"> PAGEREF _Toc242641043 \h </w:instrText>
+          <w:instrText xml:space="preserve"> PAGEREF _Toc242830780 \h </w:instrText>
         </w:r>
         <w:r>
           <w:rPr>
@@ -1789,7 +1789,7 @@
           <w14:ligatures w14:val="standardContextual"/>
         </w:rPr>
       </w:pPr>
-      <w:hyperlink w:anchor="_Toc242641044" w:history="1">
+      <w:hyperlink w:anchor="_Toc242830781" w:history="1">
         <w:r>
           <w:rPr>
             <w:rStyle w:val="Hipervnculo"/>
@@ -1816,7 +1816,7 @@
             <w:noProof/>
             <w:webHidden/>
           </w:rPr>
-          <w:instrText xml:space="preserve"> PAGEREF _Toc242641044 \h </w:instrText>
+          <w:instrText xml:space="preserve"> PAGEREF _Toc242830781 \h </w:instrText>
         </w:r>
         <w:r>
           <w:rPr>
@@ -1859,7 +1859,7 @@
           <w14:ligatures w14:val="standardContextual"/>
         </w:rPr>
       </w:pPr>
-      <w:hyperlink w:anchor="_Toc242641045" w:history="1">
+      <w:hyperlink w:anchor="_Toc242830782" w:history="1">
         <w:r>
           <w:rPr>
             <w:rStyle w:val="Hipervnculo"/>
@@ -1886,7 +1886,7 @@
             <w:noProof/>
             <w:webHidden/>
           </w:rPr>
-          <w:instrText xml:space="preserve"> PAGEREF _Toc242641045 \h </w:instrText>
+          <w:instrText xml:space="preserve"> PAGEREF _Toc242830782 \h </w:instrText>
         </w:r>
         <w:r>
           <w:rPr>
@@ -1929,7 +1929,7 @@
           <w14:ligatures w14:val="standardContextual"/>
         </w:rPr>
       </w:pPr>
-      <w:hyperlink w:anchor="_Toc242641046" w:history="1">
+      <w:hyperlink w:anchor="_Toc242830783" w:history="1">
         <w:r>
           <w:rPr>
             <w:rStyle w:val="Hipervnculo"/>
@@ -1956,7 +1956,7 @@
             <w:noProof/>
             <w:webHidden/>
           </w:rPr>
-          <w:instrText xml:space="preserve"> PAGEREF _Toc242641046 \h </w:instrText>
+          <w:instrText xml:space="preserve"> PAGEREF _Toc242830783 \h </w:instrText>
         </w:r>
         <w:r>
           <w:rPr>
@@ -2002,7 +2002,7 @@
           <w14:ligatures w14:val="standardContextual"/>
         </w:rPr>
       </w:pPr>
-      <w:hyperlink w:anchor="_Toc242641047" w:history="1">
+      <w:hyperlink w:anchor="_Toc242830784" w:history="1">
         <w:r>
           <w:rPr>
             <w:rStyle w:val="Hipervnculo"/>
@@ -2029,7 +2029,7 @@
             <w:noProof/>
             <w:webHidden/>
           </w:rPr>
-          <w:instrText xml:space="preserve"> PAGEREF _Toc242641047 \h </w:instrText>
+          <w:instrText xml:space="preserve"> PAGEREF _Toc242830784 \h </w:instrText>
         </w:r>
         <w:r>
           <w:rPr>
@@ -2075,7 +2075,7 @@
           <w14:ligatures w14:val="standardContextual"/>
         </w:rPr>
       </w:pPr>
-      <w:hyperlink w:anchor="_Toc242641048" w:history="1">
+      <w:hyperlink w:anchor="_Toc242830785" w:history="1">
         <w:r>
           <w:rPr>
             <w:rStyle w:val="Hipervnculo"/>
@@ -2102,7 +2102,7 @@
             <w:noProof/>
             <w:webHidden/>
           </w:rPr>
-          <w:instrText xml:space="preserve"> PAGEREF _Toc242641048 \h </w:instrText>
+          <w:instrText xml:space="preserve"> PAGEREF _Toc242830785 \h </w:instrText>
         </w:r>
         <w:r>
           <w:rPr>
@@ -2145,7 +2145,7 @@
           <w14:ligatures w14:val="standardContextual"/>
         </w:rPr>
       </w:pPr>
-      <w:hyperlink w:anchor="_Toc242641049" w:history="1">
+      <w:hyperlink w:anchor="_Toc242830786" w:history="1">
         <w:r>
           <w:rPr>
             <w:rStyle w:val="Hipervnculo"/>
@@ -2172,7 +2172,7 @@
             <w:noProof/>
             <w:webHidden/>
           </w:rPr>
-          <w:instrText xml:space="preserve"> PAGEREF _Toc242641049 \h </w:instrText>
+          <w:instrText xml:space="preserve"> PAGEREF _Toc242830786 \h </w:instrText>
         </w:r>
         <w:r>
           <w:rPr>
@@ -2215,7 +2215,7 @@
           <w14:ligatures w14:val="standardContextual"/>
         </w:rPr>
       </w:pPr>
-      <w:hyperlink w:anchor="_Toc242641050" w:history="1">
+      <w:hyperlink w:anchor="_Toc242830787" w:history="1">
         <w:r>
           <w:rPr>
             <w:rStyle w:val="Hipervnculo"/>
@@ -2242,7 +2242,7 @@
             <w:noProof/>
             <w:webHidden/>
           </w:rPr>
-          <w:instrText xml:space="preserve"> PAGEREF _Toc242641050 \h </w:instrText>
+          <w:instrText xml:space="preserve"> PAGEREF _Toc242830787 \h </w:instrText>
         </w:r>
         <w:r>
           <w:rPr>
@@ -2285,7 +2285,7 @@
           <w14:ligatures w14:val="standardContextual"/>
         </w:rPr>
       </w:pPr>
-      <w:hyperlink w:anchor="_Toc242641051" w:history="1">
+      <w:hyperlink w:anchor="_Toc242830788" w:history="1">
         <w:r>
           <w:rPr>
             <w:rStyle w:val="Hipervnculo"/>
@@ -2312,7 +2312,7 @@
             <w:noProof/>
             <w:webHidden/>
           </w:rPr>
-          <w:instrText xml:space="preserve"> PAGEREF _Toc242641051 \h </w:instrText>
+          <w:instrText xml:space="preserve"> PAGEREF _Toc242830788 \h </w:instrText>
         </w:r>
         <w:r>
           <w:rPr>
@@ -2355,7 +2355,7 @@
           <w14:ligatures w14:val="standardContextual"/>
         </w:rPr>
       </w:pPr>
-      <w:hyperlink w:anchor="_Toc242641052" w:history="1">
+      <w:hyperlink w:anchor="_Toc242830789" w:history="1">
         <w:r>
           <w:rPr>
             <w:rStyle w:val="Hipervnculo"/>
@@ -2382,7 +2382,7 @@
             <w:noProof/>
             <w:webHidden/>
           </w:rPr>
-          <w:instrText xml:space="preserve"> PAGEREF _Toc242641052 \h </w:instrText>
+          <w:instrText xml:space="preserve"> PAGEREF _Toc242830789 \h </w:instrText>
         </w:r>
         <w:r>
           <w:rPr>
@@ -2425,7 +2425,7 @@
           <w14:ligatures w14:val="standardContextual"/>
         </w:rPr>
       </w:pPr>
-      <w:hyperlink w:anchor="_Toc242641053" w:history="1">
+      <w:hyperlink w:anchor="_Toc242830790" w:history="1">
         <w:r>
           <w:rPr>
             <w:rStyle w:val="Hipervnculo"/>
@@ -2452,7 +2452,7 @@
             <w:noProof/>
             <w:webHidden/>
           </w:rPr>
-          <w:instrText xml:space="preserve"> PAGEREF _Toc242641053 \h </w:instrText>
+          <w:instrText xml:space="preserve"> PAGEREF _Toc242830790 \h </w:instrText>
         </w:r>
         <w:r>
           <w:rPr>
@@ -2651,7 +2651,30 @@
         <w:t>2.0.0-alpha.1</w:t>
       </w:r>
       <w:r>
-        <w:t>, la primera de la plataforma SaaS en producción (módulo 0): fija los topes del plan gratuito en 50 mascotas vinculadas, 100 citas al mes y 2 cuentas de personal (RF-0.4); aclara que el super-administrador no accede a mascotas, historias, consultas ni citas, tampoco para soporte; y lleva la protección contra intentos fallidos a 20 por IP, CAPTCHA por cuenta e IP real del cliente detrás del proxy (RNF-12).</w:t>
+        <w:t xml:space="preserve">, la primera de la plataforma SaaS en producción (módulo 0): fija los topes del plan gratuito en 50 mascotas vinculadas, 100 citas al mes y 2 cuentas de personal (RF-0.4); aclara que el super-administrador no accede a mascotas, historias, consultas ni citas, tampoco para soporte; y lleva la protección contra intentos fallidos a 20 por IP, CAPTCHA por cuenta e IP real del cliente detrás del proxy (RNF-12). La </w:t>
+      </w:r>
+      <w:r>
+        <w:rPr>
+          <w:b/>
+          <w:bCs/>
+        </w:rPr>
+        <w:t>revisión 3.4</w:t>
+      </w:r>
+      <w:r>
+        <w:t xml:space="preserve"> </w:t>
+      </w:r>
+      <w:r>
+        <w:t xml:space="preserve">(14 de octubre de 2026) acompaña la versión </w:t>
+      </w:r>
+      <w:r>
+        <w:rPr>
+          <w:b/>
+          <w:bCs/>
+        </w:rPr>
+        <w:t>2.0.0-alpha.3</w:t>
+      </w:r>
+      <w:r>
+        <w:t xml:space="preserve"> (módulo 5, portal multi-clínica): la cuenta del propietario que registra la clínica se activa por el titular, sin aceptación presencial (RF-T.7); el propietario tiene un tope de 3 clínicas cuando se vincula él mismo (RF-5.4); y el registro de la mascota ya no pide el color (RF-1.1, RF-1.7).</w:t>
       </w:r>
     </w:p>
     <w:p>
@@ -2659,7 +2682,7 @@
         <w:pStyle w:val="Ttulo1"/>
       </w:pPr>
       <w:bookmarkStart w:id="0" w:name="_0e2973c2e3c317285bf344b2034a52754788c6d"/>
-      <w:bookmarkStart w:id="1" w:name="_Toc242641030"/>
+      <w:bookmarkStart w:id="1" w:name="_Toc242830767"/>
       <w:r>
         <w:lastRenderedPageBreak/>
         <w:t>1. Introducción</w:t>
@@ -2671,7 +2694,7 @@
         <w:pStyle w:val="Ttulo2"/>
       </w:pPr>
       <w:bookmarkStart w:id="2" w:name="_53ca1eb396407438b910fbafb578b446b614ca3"/>
-      <w:bookmarkStart w:id="3" w:name="_Toc242641031"/>
+      <w:bookmarkStart w:id="3" w:name="_Toc242830768"/>
       <w:r>
         <w:t>1.1 Propósito</w:t>
       </w:r>
@@ -2720,7 +2743,7 @@
         <w:pStyle w:val="Ttulo2"/>
       </w:pPr>
       <w:bookmarkStart w:id="4" w:name="_807e0e4b2e93a972a9fa0860b3c406e1abe614d"/>
-      <w:bookmarkStart w:id="5" w:name="_Toc242641032"/>
+      <w:bookmarkStart w:id="5" w:name="_Toc242830769"/>
       <w:bookmarkEnd w:id="2"/>
       <w:r>
         <w:t>1.2 Alcance</w:t>
@@ -2742,7 +2765,10 @@
         <w:t>aplicación web SaaS multi-inquilino</w:t>
       </w:r>
       <w:r>
-        <w:t xml:space="preserve"> que permite a varias clínicas veterinarias pequeñas gestionar su operación clínica sobre una misma plataforma, con los datos de cada clínica aislados entre sí. El alcance completo de la v2 abarca las capacidades siguientes. Su reparto entre v2.0 y v2.1 lo fija el plan de entregas; una capacidad descrita aquí no se presume incluida en la primera entrega.</w:t>
+        <w:t xml:space="preserve"> </w:t>
+      </w:r>
+      <w:r>
+        <w:t>que permite a varias clínicas veterinarias pequeñas gestionar su operación clínica sobre una misma plataforma, con los datos de cada clínica aislados entre sí. El alcance completo de la v2 abarca las capacidades siguientes. Su reparto entre v2.0 y v2.1 lo fija el plan de entregas; una capacidad descrita aquí no se presume incluida en la primera entrega.</w:t>
       </w:r>
     </w:p>
     <w:p>
@@ -2999,7 +3025,7 @@
         <w:pStyle w:val="Ttulo2"/>
       </w:pPr>
       <w:bookmarkStart w:id="6" w:name="_3c32702167a50f9f1e47f548e3fd9a17f4efae6"/>
-      <w:bookmarkStart w:id="7" w:name="_Toc242641033"/>
+      <w:bookmarkStart w:id="7" w:name="_Toc242830770"/>
       <w:bookmarkEnd w:id="4"/>
       <w:r>
         <w:t>1.3 Personal involucrado</w:t>
@@ -3249,7 +3275,7 @@
         <w:pStyle w:val="Ttulo2"/>
       </w:pPr>
       <w:bookmarkStart w:id="8" w:name="_202ce33122313366988e60811cd45f2e3fac5ed"/>
-      <w:bookmarkStart w:id="9" w:name="_Toc242641034"/>
+      <w:bookmarkStart w:id="9" w:name="_Toc242830771"/>
       <w:bookmarkEnd w:id="6"/>
       <w:r>
         <w:lastRenderedPageBreak/>
@@ -3925,7 +3951,7 @@
         <w:pStyle w:val="Ttulo2"/>
       </w:pPr>
       <w:bookmarkStart w:id="10" w:name="_f02bdecee650c876b7f695bd90111aab7702c00"/>
-      <w:bookmarkStart w:id="11" w:name="_Toc242641035"/>
+      <w:bookmarkStart w:id="11" w:name="_Toc242830772"/>
       <w:bookmarkEnd w:id="8"/>
       <w:r>
         <w:t>1.5 Referencias normativas</w:t>
@@ -4008,7 +4034,7 @@
         <w:pStyle w:val="Ttulo1"/>
       </w:pPr>
       <w:bookmarkStart w:id="12" w:name="_272b38cfc2ff6ab53ecdbfe24b7ba0e5f181bd6"/>
-      <w:bookmarkStart w:id="13" w:name="_Toc242641036"/>
+      <w:bookmarkStart w:id="13" w:name="_Toc242830773"/>
       <w:bookmarkEnd w:id="0"/>
       <w:bookmarkEnd w:id="10"/>
       <w:r>
@@ -4022,7 +4048,7 @@
         <w:pStyle w:val="Ttulo2"/>
       </w:pPr>
       <w:bookmarkStart w:id="14" w:name="_530c4174996bbc2c9398cdddea6478430b49400"/>
-      <w:bookmarkStart w:id="15" w:name="_Toc242641037"/>
+      <w:bookmarkStart w:id="15" w:name="_Toc242830774"/>
       <w:r>
         <w:t>2.1 Perspectiva del producto</w:t>
       </w:r>
@@ -4115,7 +4141,7 @@
           <w:noProof/>
         </w:rPr>
         <w:drawing>
-          <wp:inline distT="0" distB="0" distL="0" distR="0" wp14:anchorId="2FD7A87B" wp14:editId="2FD7A87C">
+          <wp:inline distT="0" distB="0" distL="0" distR="0" wp14:anchorId="10970B09" wp14:editId="10970B0A">
             <wp:extent cx="5939999" cy="2903365"/>
             <wp:effectExtent l="0" t="0" r="0" b="0"/>
             <wp:docPr id="20" name="Picture"/>
@@ -4124,7 +4150,7 @@
               <a:graphicData uri="http://schemas.openxmlformats.org/drawingml/2006/picture">
                 <pic:pic xmlns:pic="http://schemas.openxmlformats.org/drawingml/2006/picture">
                   <pic:nvPicPr>
-                    <pic:cNvPr id="21" name="Picture" descr="C:\Users\Usuario\AppData\Local\Temp\zooki-docs-suKJzb\ers-figura-1.png"/>
+                    <pic:cNvPr id="21" name="Picture" descr="C:\Users\Usuario\AppData\Local\Temp\zooki-docs-umXhaO\ers-figura-1.png"/>
                     <pic:cNvPicPr>
                       <a:picLocks noChangeAspect="1" noChangeArrowheads="1"/>
                     </pic:cNvPicPr>
@@ -4198,7 +4224,7 @@
           <w:noProof/>
         </w:rPr>
         <w:drawing>
-          <wp:inline distT="0" distB="0" distL="0" distR="0" wp14:anchorId="2FD7A87D" wp14:editId="2FD7A87E">
+          <wp:inline distT="0" distB="0" distL="0" distR="0" wp14:anchorId="10970B0B" wp14:editId="10970B0C">
             <wp:extent cx="5939999" cy="3650624"/>
             <wp:effectExtent l="0" t="0" r="0" b="0"/>
             <wp:docPr id="23" name="Picture"/>
@@ -4207,7 +4233,7 @@
               <a:graphicData uri="http://schemas.openxmlformats.org/drawingml/2006/picture">
                 <pic:pic xmlns:pic="http://schemas.openxmlformats.org/drawingml/2006/picture">
                   <pic:nvPicPr>
-                    <pic:cNvPr id="24" name="Picture" descr="C:\Users\Usuario\AppData\Local\Temp\zooki-docs-suKJzb\ers-figura-2.png"/>
+                    <pic:cNvPr id="24" name="Picture" descr="C:\Users\Usuario\AppData\Local\Temp\zooki-docs-umXhaO\ers-figura-2.png"/>
                     <pic:cNvPicPr>
                       <a:picLocks noChangeAspect="1" noChangeArrowheads="1"/>
                     </pic:cNvPicPr>
@@ -4245,7 +4271,7 @@
         <w:pStyle w:val="Ttulo2"/>
       </w:pPr>
       <w:bookmarkStart w:id="16" w:name="_8fb72911118d5239a4ddf916fa7f6994c841597"/>
-      <w:bookmarkStart w:id="17" w:name="_Toc242641038"/>
+      <w:bookmarkStart w:id="17" w:name="_Toc242830775"/>
       <w:bookmarkEnd w:id="14"/>
       <w:r>
         <w:t>2.2 Funciones principales</w:t>
@@ -4479,7 +4505,7 @@
         <w:pStyle w:val="Ttulo2"/>
       </w:pPr>
       <w:bookmarkStart w:id="18" w:name="_a6c21597a6595bc146d22c17741d693a713bfb2"/>
-      <w:bookmarkStart w:id="19" w:name="_Toc242641039"/>
+      <w:bookmarkStart w:id="19" w:name="_Toc242830776"/>
       <w:bookmarkEnd w:id="16"/>
       <w:r>
         <w:t>2.3 Características de los usuarios (clases de usuario)</w:t>
@@ -4953,7 +4979,7 @@
         <w:pStyle w:val="Ttulo2"/>
       </w:pPr>
       <w:bookmarkStart w:id="20" w:name="_11fda6f447d6f2a37cc502977dae18f9e3ad8b3"/>
-      <w:bookmarkStart w:id="21" w:name="_Toc242641040"/>
+      <w:bookmarkStart w:id="21" w:name="_Toc242830777"/>
       <w:bookmarkEnd w:id="18"/>
       <w:r>
         <w:t>2.4 Restricciones</w:t>
@@ -5105,7 +5131,7 @@
         <w:pStyle w:val="Ttulo2"/>
       </w:pPr>
       <w:bookmarkStart w:id="22" w:name="_26d80a1bad7ec0339e80ed2e634398510a6938c"/>
-      <w:bookmarkStart w:id="23" w:name="_Toc242641041"/>
+      <w:bookmarkStart w:id="23" w:name="_Toc242830778"/>
       <w:bookmarkEnd w:id="20"/>
       <w:r>
         <w:t>2.5 Suposiciones y dependencias</w:t>
@@ -5189,7 +5215,7 @@
         <w:pStyle w:val="Ttulo2"/>
       </w:pPr>
       <w:bookmarkStart w:id="24" w:name="_fdd8f268017d5796a6252a81775e10e2c2202be"/>
-      <w:bookmarkStart w:id="25" w:name="_Toc242641042"/>
+      <w:bookmarkStart w:id="25" w:name="_Toc242830779"/>
       <w:bookmarkEnd w:id="22"/>
       <w:r>
         <w:t>2.6 Requisitos futuros y evolución previsible</w:t>
@@ -5707,7 +5733,7 @@
         <w:pStyle w:val="Ttulo1"/>
       </w:pPr>
       <w:bookmarkStart w:id="26" w:name="_e16cbc17efb9516401e41690962f9175e4cde1d"/>
-      <w:bookmarkStart w:id="27" w:name="_Toc242641043"/>
+      <w:bookmarkStart w:id="27" w:name="_Toc242830780"/>
       <w:bookmarkEnd w:id="12"/>
       <w:bookmarkEnd w:id="24"/>
       <w:r>
@@ -5768,7 +5794,7 @@
         <w:pStyle w:val="Ttulo2"/>
       </w:pPr>
       <w:bookmarkStart w:id="28" w:name="_b1c2f4b7e2eba5d64c8f3d3850d1e5e5653bfa3"/>
-      <w:bookmarkStart w:id="29" w:name="_Toc242641044"/>
+      <w:bookmarkStart w:id="29" w:name="_Toc242830781"/>
       <w:r>
         <w:t>3.1 Interfaces externas</w:t>
       </w:r>
@@ -6595,7 +6621,7 @@
         <w:pStyle w:val="Ttulo2"/>
       </w:pPr>
       <w:bookmarkStart w:id="33" w:name="_965d05d004114bc2ee0e90669218ec0da0e554f"/>
-      <w:bookmarkStart w:id="34" w:name="_Toc242641045"/>
+      <w:bookmarkStart w:id="34" w:name="_Toc242830782"/>
       <w:bookmarkEnd w:id="28"/>
       <w:bookmarkEnd w:id="32"/>
       <w:r>
@@ -7701,7 +7727,7 @@
               <w:keepNext/>
             </w:pPr>
             <w:r>
-              <w:t>Exigir y guardar la autorización de tratamiento de datos en todo registro (formulario, Google o alta por el personal), con versión, medio, fecha e IP, y pedir la nueva versión cuando la política cambie.</w:t>
+              <w:t>Exigir y guardar la autorización de tratamiento de datos en todo registro (formulario o Google) y, en las cuentas que crea una clínica (personal y propietario), cuando el titular las activa desde su enlace, con versión, medio, fecha e IP, y pedir la nueva versión cuando la política cambie.</w:t>
             </w:r>
           </w:p>
         </w:tc>
@@ -7729,7 +7755,7 @@
               <w:keepNext/>
             </w:pPr>
             <w:r>
-              <w:t>Sin aceptación no se crea la cuenta; cada cuenta tiene su prueba de aceptación.</w:t>
+              <w:t>Sin aceptación no se crea la cuenta ni se activa la que creó la clínica; cada cuenta activa tiene su prueba de aceptación.</w:t>
             </w:r>
           </w:p>
         </w:tc>
@@ -7959,7 +7985,7 @@
               <w:keepNext/>
             </w:pPr>
             <w:r>
-              <w:t>Registrar una mascota con nombre, especie, raza, fecha de nacimiento, peso, sexo, color(es) y fotografía.</w:t>
+              <w:t>Registrar una mascota con nombre, especie, raza, fecha de nacimiento, peso, sexo y fotografía (el color ya no se pide desde M5).</w:t>
             </w:r>
           </w:p>
         </w:tc>
@@ -8371,7 +8397,14 @@
               <w:keepNext/>
             </w:pPr>
             <w:r>
-              <w:t>Registrar varios colores por mascota (relación N:M).</w:t>
+              <w:t xml:space="preserve">Registrar varios colores por mascota (relación N:M). </w:t>
+            </w:r>
+            <w:r>
+              <w:rPr>
+                <w:i/>
+                <w:iCs/>
+              </w:rPr>
+              <w:t>Sin uso desde M5: los formularios no piden el color.</w:t>
             </w:r>
           </w:p>
         </w:tc>
@@ -8446,7 +8479,10 @@
               <w:t>identidad global</w:t>
             </w:r>
             <w:r>
-              <w:t xml:space="preserve"> del propietario, vinculable a varias clínicas: una sola ficha, un solo carnet y un solo QR; antes de registrar, ofrecer vincular una mascota existente del propietario; cada clínica asigna su propio número de historia clínica.</w:t>
+              <w:t xml:space="preserve"> </w:t>
+            </w:r>
+            <w:r>
+              <w:t>del propietario, vinculable a varias clínicas: una sola ficha, un solo carnet y un solo QR; antes de registrar, ofrecer vincular una mascota existente del propietario; cada clínica asigna su propio número de historia clínica.</w:t>
             </w:r>
           </w:p>
         </w:tc>
@@ -11317,7 +11353,7 @@
               <w:keepNext/>
             </w:pPr>
             <w:r>
-              <w:t>Desde el portal, vincularse con un clic a otra clínica activa de la plataforma o desvincularse de una (sin citas pendientes en ella). Las mascotas se vinculan a la clínica cuando el propietario agenda con ellas allí o cuando la clínica las atiende.</w:t>
+              <w:t>Desde el portal, vincularse con un clic a otra clínica activa de la plataforma (hasta 3 clínicas con vínculo activo, RN-116) o desvincularse de una (sin citas pendientes en ella). Las mascotas se vinculan a la clínica cuando el propietario agenda con ellas allí o cuando la clínica las atiende.</w:t>
             </w:r>
           </w:p>
         </w:tc>
@@ -13112,7 +13148,7 @@
         <w:pStyle w:val="Ttulo2"/>
       </w:pPr>
       <w:bookmarkStart w:id="46" w:name="_91faa842a79df0e34112c2e349ad0681a2800df"/>
-      <w:bookmarkStart w:id="47" w:name="_Toc242641046"/>
+      <w:bookmarkStart w:id="47" w:name="_Toc242830783"/>
       <w:bookmarkEnd w:id="33"/>
       <w:bookmarkEnd w:id="45"/>
       <w:r>
@@ -15121,7 +15157,7 @@
         <w:pStyle w:val="Ttulo1"/>
       </w:pPr>
       <w:bookmarkStart w:id="53" w:name="_8872f59400eca311bb7b0740442423f0a836d6f"/>
-      <w:bookmarkStart w:id="54" w:name="_Toc242641047"/>
+      <w:bookmarkStart w:id="54" w:name="_Toc242830784"/>
       <w:bookmarkEnd w:id="26"/>
       <w:bookmarkEnd w:id="46"/>
       <w:bookmarkEnd w:id="52"/>
@@ -15448,7 +15484,7 @@
         <w:pStyle w:val="Ttulo1"/>
       </w:pPr>
       <w:bookmarkStart w:id="55" w:name="_11f3dc26fe4f135be80b976bfe46d60e018a5ba"/>
-      <w:bookmarkStart w:id="56" w:name="_Toc242641048"/>
+      <w:bookmarkStart w:id="56" w:name="_Toc242830785"/>
       <w:bookmarkEnd w:id="53"/>
       <w:r>
         <w:lastRenderedPageBreak/>
@@ -15461,7 +15497,7 @@
         <w:pStyle w:val="Ttulo2"/>
       </w:pPr>
       <w:bookmarkStart w:id="57" w:name="_f7580e8bc275eea58d00a0ff871ef60674ed780"/>
-      <w:bookmarkStart w:id="58" w:name="_Toc242641049"/>
+      <w:bookmarkStart w:id="58" w:name="_Toc242830786"/>
       <w:r>
         <w:t>5.1 Casos de uso</w:t>
       </w:r>
@@ -17255,7 +17291,7 @@
         <w:pStyle w:val="Ttulo2"/>
       </w:pPr>
       <w:bookmarkStart w:id="59" w:name="_5580fd549b2ecd3c29ad00fe23a279932ebe402"/>
-      <w:bookmarkStart w:id="60" w:name="_Toc242641050"/>
+      <w:bookmarkStart w:id="60" w:name="_Toc242830787"/>
       <w:bookmarkEnd w:id="57"/>
       <w:r>
         <w:t>5.2 Modelo de datos y diccionario de datos (v2.0)</w:t>
@@ -18592,7 +18628,7 @@
         <w:pStyle w:val="Ttulo2"/>
       </w:pPr>
       <w:bookmarkStart w:id="61" w:name="_fbf38eebe414c78cb475c989b20e7851be1b9a4"/>
-      <w:bookmarkStart w:id="62" w:name="_Toc242641051"/>
+      <w:bookmarkStart w:id="62" w:name="_Toc242830788"/>
       <w:bookmarkEnd w:id="59"/>
       <w:r>
         <w:t>5.3 Matriz de trazabilidad (requisito → módulo → verificación)</w:t>
@@ -19580,7 +19616,7 @@
         <w:pStyle w:val="Ttulo2"/>
       </w:pPr>
       <w:bookmarkStart w:id="63" w:name="_af48f3c1dcd6ad7c9bf690234a607d52526f60f"/>
-      <w:bookmarkStart w:id="64" w:name="_Toc242641052"/>
+      <w:bookmarkStart w:id="64" w:name="_Toc242830789"/>
       <w:bookmarkEnd w:id="61"/>
       <w:r>
         <w:t>5.4 Criterios de aceptación global</w:t>
@@ -19637,7 +19673,7 @@
         <w:pStyle w:val="Ttulo2"/>
       </w:pPr>
       <w:bookmarkStart w:id="65" w:name="_0d285be43461a565caa5d7afb2af5b21132b4e6"/>
-      <w:bookmarkStart w:id="66" w:name="_Toc242641053"/>
+      <w:bookmarkStart w:id="66" w:name="_Toc242830790"/>
       <w:bookmarkEnd w:id="63"/>
       <w:r>
         <w:t>5.5 Equivalencia de identificadores (Revisión 3.1)</w:t>
@@ -23832,7 +23868,7 @@
           <w:i/>
           <w:iCs/>
         </w:rPr>
-        <w:t>Fin del ERS, revisión 3.2. Los modelos referenciados (MER v2, procesos de negocio, flujos del sistema y modelo de los grafos) están en MER y Modelos y diagramas.</w:t>
+        <w:t>Fin del ERS, revisión 3.4. Los modelos referenciados (MER v2, procesos de negocio, flujos del sistema y modelo de los grafos) están en MER y Modelos y diagramas.</w:t>
       </w:r>
       <w:bookmarkEnd w:id="55"/>
       <w:bookmarkEnd w:id="65"/>
@@ -23970,7 +24006,7 @@
               <w:noProof/>
             </w:rPr>
             <w:drawing>
-              <wp:inline distT="0" distB="0" distL="0" distR="0" wp14:anchorId="2FD7A889" wp14:editId="2FD7A88A">
+              <wp:inline distT="0" distB="0" distL="0" distR="0" wp14:anchorId="10970B17" wp14:editId="10970B18">
                 <wp:extent cx="324000" cy="324000"/>
                 <wp:effectExtent l="0" t="0" r="0" b="0"/>
                 <wp:docPr id="9001" name="Logo Zooki"/>
@@ -24064,7 +24100,7 @@
               <w:sz w:val="17"/>
               <w:szCs w:val="17"/>
             </w:rPr>
-            <w:t>Rev. 3.3</w:t>
+            <w:t>Rev. 3.4</w:t>
           </w:r>
         </w:p>
         <w:p>
@@ -24137,7 +24173,7 @@
   <w:abstractNum w:abstractNumId="0" w15:restartNumberingAfterBreak="0">
     <w:nsid w:val="0000A990"/>
     <w:multiLevelType w:val="multilevel"/>
-    <w:tmpl w:val="FCE8E2CC"/>
+    <w:tmpl w:val="193A0458"/>
     <w:lvl w:ilvl="0">
       <w:numFmt w:val="bullet"/>
       <w:lvlText w:val=" "/>
@@ -24214,7 +24250,7 @@
   <w:abstractNum w:abstractNumId="1" w15:restartNumberingAfterBreak="0">
     <w:nsid w:val="0000A991"/>
     <w:multiLevelType w:val="multilevel"/>
-    <w:tmpl w:val="1E34392C"/>
+    <w:tmpl w:val="3EFE22C0"/>
     <w:lvl w:ilvl="0">
       <w:numFmt w:val="bullet"/>
       <w:lvlText w:val=""/>
@@ -24315,22 +24351,22 @@
       </w:rPr>
     </w:lvl>
   </w:abstractNum>
-  <w:num w:numId="1" w16cid:durableId="1359551521">
+  <w:num w:numId="1" w16cid:durableId="1835418199">
     <w:abstractNumId w:val="0"/>
   </w:num>
-  <w:num w:numId="2" w16cid:durableId="2088771286">
+  <w:num w:numId="2" w16cid:durableId="1534423190">
     <w:abstractNumId w:val="1"/>
   </w:num>
-  <w:num w:numId="3" w16cid:durableId="1552110159">
+  <w:num w:numId="3" w16cid:durableId="1348360897">
     <w:abstractNumId w:val="1"/>
   </w:num>
-  <w:num w:numId="4" w16cid:durableId="2060131956">
+  <w:num w:numId="4" w16cid:durableId="572352942">
     <w:abstractNumId w:val="1"/>
   </w:num>
-  <w:num w:numId="5" w16cid:durableId="125315560">
+  <w:num w:numId="5" w16cid:durableId="817964640">
     <w:abstractNumId w:val="1"/>
   </w:num>
-  <w:num w:numId="6" w16cid:durableId="2030567808">
+  <w:num w:numId="6" w16cid:durableId="353574753">
     <w:abstractNumId w:val="1"/>
   </w:num>
 </w:numbering>

</xml_diff>

<commit_message>
chore(release): preparar M2 alpha.4 (HU-2.8, HU-2.9, HU-2.12)
</commit_message>
<xml_diff>
--- a/public/docs/descargas/ers.docx
+++ b/public/docs/descargas/ers.docx
@@ -29,7 +29,7 @@
         <w:pStyle w:val="PortadaRevision"/>
       </w:pPr>
       <w:r>
-        <w:t>Revisión 3.4 · ISO/IEC/IEEE 29148:2018</w:t>
+        <w:t>Revisión 3.5 · ISO/IEC/IEEE 29148:2018</w:t>
       </w:r>
     </w:p>
     <w:p>
@@ -93,7 +93,7 @@
           <w:noProof/>
         </w:rPr>
         <w:drawing>
-          <wp:inline distT="0" distB="0" distL="0" distR="0" wp14:anchorId="10970B07" wp14:editId="10970B08">
+          <wp:inline distT="0" distB="0" distL="0" distR="0" wp14:anchorId="510D88B4" wp14:editId="510D88B5">
             <wp:extent cx="395999" cy="405503"/>
             <wp:effectExtent l="0" t="0" r="0" b="0"/>
             <wp:docPr id="10" name="Picture"/>
@@ -608,6 +608,7 @@
           <w:p>
             <w:pPr>
               <w:pStyle w:val="Celda"/>
+              <w:keepNext/>
             </w:pPr>
             <w:r>
               <w:t>11/10/2026</w:t>
@@ -621,9 +622,130 @@
           <w:p>
             <w:pPr>
               <w:pStyle w:val="Celda"/>
+              <w:keepNext/>
             </w:pPr>
             <w:r>
               <w:t>3.3</w:t>
+            </w:r>
+          </w:p>
+        </w:tc>
+        <w:tc>
+          <w:tcPr>
+            <w:tcW w:w="1623" w:type="pct"/>
+          </w:tcPr>
+          <w:p>
+            <w:pPr>
+              <w:pStyle w:val="Celda"/>
+              <w:keepNext/>
+            </w:pPr>
+            <w:r>
+              <w:t>ISO/IEC/IEEE 29148:2018</w:t>
+            </w:r>
+          </w:p>
+        </w:tc>
+        <w:tc>
+          <w:tcPr>
+            <w:tcW w:w="1948" w:type="pct"/>
+          </w:tcPr>
+          <w:p>
+            <w:pPr>
+              <w:pStyle w:val="Celda"/>
+              <w:keepNext/>
+            </w:pPr>
+            <w:r>
+              <w:t>Juan Sebastián Carvajal Home</w:t>
+            </w:r>
+          </w:p>
+        </w:tc>
+      </w:tr>
+      <w:tr>
+        <w:trPr>
+          <w:cantSplit/>
+        </w:trPr>
+        <w:tc>
+          <w:tcPr>
+            <w:tcW w:w="779" w:type="pct"/>
+          </w:tcPr>
+          <w:p>
+            <w:pPr>
+              <w:pStyle w:val="Celda"/>
+              <w:keepNext/>
+            </w:pPr>
+            <w:r>
+              <w:t>14/10/2026</w:t>
+            </w:r>
+          </w:p>
+        </w:tc>
+        <w:tc>
+          <w:tcPr>
+            <w:tcW w:w="649" w:type="pct"/>
+          </w:tcPr>
+          <w:p>
+            <w:pPr>
+              <w:pStyle w:val="Celda"/>
+              <w:keepNext/>
+            </w:pPr>
+            <w:r>
+              <w:t>3.4</w:t>
+            </w:r>
+          </w:p>
+        </w:tc>
+        <w:tc>
+          <w:tcPr>
+            <w:tcW w:w="1623" w:type="pct"/>
+          </w:tcPr>
+          <w:p>
+            <w:pPr>
+              <w:pStyle w:val="Celda"/>
+              <w:keepNext/>
+            </w:pPr>
+            <w:r>
+              <w:t>ISO/IEC/IEEE 29148:2018</w:t>
+            </w:r>
+          </w:p>
+        </w:tc>
+        <w:tc>
+          <w:tcPr>
+            <w:tcW w:w="1948" w:type="pct"/>
+          </w:tcPr>
+          <w:p>
+            <w:pPr>
+              <w:pStyle w:val="Celda"/>
+              <w:keepNext/>
+            </w:pPr>
+            <w:r>
+              <w:t>Juan Sebastián Carvajal Home</w:t>
+            </w:r>
+          </w:p>
+        </w:tc>
+      </w:tr>
+      <w:tr>
+        <w:trPr>
+          <w:cantSplit/>
+        </w:trPr>
+        <w:tc>
+          <w:tcPr>
+            <w:tcW w:w="779" w:type="pct"/>
+          </w:tcPr>
+          <w:p>
+            <w:pPr>
+              <w:pStyle w:val="Celda"/>
+            </w:pPr>
+            <w:r>
+              <w:t>16/10/2026</w:t>
+            </w:r>
+          </w:p>
+        </w:tc>
+        <w:tc>
+          <w:tcPr>
+            <w:tcW w:w="649" w:type="pct"/>
+          </w:tcPr>
+          <w:p>
+            <w:pPr>
+              <w:pStyle w:val="Celda"/>
+            </w:pPr>
+            <w:r>
+              <w:t>3.5</w:t>
             </w:r>
           </w:p>
         </w:tc>
@@ -803,7 +925,7 @@
       <w:r>
         <w:fldChar w:fldCharType="separate"/>
       </w:r>
-      <w:hyperlink w:anchor="_Toc242830767" w:history="1">
+      <w:hyperlink w:anchor="_Toc243039570" w:history="1">
         <w:r>
           <w:rPr>
             <w:rStyle w:val="Hipervnculo"/>
@@ -830,7 +952,7 @@
             <w:noProof/>
             <w:webHidden/>
           </w:rPr>
-          <w:instrText xml:space="preserve"> PAGEREF _Toc242830767 \h </w:instrText>
+          <w:instrText xml:space="preserve"> PAGEREF _Toc243039570 \h </w:instrText>
         </w:r>
         <w:r>
           <w:rPr>
@@ -873,7 +995,7 @@
           <w14:ligatures w14:val="standardContextual"/>
         </w:rPr>
       </w:pPr>
-      <w:hyperlink w:anchor="_Toc242830768" w:history="1">
+      <w:hyperlink w:anchor="_Toc243039571" w:history="1">
         <w:r>
           <w:rPr>
             <w:rStyle w:val="Hipervnculo"/>
@@ -900,7 +1022,7 @@
             <w:noProof/>
             <w:webHidden/>
           </w:rPr>
-          <w:instrText xml:space="preserve"> PAGEREF _Toc242830768 \h </w:instrText>
+          <w:instrText xml:space="preserve"> PAGEREF _Toc243039571 \h </w:instrText>
         </w:r>
         <w:r>
           <w:rPr>
@@ -943,7 +1065,7 @@
           <w14:ligatures w14:val="standardContextual"/>
         </w:rPr>
       </w:pPr>
-      <w:hyperlink w:anchor="_Toc242830769" w:history="1">
+      <w:hyperlink w:anchor="_Toc243039572" w:history="1">
         <w:r>
           <w:rPr>
             <w:rStyle w:val="Hipervnculo"/>
@@ -970,7 +1092,7 @@
             <w:noProof/>
             <w:webHidden/>
           </w:rPr>
-          <w:instrText xml:space="preserve"> PAGEREF _Toc242830769 \h </w:instrText>
+          <w:instrText xml:space="preserve"> PAGEREF _Toc243039572 \h </w:instrText>
         </w:r>
         <w:r>
           <w:rPr>
@@ -1013,7 +1135,7 @@
           <w14:ligatures w14:val="standardContextual"/>
         </w:rPr>
       </w:pPr>
-      <w:hyperlink w:anchor="_Toc242830770" w:history="1">
+      <w:hyperlink w:anchor="_Toc243039573" w:history="1">
         <w:r>
           <w:rPr>
             <w:rStyle w:val="Hipervnculo"/>
@@ -1040,7 +1162,7 @@
             <w:noProof/>
             <w:webHidden/>
           </w:rPr>
-          <w:instrText xml:space="preserve"> PAGEREF _Toc242830770 \h </w:instrText>
+          <w:instrText xml:space="preserve"> PAGEREF _Toc243039573 \h </w:instrText>
         </w:r>
         <w:r>
           <w:rPr>
@@ -1083,7 +1205,7 @@
           <w14:ligatures w14:val="standardContextual"/>
         </w:rPr>
       </w:pPr>
-      <w:hyperlink w:anchor="_Toc242830771" w:history="1">
+      <w:hyperlink w:anchor="_Toc243039574" w:history="1">
         <w:r>
           <w:rPr>
             <w:rStyle w:val="Hipervnculo"/>
@@ -1110,7 +1232,7 @@
             <w:noProof/>
             <w:webHidden/>
           </w:rPr>
-          <w:instrText xml:space="preserve"> PAGEREF _Toc242830771 \h </w:instrText>
+          <w:instrText xml:space="preserve"> PAGEREF _Toc243039574 \h </w:instrText>
         </w:r>
         <w:r>
           <w:rPr>
@@ -1153,7 +1275,7 @@
           <w14:ligatures w14:val="standardContextual"/>
         </w:rPr>
       </w:pPr>
-      <w:hyperlink w:anchor="_Toc242830772" w:history="1">
+      <w:hyperlink w:anchor="_Toc243039575" w:history="1">
         <w:r>
           <w:rPr>
             <w:rStyle w:val="Hipervnculo"/>
@@ -1180,7 +1302,7 @@
             <w:noProof/>
             <w:webHidden/>
           </w:rPr>
-          <w:instrText xml:space="preserve"> PAGEREF _Toc242830772 \h </w:instrText>
+          <w:instrText xml:space="preserve"> PAGEREF _Toc243039575 \h </w:instrText>
         </w:r>
         <w:r>
           <w:rPr>
@@ -1226,7 +1348,7 @@
           <w14:ligatures w14:val="standardContextual"/>
         </w:rPr>
       </w:pPr>
-      <w:hyperlink w:anchor="_Toc242830773" w:history="1">
+      <w:hyperlink w:anchor="_Toc243039576" w:history="1">
         <w:r>
           <w:rPr>
             <w:rStyle w:val="Hipervnculo"/>
@@ -1253,7 +1375,7 @@
             <w:noProof/>
             <w:webHidden/>
           </w:rPr>
-          <w:instrText xml:space="preserve"> PAGEREF _Toc242830773 \h </w:instrText>
+          <w:instrText xml:space="preserve"> PAGEREF _Toc243039576 \h </w:instrText>
         </w:r>
         <w:r>
           <w:rPr>
@@ -1296,7 +1418,7 @@
           <w14:ligatures w14:val="standardContextual"/>
         </w:rPr>
       </w:pPr>
-      <w:hyperlink w:anchor="_Toc242830774" w:history="1">
+      <w:hyperlink w:anchor="_Toc243039577" w:history="1">
         <w:r>
           <w:rPr>
             <w:rStyle w:val="Hipervnculo"/>
@@ -1323,7 +1445,7 @@
             <w:noProof/>
             <w:webHidden/>
           </w:rPr>
-          <w:instrText xml:space="preserve"> PAGEREF _Toc242830774 \h </w:instrText>
+          <w:instrText xml:space="preserve"> PAGEREF _Toc243039577 \h </w:instrText>
         </w:r>
         <w:r>
           <w:rPr>
@@ -1366,7 +1488,7 @@
           <w14:ligatures w14:val="standardContextual"/>
         </w:rPr>
       </w:pPr>
-      <w:hyperlink w:anchor="_Toc242830775" w:history="1">
+      <w:hyperlink w:anchor="_Toc243039578" w:history="1">
         <w:r>
           <w:rPr>
             <w:rStyle w:val="Hipervnculo"/>
@@ -1393,7 +1515,7 @@
             <w:noProof/>
             <w:webHidden/>
           </w:rPr>
-          <w:instrText xml:space="preserve"> PAGEREF _Toc242830775 \h </w:instrText>
+          <w:instrText xml:space="preserve"> PAGEREF _Toc243039578 \h </w:instrText>
         </w:r>
         <w:r>
           <w:rPr>
@@ -1436,7 +1558,7 @@
           <w14:ligatures w14:val="standardContextual"/>
         </w:rPr>
       </w:pPr>
-      <w:hyperlink w:anchor="_Toc242830776" w:history="1">
+      <w:hyperlink w:anchor="_Toc243039579" w:history="1">
         <w:r>
           <w:rPr>
             <w:rStyle w:val="Hipervnculo"/>
@@ -1463,7 +1585,7 @@
             <w:noProof/>
             <w:webHidden/>
           </w:rPr>
-          <w:instrText xml:space="preserve"> PAGEREF _Toc242830776 \h </w:instrText>
+          <w:instrText xml:space="preserve"> PAGEREF _Toc243039579 \h </w:instrText>
         </w:r>
         <w:r>
           <w:rPr>
@@ -1506,7 +1628,7 @@
           <w14:ligatures w14:val="standardContextual"/>
         </w:rPr>
       </w:pPr>
-      <w:hyperlink w:anchor="_Toc242830777" w:history="1">
+      <w:hyperlink w:anchor="_Toc243039580" w:history="1">
         <w:r>
           <w:rPr>
             <w:rStyle w:val="Hipervnculo"/>
@@ -1533,7 +1655,7 @@
             <w:noProof/>
             <w:webHidden/>
           </w:rPr>
-          <w:instrText xml:space="preserve"> PAGEREF _Toc242830777 \h </w:instrText>
+          <w:instrText xml:space="preserve"> PAGEREF _Toc243039580 \h </w:instrText>
         </w:r>
         <w:r>
           <w:rPr>
@@ -1576,7 +1698,7 @@
           <w14:ligatures w14:val="standardContextual"/>
         </w:rPr>
       </w:pPr>
-      <w:hyperlink w:anchor="_Toc242830778" w:history="1">
+      <w:hyperlink w:anchor="_Toc243039581" w:history="1">
         <w:r>
           <w:rPr>
             <w:rStyle w:val="Hipervnculo"/>
@@ -1603,7 +1725,7 @@
             <w:noProof/>
             <w:webHidden/>
           </w:rPr>
-          <w:instrText xml:space="preserve"> PAGEREF _Toc242830778 \h </w:instrText>
+          <w:instrText xml:space="preserve"> PAGEREF _Toc243039581 \h </w:instrText>
         </w:r>
         <w:r>
           <w:rPr>
@@ -1646,7 +1768,7 @@
           <w14:ligatures w14:val="standardContextual"/>
         </w:rPr>
       </w:pPr>
-      <w:hyperlink w:anchor="_Toc242830779" w:history="1">
+      <w:hyperlink w:anchor="_Toc243039582" w:history="1">
         <w:r>
           <w:rPr>
             <w:rStyle w:val="Hipervnculo"/>
@@ -1673,7 +1795,7 @@
             <w:noProof/>
             <w:webHidden/>
           </w:rPr>
-          <w:instrText xml:space="preserve"> PAGEREF _Toc242830779 \h </w:instrText>
+          <w:instrText xml:space="preserve"> PAGEREF _Toc243039582 \h </w:instrText>
         </w:r>
         <w:r>
           <w:rPr>
@@ -1719,7 +1841,7 @@
           <w14:ligatures w14:val="standardContextual"/>
         </w:rPr>
       </w:pPr>
-      <w:hyperlink w:anchor="_Toc242830780" w:history="1">
+      <w:hyperlink w:anchor="_Toc243039583" w:history="1">
         <w:r>
           <w:rPr>
             <w:rStyle w:val="Hipervnculo"/>
@@ -1746,7 +1868,7 @@
             <w:noProof/>
             <w:webHidden/>
           </w:rPr>
-          <w:instrText xml:space="preserve"> PAGEREF _Toc242830780 \h </w:instrText>
+          <w:instrText xml:space="preserve"> PAGEREF _Toc243039583 \h </w:instrText>
         </w:r>
         <w:r>
           <w:rPr>
@@ -1789,7 +1911,7 @@
           <w14:ligatures w14:val="standardContextual"/>
         </w:rPr>
       </w:pPr>
-      <w:hyperlink w:anchor="_Toc242830781" w:history="1">
+      <w:hyperlink w:anchor="_Toc243039584" w:history="1">
         <w:r>
           <w:rPr>
             <w:rStyle w:val="Hipervnculo"/>
@@ -1816,7 +1938,7 @@
             <w:noProof/>
             <w:webHidden/>
           </w:rPr>
-          <w:instrText xml:space="preserve"> PAGEREF _Toc242830781 \h </w:instrText>
+          <w:instrText xml:space="preserve"> PAGEREF _Toc243039584 \h </w:instrText>
         </w:r>
         <w:r>
           <w:rPr>
@@ -1859,7 +1981,7 @@
           <w14:ligatures w14:val="standardContextual"/>
         </w:rPr>
       </w:pPr>
-      <w:hyperlink w:anchor="_Toc242830782" w:history="1">
+      <w:hyperlink w:anchor="_Toc243039585" w:history="1">
         <w:r>
           <w:rPr>
             <w:rStyle w:val="Hipervnculo"/>
@@ -1886,7 +2008,7 @@
             <w:noProof/>
             <w:webHidden/>
           </w:rPr>
-          <w:instrText xml:space="preserve"> PAGEREF _Toc242830782 \h </w:instrText>
+          <w:instrText xml:space="preserve"> PAGEREF _Toc243039585 \h </w:instrText>
         </w:r>
         <w:r>
           <w:rPr>
@@ -1929,7 +2051,7 @@
           <w14:ligatures w14:val="standardContextual"/>
         </w:rPr>
       </w:pPr>
-      <w:hyperlink w:anchor="_Toc242830783" w:history="1">
+      <w:hyperlink w:anchor="_Toc243039586" w:history="1">
         <w:r>
           <w:rPr>
             <w:rStyle w:val="Hipervnculo"/>
@@ -1956,7 +2078,7 @@
             <w:noProof/>
             <w:webHidden/>
           </w:rPr>
-          <w:instrText xml:space="preserve"> PAGEREF _Toc242830783 \h </w:instrText>
+          <w:instrText xml:space="preserve"> PAGEREF _Toc243039586 \h </w:instrText>
         </w:r>
         <w:r>
           <w:rPr>
@@ -2002,7 +2124,7 @@
           <w14:ligatures w14:val="standardContextual"/>
         </w:rPr>
       </w:pPr>
-      <w:hyperlink w:anchor="_Toc242830784" w:history="1">
+      <w:hyperlink w:anchor="_Toc243039587" w:history="1">
         <w:r>
           <w:rPr>
             <w:rStyle w:val="Hipervnculo"/>
@@ -2029,7 +2151,7 @@
             <w:noProof/>
             <w:webHidden/>
           </w:rPr>
-          <w:instrText xml:space="preserve"> PAGEREF _Toc242830784 \h </w:instrText>
+          <w:instrText xml:space="preserve"> PAGEREF _Toc243039587 \h </w:instrText>
         </w:r>
         <w:r>
           <w:rPr>
@@ -2075,7 +2197,7 @@
           <w14:ligatures w14:val="standardContextual"/>
         </w:rPr>
       </w:pPr>
-      <w:hyperlink w:anchor="_Toc242830785" w:history="1">
+      <w:hyperlink w:anchor="_Toc243039588" w:history="1">
         <w:r>
           <w:rPr>
             <w:rStyle w:val="Hipervnculo"/>
@@ -2102,7 +2224,7 @@
             <w:noProof/>
             <w:webHidden/>
           </w:rPr>
-          <w:instrText xml:space="preserve"> PAGEREF _Toc242830785 \h </w:instrText>
+          <w:instrText xml:space="preserve"> PAGEREF _Toc243039588 \h </w:instrText>
         </w:r>
         <w:r>
           <w:rPr>
@@ -2145,7 +2267,7 @@
           <w14:ligatures w14:val="standardContextual"/>
         </w:rPr>
       </w:pPr>
-      <w:hyperlink w:anchor="_Toc242830786" w:history="1">
+      <w:hyperlink w:anchor="_Toc243039589" w:history="1">
         <w:r>
           <w:rPr>
             <w:rStyle w:val="Hipervnculo"/>
@@ -2172,7 +2294,7 @@
             <w:noProof/>
             <w:webHidden/>
           </w:rPr>
-          <w:instrText xml:space="preserve"> PAGEREF _Toc242830786 \h </w:instrText>
+          <w:instrText xml:space="preserve"> PAGEREF _Toc243039589 \h </w:instrText>
         </w:r>
         <w:r>
           <w:rPr>
@@ -2215,7 +2337,7 @@
           <w14:ligatures w14:val="standardContextual"/>
         </w:rPr>
       </w:pPr>
-      <w:hyperlink w:anchor="_Toc242830787" w:history="1">
+      <w:hyperlink w:anchor="_Toc243039590" w:history="1">
         <w:r>
           <w:rPr>
             <w:rStyle w:val="Hipervnculo"/>
@@ -2242,7 +2364,7 @@
             <w:noProof/>
             <w:webHidden/>
           </w:rPr>
-          <w:instrText xml:space="preserve"> PAGEREF _Toc242830787 \h </w:instrText>
+          <w:instrText xml:space="preserve"> PAGEREF _Toc243039590 \h </w:instrText>
         </w:r>
         <w:r>
           <w:rPr>
@@ -2285,7 +2407,7 @@
           <w14:ligatures w14:val="standardContextual"/>
         </w:rPr>
       </w:pPr>
-      <w:hyperlink w:anchor="_Toc242830788" w:history="1">
+      <w:hyperlink w:anchor="_Toc243039591" w:history="1">
         <w:r>
           <w:rPr>
             <w:rStyle w:val="Hipervnculo"/>
@@ -2312,7 +2434,7 @@
             <w:noProof/>
             <w:webHidden/>
           </w:rPr>
-          <w:instrText xml:space="preserve"> PAGEREF _Toc242830788 \h </w:instrText>
+          <w:instrText xml:space="preserve"> PAGEREF _Toc243039591 \h </w:instrText>
         </w:r>
         <w:r>
           <w:rPr>
@@ -2355,7 +2477,7 @@
           <w14:ligatures w14:val="standardContextual"/>
         </w:rPr>
       </w:pPr>
-      <w:hyperlink w:anchor="_Toc242830789" w:history="1">
+      <w:hyperlink w:anchor="_Toc243039592" w:history="1">
         <w:r>
           <w:rPr>
             <w:rStyle w:val="Hipervnculo"/>
@@ -2382,7 +2504,7 @@
             <w:noProof/>
             <w:webHidden/>
           </w:rPr>
-          <w:instrText xml:space="preserve"> PAGEREF _Toc242830789 \h </w:instrText>
+          <w:instrText xml:space="preserve"> PAGEREF _Toc243039592 \h </w:instrText>
         </w:r>
         <w:r>
           <w:rPr>
@@ -2402,7 +2524,7 @@
             <w:noProof/>
             <w:webHidden/>
           </w:rPr>
-          <w:t>32</w:t>
+          <w:t>33</w:t>
         </w:r>
         <w:r>
           <w:rPr>
@@ -2425,7 +2547,7 @@
           <w14:ligatures w14:val="standardContextual"/>
         </w:rPr>
       </w:pPr>
-      <w:hyperlink w:anchor="_Toc242830790" w:history="1">
+      <w:hyperlink w:anchor="_Toc243039593" w:history="1">
         <w:r>
           <w:rPr>
             <w:rStyle w:val="Hipervnculo"/>
@@ -2452,7 +2574,7 @@
             <w:noProof/>
             <w:webHidden/>
           </w:rPr>
-          <w:instrText xml:space="preserve"> PAGEREF _Toc242830790 \h </w:instrText>
+          <w:instrText xml:space="preserve"> PAGEREF _Toc243039593 \h </w:instrText>
         </w:r>
         <w:r>
           <w:rPr>
@@ -2529,7 +2651,10 @@
         <w:t>revisión 3.0</w:t>
       </w:r>
       <w:r>
-        <w:t xml:space="preserve"> reescribe el ERS para la versión </w:t>
+        <w:t xml:space="preserve"> </w:t>
+      </w:r>
+      <w:r>
+        <w:t xml:space="preserve">reescribe el ERS para la versión </w:t>
       </w:r>
       <w:r>
         <w:rPr>
@@ -2549,10 +2674,7 @@
         <w:t>plataforma SaaS multi-inquilino</w:t>
       </w:r>
       <w:r>
-        <w:t xml:space="preserve"> </w:t>
-      </w:r>
-      <w:r>
-        <w:t xml:space="preserve">e incorpora dos capacidades diferenciadoras basadas en grafos (soporte a la decisión clínica y agendamiento inteligente), además de suscripción por planes, registro autónomo de clínicas, carnet digital con QR y reputación de veterinarios. Esta revisión se alinea al estándar </w:t>
+        <w:t xml:space="preserve"> e incorpora dos capacidades diferenciadoras basadas en grafos (soporte a la decisión clínica y agendamiento inteligente), además de suscripción por planes, registro autónomo de clínicas, carnet digital con QR y reputación de veterinarios. Esta revisión se alinea al estándar </w:t>
       </w:r>
       <w:r>
         <w:rPr>
@@ -2582,10 +2704,7 @@
         <w:t>revisión 3.1</w:t>
       </w:r>
       <w:r>
-        <w:t xml:space="preserve"> </w:t>
-      </w:r>
-      <w:r>
-        <w:t>(5 de octubre de 2026) recoge la revisión completa de la especificación: identifica cada requisito funcional con el número de su módulo (</w:t>
+        <w:t xml:space="preserve"> (5 de octubre de 2026) recoge la revisión completa de la especificación: identifica cada requisito funcional con el número de su módulo (</w:t>
       </w:r>
       <w:r>
         <w:rPr>
@@ -2675,6 +2794,33 @@
       </w:r>
       <w:r>
         <w:t xml:space="preserve"> (módulo 5, portal multi-clínica): la cuenta del propietario que registra la clínica se activa por el titular, sin aceptación presencial (RF-T.7); el propietario tiene un tope de 3 clínicas cuando se vincula él mismo (RF-5.4); y el registro de la mascota ya no pide el color (RF-1.1, RF-1.7).</w:t>
+      </w:r>
+    </w:p>
+    <w:p>
+      <w:pPr>
+        <w:pStyle w:val="Textoindependiente"/>
+      </w:pPr>
+      <w:r>
+        <w:rPr>
+          <w:b/>
+          <w:bCs/>
+        </w:rPr>
+        <w:t>Revisión 3.5 (16 de octubre de 2026):</w:t>
+      </w:r>
+      <w:r>
+        <w:t xml:space="preserve"> cierre de M2 en 2.0.0-alpha.4, con 96 HU, 427 RE, 120 RN y 52 tablas de negocio; </w:t>
+      </w:r>
+      <w:r>
+        <w:rPr>
+          <w:rStyle w:val="VerbatimChar"/>
+        </w:rPr>
+        <w:t>schema_migraciones</w:t>
+      </w:r>
+      <w:r>
+        <w:t xml:space="preserve"> </w:t>
+      </w:r>
+      <w:r>
+        <w:t>es una tabla técnica adicional del migrador. Se completan síntomas, sugerencias, prescripción, alergias y mapa; el triage operativo sigue en M4. Validación veterinaria del conocimiento pendiente.</w:t>
       </w:r>
     </w:p>
     <w:p>
@@ -2682,7 +2828,7 @@
         <w:pStyle w:val="Ttulo1"/>
       </w:pPr>
       <w:bookmarkStart w:id="0" w:name="_0e2973c2e3c317285bf344b2034a52754788c6d"/>
-      <w:bookmarkStart w:id="1" w:name="_Toc242830767"/>
+      <w:bookmarkStart w:id="1" w:name="_Toc243039570"/>
       <w:r>
         <w:lastRenderedPageBreak/>
         <w:t>1. Introducción</w:t>
@@ -2694,7 +2840,7 @@
         <w:pStyle w:val="Ttulo2"/>
       </w:pPr>
       <w:bookmarkStart w:id="2" w:name="_53ca1eb396407438b910fbafb578b446b614ca3"/>
-      <w:bookmarkStart w:id="3" w:name="_Toc242830768"/>
+      <w:bookmarkStart w:id="3" w:name="_Toc243039571"/>
       <w:r>
         <w:t>1.1 Propósito</w:t>
       </w:r>
@@ -2735,7 +2881,10 @@
         <w:t>v2.1</w:t>
       </w:r>
       <w:r>
-        <w:t xml:space="preserve"> del plan de historias. Sirve como referente para el diseño, la implementación, las pruebas y la validación. Cada requisito se enuncia siguiendo las características de calidad del estándar ISO/IEC/IEEE 29148:2018 (necesario, verificable, no ambiguo, singular y trazable), con un identificador único y un criterio de verificación asociado.</w:t>
+        <w:t xml:space="preserve"> </w:t>
+      </w:r>
+      <w:r>
+        <w:t>del plan de historias. Sirve como referente para el diseño, la implementación, las pruebas y la validación. Cada requisito se enuncia siguiendo las características de calidad del estándar ISO/IEC/IEEE 29148:2018 (necesario, verificable, no ambiguo, singular y trazable), con un identificador único y un criterio de verificación asociado.</w:t>
       </w:r>
     </w:p>
     <w:p>
@@ -2743,7 +2892,7 @@
         <w:pStyle w:val="Ttulo2"/>
       </w:pPr>
       <w:bookmarkStart w:id="4" w:name="_807e0e4b2e93a972a9fa0860b3c406e1abe614d"/>
-      <w:bookmarkStart w:id="5" w:name="_Toc242830769"/>
+      <w:bookmarkStart w:id="5" w:name="_Toc243039572"/>
       <w:bookmarkEnd w:id="2"/>
       <w:r>
         <w:t>1.2 Alcance</w:t>
@@ -3025,7 +3174,7 @@
         <w:pStyle w:val="Ttulo2"/>
       </w:pPr>
       <w:bookmarkStart w:id="6" w:name="_3c32702167a50f9f1e47f548e3fd9a17f4efae6"/>
-      <w:bookmarkStart w:id="7" w:name="_Toc242830770"/>
+      <w:bookmarkStart w:id="7" w:name="_Toc243039573"/>
       <w:bookmarkEnd w:id="4"/>
       <w:r>
         <w:t>1.3 Personal involucrado</w:t>
@@ -3275,7 +3424,7 @@
         <w:pStyle w:val="Ttulo2"/>
       </w:pPr>
       <w:bookmarkStart w:id="8" w:name="_202ce33122313366988e60811cd45f2e3fac5ed"/>
-      <w:bookmarkStart w:id="9" w:name="_Toc242830771"/>
+      <w:bookmarkStart w:id="9" w:name="_Toc243039574"/>
       <w:bookmarkEnd w:id="6"/>
       <w:r>
         <w:lastRenderedPageBreak/>
@@ -3951,7 +4100,7 @@
         <w:pStyle w:val="Ttulo2"/>
       </w:pPr>
       <w:bookmarkStart w:id="10" w:name="_f02bdecee650c876b7f695bd90111aab7702c00"/>
-      <w:bookmarkStart w:id="11" w:name="_Toc242830772"/>
+      <w:bookmarkStart w:id="11" w:name="_Toc243039575"/>
       <w:bookmarkEnd w:id="8"/>
       <w:r>
         <w:t>1.5 Referencias normativas</w:t>
@@ -4034,7 +4183,7 @@
         <w:pStyle w:val="Ttulo1"/>
       </w:pPr>
       <w:bookmarkStart w:id="12" w:name="_272b38cfc2ff6ab53ecdbfe24b7ba0e5f181bd6"/>
-      <w:bookmarkStart w:id="13" w:name="_Toc242830773"/>
+      <w:bookmarkStart w:id="13" w:name="_Toc243039576"/>
       <w:bookmarkEnd w:id="0"/>
       <w:bookmarkEnd w:id="10"/>
       <w:r>
@@ -4048,7 +4197,7 @@
         <w:pStyle w:val="Ttulo2"/>
       </w:pPr>
       <w:bookmarkStart w:id="14" w:name="_530c4174996bbc2c9398cdddea6478430b49400"/>
-      <w:bookmarkStart w:id="15" w:name="_Toc242830774"/>
+      <w:bookmarkStart w:id="15" w:name="_Toc243039577"/>
       <w:r>
         <w:t>2.1 Perspectiva del producto</w:t>
       </w:r>
@@ -4141,7 +4290,7 @@
           <w:noProof/>
         </w:rPr>
         <w:drawing>
-          <wp:inline distT="0" distB="0" distL="0" distR="0" wp14:anchorId="10970B09" wp14:editId="10970B0A">
+          <wp:inline distT="0" distB="0" distL="0" distR="0" wp14:anchorId="510D88B6" wp14:editId="510D88B7">
             <wp:extent cx="5939999" cy="2903365"/>
             <wp:effectExtent l="0" t="0" r="0" b="0"/>
             <wp:docPr id="20" name="Picture"/>
@@ -4150,7 +4299,7 @@
               <a:graphicData uri="http://schemas.openxmlformats.org/drawingml/2006/picture">
                 <pic:pic xmlns:pic="http://schemas.openxmlformats.org/drawingml/2006/picture">
                   <pic:nvPicPr>
-                    <pic:cNvPr id="21" name="Picture" descr="C:\Users\Usuario\AppData\Local\Temp\zooki-docs-umXhaO\ers-figura-1.png"/>
+                    <pic:cNvPr id="21" name="Picture" descr="C:\Users\Usuario\AppData\Local\Temp\zooki-docs-ykfX9U\ers-figura-1.png"/>
                     <pic:cNvPicPr>
                       <a:picLocks noChangeAspect="1" noChangeArrowheads="1"/>
                     </pic:cNvPicPr>
@@ -4224,7 +4373,7 @@
           <w:noProof/>
         </w:rPr>
         <w:drawing>
-          <wp:inline distT="0" distB="0" distL="0" distR="0" wp14:anchorId="10970B0B" wp14:editId="10970B0C">
+          <wp:inline distT="0" distB="0" distL="0" distR="0" wp14:anchorId="510D88B8" wp14:editId="510D88B9">
             <wp:extent cx="5939999" cy="3650624"/>
             <wp:effectExtent l="0" t="0" r="0" b="0"/>
             <wp:docPr id="23" name="Picture"/>
@@ -4233,7 +4382,7 @@
               <a:graphicData uri="http://schemas.openxmlformats.org/drawingml/2006/picture">
                 <pic:pic xmlns:pic="http://schemas.openxmlformats.org/drawingml/2006/picture">
                   <pic:nvPicPr>
-                    <pic:cNvPr id="24" name="Picture" descr="C:\Users\Usuario\AppData\Local\Temp\zooki-docs-umXhaO\ers-figura-2.png"/>
+                    <pic:cNvPr id="24" name="Picture" descr="C:\Users\Usuario\AppData\Local\Temp\zooki-docs-ykfX9U\ers-figura-2.png"/>
                     <pic:cNvPicPr>
                       <a:picLocks noChangeAspect="1" noChangeArrowheads="1"/>
                     </pic:cNvPicPr>
@@ -4271,7 +4420,7 @@
         <w:pStyle w:val="Ttulo2"/>
       </w:pPr>
       <w:bookmarkStart w:id="16" w:name="_8fb72911118d5239a4ddf916fa7f6994c841597"/>
-      <w:bookmarkStart w:id="17" w:name="_Toc242830775"/>
+      <w:bookmarkStart w:id="17" w:name="_Toc243039578"/>
       <w:bookmarkEnd w:id="14"/>
       <w:r>
         <w:t>2.2 Funciones principales</w:t>
@@ -4505,7 +4654,7 @@
         <w:pStyle w:val="Ttulo2"/>
       </w:pPr>
       <w:bookmarkStart w:id="18" w:name="_a6c21597a6595bc146d22c17741d693a713bfb2"/>
-      <w:bookmarkStart w:id="19" w:name="_Toc242830776"/>
+      <w:bookmarkStart w:id="19" w:name="_Toc243039579"/>
       <w:bookmarkEnd w:id="16"/>
       <w:r>
         <w:t>2.3 Características de los usuarios (clases de usuario)</w:t>
@@ -4979,7 +5128,7 @@
         <w:pStyle w:val="Ttulo2"/>
       </w:pPr>
       <w:bookmarkStart w:id="20" w:name="_11fda6f447d6f2a37cc502977dae18f9e3ad8b3"/>
-      <w:bookmarkStart w:id="21" w:name="_Toc242830777"/>
+      <w:bookmarkStart w:id="21" w:name="_Toc243039580"/>
       <w:bookmarkEnd w:id="18"/>
       <w:r>
         <w:t>2.4 Restricciones</w:t>
@@ -5131,7 +5280,7 @@
         <w:pStyle w:val="Ttulo2"/>
       </w:pPr>
       <w:bookmarkStart w:id="22" w:name="_26d80a1bad7ec0339e80ed2e634398510a6938c"/>
-      <w:bookmarkStart w:id="23" w:name="_Toc242830778"/>
+      <w:bookmarkStart w:id="23" w:name="_Toc243039581"/>
       <w:bookmarkEnd w:id="20"/>
       <w:r>
         <w:t>2.5 Suposiciones y dependencias</w:t>
@@ -5215,7 +5364,7 @@
         <w:pStyle w:val="Ttulo2"/>
       </w:pPr>
       <w:bookmarkStart w:id="24" w:name="_fdd8f268017d5796a6252a81775e10e2c2202be"/>
-      <w:bookmarkStart w:id="25" w:name="_Toc242830779"/>
+      <w:bookmarkStart w:id="25" w:name="_Toc243039582"/>
       <w:bookmarkEnd w:id="22"/>
       <w:r>
         <w:t>2.6 Requisitos futuros y evolución previsible</w:t>
@@ -5733,7 +5882,7 @@
         <w:pStyle w:val="Ttulo1"/>
       </w:pPr>
       <w:bookmarkStart w:id="26" w:name="_e16cbc17efb9516401e41690962f9175e4cde1d"/>
-      <w:bookmarkStart w:id="27" w:name="_Toc242830780"/>
+      <w:bookmarkStart w:id="27" w:name="_Toc243039583"/>
       <w:bookmarkEnd w:id="12"/>
       <w:bookmarkEnd w:id="24"/>
       <w:r>
@@ -5794,7 +5943,7 @@
         <w:pStyle w:val="Ttulo2"/>
       </w:pPr>
       <w:bookmarkStart w:id="28" w:name="_b1c2f4b7e2eba5d64c8f3d3850d1e5e5653bfa3"/>
-      <w:bookmarkStart w:id="29" w:name="_Toc242830781"/>
+      <w:bookmarkStart w:id="29" w:name="_Toc243039584"/>
       <w:r>
         <w:t>3.1 Interfaces externas</w:t>
       </w:r>
@@ -6621,7 +6770,7 @@
         <w:pStyle w:val="Ttulo2"/>
       </w:pPr>
       <w:bookmarkStart w:id="33" w:name="_965d05d004114bc2ee0e90669218ec0da0e554f"/>
-      <w:bookmarkStart w:id="34" w:name="_Toc242830782"/>
+      <w:bookmarkStart w:id="34" w:name="_Toc243039585"/>
       <w:bookmarkEnd w:id="28"/>
       <w:bookmarkEnd w:id="32"/>
       <w:r>
@@ -9052,7 +9201,7 @@
               <w:keepNext/>
             </w:pPr>
             <w:r>
-              <w:t>Mantener el grafo de conocimiento clínico: nodos (síntomas, diagnósticos, fármacos, especies, razas, condiciones) y aristas con tipo y signo (positivo/negativo).</w:t>
+              <w:t>Mantener conocimiento global versionado: nodos (incluidas sustancias), aristas con signo/peso/efecto, fuentes, validación, sinónimos y reglas contextuales. El superadministrador lo explora en un mapa de solo lectura sin pacientes (HU-2.12).</w:t>
             </w:r>
           </w:p>
         </w:tc>
@@ -9080,7 +9229,7 @@
               <w:keepNext/>
             </w:pPr>
             <w:r>
-              <w:t>Es posible crear y consultar nodos y aristas con su tipo y signo.</w:t>
+              <w:t>La carga conserva IDs y retira lógicamente; el mapa muestra fuentes/cobertura/versión y rechaza acceso desde contextos clínicos.</w:t>
             </w:r>
           </w:p>
         </w:tc>
@@ -9385,7 +9534,7 @@
               <w:pStyle w:val="Celda"/>
             </w:pPr>
             <w:r>
-              <w:t>Calcular el nivel de triage con reglas explícitas: captura estructurada de síntomas y tiempo, nivel máximo sin promediar, escalamiento por combinación, modificadores del paciente, alarmas universales para cualquier especie, «revisión del personal» cuando no hay cobertura y aviso de posible contagio.</w:t>
+              <w:t>Calcular el triage solo con marcas confirmadas, tiempo por evento y paciente; nota libre excluida, máximo sin promediar, combinaciones, modificadores, P1 universal, revisión sin cobertura y aviso de posible contagio.</w:t>
             </w:r>
           </w:p>
         </w:tc>
@@ -9411,7 +9560,7 @@
               <w:pStyle w:val="Celda"/>
             </w:pPr>
             <w:r>
-              <w:t>Los 26 casos clínicos de la batería de triage dan su nivel esperado.</w:t>
+              <w:t>Los 26 casos estructurados cumplen sus esperados provisionales y limitaciones; «No sé» requiere revisión si es decisivo y «No aplica» se usa solo para preventivo.</w:t>
             </w:r>
           </w:p>
         </w:tc>
@@ -9433,7 +9582,10 @@
         <w:t>apoyo</w:t>
       </w:r>
       <w:r>
-        <w:t>, no diagnóstico automático: la decisión final es del veterinario. Su cobertura depende del conocimiento cargado (acotado inicialmente a perros y gatos).</w:t>
+        <w:t xml:space="preserve">, no diagnóstico automático: la decisión final es del veterinario. Su cobertura depende del conocimiento cargado (acotado inicialmente a perros y gatos). Cada elemento tiene fuente y validación pendiente; las pruebas de software no certifican validez clínica. </w:t>
+      </w:r>
+      <w:r>
+        <w:t>En 2.0.0-alpha.4 están implementados el formato/cargador, el conocimiento inicial con fuentes, el mapa, el apoyo diagnóstico y las alertas al prescribir. El motor de triage, buscador y batería están hechos; su captura y operación en agenda, urgencias y ajuste veterinario se integran en M4. Carnet y QR con alertas siguen para el final de la v2.0.</w:t>
       </w:r>
     </w:p>
     <w:p>
@@ -13148,7 +13300,7 @@
         <w:pStyle w:val="Ttulo2"/>
       </w:pPr>
       <w:bookmarkStart w:id="46" w:name="_91faa842a79df0e34112c2e349ad0681a2800df"/>
-      <w:bookmarkStart w:id="47" w:name="_Toc242830783"/>
+      <w:bookmarkStart w:id="47" w:name="_Toc243039586"/>
       <w:bookmarkEnd w:id="33"/>
       <w:bookmarkEnd w:id="45"/>
       <w:r>
@@ -15157,7 +15309,7 @@
         <w:pStyle w:val="Ttulo1"/>
       </w:pPr>
       <w:bookmarkStart w:id="53" w:name="_8872f59400eca311bb7b0740442423f0a836d6f"/>
-      <w:bookmarkStart w:id="54" w:name="_Toc242830784"/>
+      <w:bookmarkStart w:id="54" w:name="_Toc243039587"/>
       <w:bookmarkEnd w:id="26"/>
       <w:bookmarkEnd w:id="46"/>
       <w:bookmarkEnd w:id="52"/>
@@ -15484,7 +15636,7 @@
         <w:pStyle w:val="Ttulo1"/>
       </w:pPr>
       <w:bookmarkStart w:id="55" w:name="_11f3dc26fe4f135be80b976bfe46d60e018a5ba"/>
-      <w:bookmarkStart w:id="56" w:name="_Toc242830785"/>
+      <w:bookmarkStart w:id="56" w:name="_Toc243039588"/>
       <w:bookmarkEnd w:id="53"/>
       <w:r>
         <w:lastRenderedPageBreak/>
@@ -15497,7 +15649,7 @@
         <w:pStyle w:val="Ttulo2"/>
       </w:pPr>
       <w:bookmarkStart w:id="57" w:name="_f7580e8bc275eea58d00a0ff871ef60674ed780"/>
-      <w:bookmarkStart w:id="58" w:name="_Toc242830786"/>
+      <w:bookmarkStart w:id="58" w:name="_Toc243039589"/>
       <w:r>
         <w:t>5.1 Casos de uso</w:t>
       </w:r>
@@ -17291,7 +17443,7 @@
         <w:pStyle w:val="Ttulo2"/>
       </w:pPr>
       <w:bookmarkStart w:id="59" w:name="_5580fd549b2ecd3c29ad00fe23a279932ebe402"/>
-      <w:bookmarkStart w:id="60" w:name="_Toc242830787"/>
+      <w:bookmarkStart w:id="60" w:name="_Toc243039590"/>
       <w:bookmarkEnd w:id="57"/>
       <w:r>
         <w:t>5.2 Modelo de datos y diccionario de datos (v2.0)</w:t>
@@ -17508,7 +17660,7 @@
               <w:pStyle w:val="Celda"/>
             </w:pPr>
             <w:r>
-              <w:t>Nodos del grafo clínico. (id_nodo PK, tipo [sintoma/diagnostico/farmaco/especie/raza/condicion], etiqueta)</w:t>
+              <w:t>Conocimiento global. (id_nodo PK, codigo UK, tipo [sintoma/diagnostico/farmaco/especie/raza/condicion/sustancia], etiqueta, activo, version_conocimiento, fuentes, estado_validacion, nivel_triage, alarma_universal, moderado, metadatos, id_especie FK, id_raza FK)</w:t>
             </w:r>
           </w:p>
         </w:tc>
@@ -17539,7 +17691,7 @@
               <w:pStyle w:val="Celda"/>
             </w:pPr>
             <w:r>
-              <w:t>Aristas dirigidas con signo. (id_arista PK, id_origen FK, id_destino FK, tipo_relacion, signo [+/−], peso)</w:t>
+              <w:t>Aristas dirigidas con signo, efecto y condiciones. (id_arista PK, codigo UK, id_origen FK, id_destino FK, tipo_relacion, signo [+/−], peso, efecto, condiciones, fuentes, estado_validacion, activo, version_conocimiento)</w:t>
             </w:r>
           </w:p>
         </w:tc>
@@ -17557,6 +17709,68 @@
               <w:pStyle w:val="Celda"/>
             </w:pPr>
             <w:r>
+              <w:t>grafo_sinonimos</w:t>
+            </w:r>
+          </w:p>
+        </w:tc>
+        <w:tc>
+          <w:tcPr>
+            <w:tcW w:w="2901" w:type="pct"/>
+          </w:tcPr>
+          <w:p>
+            <w:pPr>
+              <w:pStyle w:val="Celda"/>
+            </w:pPr>
+            <w:r>
+              <w:t>Formas de búsqueda por nodo. (id_sinonimo PK, codigo UK, id_nodo FK, texto, normalizado, fuentes, estado_validacion, activo, version_conocimiento)</w:t>
+            </w:r>
+          </w:p>
+        </w:tc>
+      </w:tr>
+      <w:tr>
+        <w:trPr>
+          <w:cantSplit/>
+        </w:trPr>
+        <w:tc>
+          <w:tcPr>
+            <w:tcW w:w="2099" w:type="pct"/>
+          </w:tcPr>
+          <w:p>
+            <w:pPr>
+              <w:pStyle w:val="Celda"/>
+            </w:pPr>
+            <w:r>
+              <w:t>grafo_reglas</w:t>
+            </w:r>
+          </w:p>
+        </w:tc>
+        <w:tc>
+          <w:tcPr>
+            <w:tcW w:w="2901" w:type="pct"/>
+          </w:tcPr>
+          <w:p>
+            <w:pPr>
+              <w:pStyle w:val="Celda"/>
+            </w:pPr>
+            <w:r>
+              <w:t>Condiciones y resultados declarativos por motor, con fuentes y retiro lógico. (id_regla PK, codigo UK, motor, condiciones, resultado, fuentes, estado_validacion, activo, version_conocimiento)</w:t>
+            </w:r>
+          </w:p>
+        </w:tc>
+      </w:tr>
+      <w:tr>
+        <w:trPr>
+          <w:cantSplit/>
+        </w:trPr>
+        <w:tc>
+          <w:tcPr>
+            <w:tcW w:w="2099" w:type="pct"/>
+          </w:tcPr>
+          <w:p>
+            <w:pPr>
+              <w:pStyle w:val="Celda"/>
+            </w:pPr>
+            <w:r>
               <w:t>resenas_veterinario</w:t>
             </w:r>
           </w:p>
@@ -17588,6 +17802,7 @@
               <w:pStyle w:val="Celda"/>
             </w:pPr>
             <w:r>
+              <w:lastRenderedPageBreak/>
               <w:t>usuario_clinica</w:t>
             </w:r>
           </w:p>
@@ -17743,7 +17958,6 @@
               <w:pStyle w:val="Celda"/>
             </w:pPr>
             <w:r>
-              <w:lastRenderedPageBreak/>
               <w:t>plantillas_comunicacion</w:t>
             </w:r>
           </w:p>
@@ -18188,7 +18402,11 @@
         <w:t>horarios_clinica</w:t>
       </w:r>
       <w:r>
-        <w:t xml:space="preserve">, catálogos propios de la clínica y tablas de auditoría; </w:t>
+        <w:t xml:space="preserve">, catálogos propios de la clínica y </w:t>
+      </w:r>
+      <w:r>
+        <w:lastRenderedPageBreak/>
+        <w:t xml:space="preserve">tablas de auditoría; </w:t>
       </w:r>
       <w:r>
         <w:rPr>
@@ -18314,7 +18532,10 @@
         <w:t>tratamientos</w:t>
       </w:r>
       <w:r>
-        <w:t xml:space="preserve"> suma el nodo del fármaco en el Grafo I y sus fechas de inicio y fin, para conocer la medicación vigente; </w:t>
+        <w:t xml:space="preserve"> </w:t>
+      </w:r>
+      <w:r>
+        <w:t xml:space="preserve">suma el nodo del fármaco en el Grafo I y sus fechas de inicio y fin, para conocer la medicación vigente; </w:t>
       </w:r>
       <w:r>
         <w:rPr>
@@ -18368,10 +18589,7 @@
         <w:t>verificaciones_email</w:t>
       </w:r>
       <w:r>
-        <w:t xml:space="preserve"> se ligan a</w:t>
-      </w:r>
-      <w:r>
-        <w:t xml:space="preserve"> </w:t>
+        <w:t xml:space="preserve"> se ligan a </w:t>
       </w:r>
       <w:r>
         <w:rPr>
@@ -18419,7 +18637,6 @@
         <w:t xml:space="preserve"> </w:t>
       </w:r>
       <w:r>
-        <w:lastRenderedPageBreak/>
         <w:t xml:space="preserve">pasa a ser el nivel de triage de 4 niveles; </w:t>
       </w:r>
       <w:r>
@@ -18628,7 +18845,7 @@
         <w:pStyle w:val="Ttulo2"/>
       </w:pPr>
       <w:bookmarkStart w:id="61" w:name="_fbf38eebe414c78cb475c989b20e7851be1b9a4"/>
-      <w:bookmarkStart w:id="62" w:name="_Toc242830788"/>
+      <w:bookmarkStart w:id="62" w:name="_Toc243039591"/>
       <w:bookmarkEnd w:id="59"/>
       <w:r>
         <w:t>5.3 Matriz de trazabilidad (requisito → módulo → verificación)</w:t>
@@ -19598,6 +19815,7 @@
         <w:pStyle w:val="Textodebloque"/>
       </w:pPr>
       <w:r>
+        <w:lastRenderedPageBreak/>
         <w:t xml:space="preserve">La trazabilidad detallada </w:t>
       </w:r>
       <w:r>
@@ -19616,7 +19834,7 @@
         <w:pStyle w:val="Ttulo2"/>
       </w:pPr>
       <w:bookmarkStart w:id="63" w:name="_af48f3c1dcd6ad7c9bf690234a607d52526f60f"/>
-      <w:bookmarkStart w:id="64" w:name="_Toc242830789"/>
+      <w:bookmarkStart w:id="64" w:name="_Toc243039592"/>
       <w:bookmarkEnd w:id="61"/>
       <w:r>
         <w:t>5.4 Criterios de aceptación global</w:t>
@@ -19638,7 +19856,10 @@
         <w:t>v2.0</w:t>
       </w:r>
       <w:r>
-        <w:t xml:space="preserve"> se considera conforme cuando: (a) el 100% de los RF de prioridad Alta asignados a sus historias están implementados y superan su verificación; (b) el 80% o más de los RF de prioridad Media asignados a sus historias están implementados; (c) el </w:t>
+        <w:t xml:space="preserve"> </w:t>
+      </w:r>
+      <w:r>
+        <w:t xml:space="preserve">se considera conforme cuando: (a) el 100% de los RF de prioridad Alta asignados a sus historias están implementados y superan su verificación; (b) el 80% o más de los RF de prioridad Media asignados a sus historias están implementados; (c) el </w:t>
       </w:r>
       <w:r>
         <w:rPr>
@@ -19651,11 +19872,7 @@
         <w:t xml:space="preserve"> </w:t>
       </w:r>
       <w:r>
-        <w:t xml:space="preserve">se verifica sin fugas entre clínicas; (d) los dos grafos (I y II) se demuestran </w:t>
-      </w:r>
-      <w:r>
-        <w:lastRenderedPageBreak/>
-        <w:t xml:space="preserve">funcionando en el flujo de consulta y de agenda; (e) no existen defectos críticos ni mayores sin cerrar; y (f) la documentación técnica (README, ERS, MER y manual) está en el repositorio. La </w:t>
+        <w:t xml:space="preserve">se verifica sin fugas entre clínicas; (d) los dos grafos (I y II) se demuestran funcionando en el flujo de consulta y de agenda; (e) no existen defectos críticos ni mayores sin cerrar; y (f) la documentación técnica (README, ERS, MER y manual) está en el repositorio. La </w:t>
       </w:r>
       <w:r>
         <w:rPr>
@@ -19673,7 +19890,7 @@
         <w:pStyle w:val="Ttulo2"/>
       </w:pPr>
       <w:bookmarkStart w:id="65" w:name="_0d285be43461a565caa5d7afb2af5b21132b4e6"/>
-      <w:bookmarkStart w:id="66" w:name="_Toc242830790"/>
+      <w:bookmarkStart w:id="66" w:name="_Toc243039593"/>
       <w:bookmarkEnd w:id="63"/>
       <w:r>
         <w:t>5.5 Equivalencia de identificadores (Revisión 3.1)</w:t>
@@ -20767,411 +20984,6 @@
               <w:pStyle w:val="Celda"/>
             </w:pPr>
             <w:r>
-              <w:t>RF</w:t>
-            </w:r>
-            <w:r>
-              <w:noBreakHyphen/>
-            </w:r>
-            <w:r>
-              <w:t>13</w:t>
-            </w:r>
-          </w:p>
-        </w:tc>
-        <w:tc>
-          <w:tcPr>
-            <w:tcW w:w="562" w:type="pct"/>
-          </w:tcPr>
-          <w:p>
-            <w:pPr>
-              <w:pStyle w:val="Celda"/>
-            </w:pPr>
-            <w:r>
-              <w:t>RF</w:t>
-            </w:r>
-            <w:r>
-              <w:noBreakHyphen/>
-            </w:r>
-            <w:r>
-              <w:t>3.2</w:t>
-            </w:r>
-          </w:p>
-        </w:tc>
-        <w:tc>
-          <w:tcPr>
-            <w:tcW w:w="337" w:type="pct"/>
-          </w:tcPr>
-          <w:p/>
-        </w:tc>
-        <w:tc>
-          <w:tcPr>
-            <w:tcW w:w="730" w:type="pct"/>
-          </w:tcPr>
-          <w:p>
-            <w:pPr>
-              <w:pStyle w:val="Celda"/>
-            </w:pPr>
-            <w:r>
-              <w:t>RF</w:t>
-            </w:r>
-            <w:r>
-              <w:noBreakHyphen/>
-            </w:r>
-            <w:r>
-              <w:t>56</w:t>
-            </w:r>
-          </w:p>
-        </w:tc>
-        <w:tc>
-          <w:tcPr>
-            <w:tcW w:w="2642" w:type="pct"/>
-          </w:tcPr>
-          <w:p>
-            <w:pPr>
-              <w:pStyle w:val="Celda"/>
-            </w:pPr>
-            <w:r>
-              <w:t>RF-8.6</w:t>
-            </w:r>
-          </w:p>
-        </w:tc>
-      </w:tr>
-      <w:tr>
-        <w:trPr>
-          <w:cantSplit/>
-        </w:trPr>
-        <w:tc>
-          <w:tcPr>
-            <w:tcW w:w="730" w:type="pct"/>
-          </w:tcPr>
-          <w:p>
-            <w:pPr>
-              <w:pStyle w:val="Celda"/>
-            </w:pPr>
-            <w:r>
-              <w:t>RF</w:t>
-            </w:r>
-            <w:r>
-              <w:noBreakHyphen/>
-            </w:r>
-            <w:r>
-              <w:t>15</w:t>
-            </w:r>
-          </w:p>
-        </w:tc>
-        <w:tc>
-          <w:tcPr>
-            <w:tcW w:w="562" w:type="pct"/>
-          </w:tcPr>
-          <w:p>
-            <w:pPr>
-              <w:pStyle w:val="Celda"/>
-            </w:pPr>
-            <w:r>
-              <w:t>RF</w:t>
-            </w:r>
-            <w:r>
-              <w:noBreakHyphen/>
-            </w:r>
-            <w:r>
-              <w:t>3.3</w:t>
-            </w:r>
-          </w:p>
-        </w:tc>
-        <w:tc>
-          <w:tcPr>
-            <w:tcW w:w="337" w:type="pct"/>
-          </w:tcPr>
-          <w:p/>
-        </w:tc>
-        <w:tc>
-          <w:tcPr>
-            <w:tcW w:w="730" w:type="pct"/>
-          </w:tcPr>
-          <w:p>
-            <w:pPr>
-              <w:pStyle w:val="Celda"/>
-            </w:pPr>
-            <w:r>
-              <w:t>RF</w:t>
-            </w:r>
-            <w:r>
-              <w:noBreakHyphen/>
-            </w:r>
-            <w:r>
-              <w:t>57</w:t>
-            </w:r>
-          </w:p>
-        </w:tc>
-        <w:tc>
-          <w:tcPr>
-            <w:tcW w:w="2642" w:type="pct"/>
-          </w:tcPr>
-          <w:p>
-            <w:pPr>
-              <w:pStyle w:val="Celda"/>
-            </w:pPr>
-            <w:r>
-              <w:t>RF-8.7</w:t>
-            </w:r>
-          </w:p>
-        </w:tc>
-      </w:tr>
-      <w:tr>
-        <w:trPr>
-          <w:cantSplit/>
-        </w:trPr>
-        <w:tc>
-          <w:tcPr>
-            <w:tcW w:w="730" w:type="pct"/>
-          </w:tcPr>
-          <w:p>
-            <w:pPr>
-              <w:pStyle w:val="Celda"/>
-            </w:pPr>
-            <w:r>
-              <w:t>RF</w:t>
-            </w:r>
-            <w:r>
-              <w:noBreakHyphen/>
-            </w:r>
-            <w:r>
-              <w:t>16</w:t>
-            </w:r>
-          </w:p>
-        </w:tc>
-        <w:tc>
-          <w:tcPr>
-            <w:tcW w:w="562" w:type="pct"/>
-          </w:tcPr>
-          <w:p>
-            <w:pPr>
-              <w:pStyle w:val="Celda"/>
-            </w:pPr>
-            <w:r>
-              <w:t>RF</w:t>
-            </w:r>
-            <w:r>
-              <w:noBreakHyphen/>
-            </w:r>
-            <w:r>
-              <w:t>3.4</w:t>
-            </w:r>
-          </w:p>
-        </w:tc>
-        <w:tc>
-          <w:tcPr>
-            <w:tcW w:w="337" w:type="pct"/>
-          </w:tcPr>
-          <w:p/>
-        </w:tc>
-        <w:tc>
-          <w:tcPr>
-            <w:tcW w:w="730" w:type="pct"/>
-          </w:tcPr>
-          <w:p>
-            <w:pPr>
-              <w:pStyle w:val="Celda"/>
-            </w:pPr>
-            <w:r>
-              <w:t>RF</w:t>
-            </w:r>
-            <w:r>
-              <w:noBreakHyphen/>
-            </w:r>
-            <w:r>
-              <w:t>58</w:t>
-            </w:r>
-          </w:p>
-        </w:tc>
-        <w:tc>
-          <w:tcPr>
-            <w:tcW w:w="2642" w:type="pct"/>
-          </w:tcPr>
-          <w:p>
-            <w:pPr>
-              <w:pStyle w:val="Celda"/>
-            </w:pPr>
-            <w:r>
-              <w:t>RF-4.8</w:t>
-            </w:r>
-          </w:p>
-        </w:tc>
-      </w:tr>
-      <w:tr>
-        <w:trPr>
-          <w:cantSplit/>
-        </w:trPr>
-        <w:tc>
-          <w:tcPr>
-            <w:tcW w:w="730" w:type="pct"/>
-          </w:tcPr>
-          <w:p>
-            <w:pPr>
-              <w:pStyle w:val="Celda"/>
-            </w:pPr>
-            <w:r>
-              <w:t>RF</w:t>
-            </w:r>
-            <w:r>
-              <w:noBreakHyphen/>
-            </w:r>
-            <w:r>
-              <w:t>17</w:t>
-            </w:r>
-          </w:p>
-        </w:tc>
-        <w:tc>
-          <w:tcPr>
-            <w:tcW w:w="562" w:type="pct"/>
-          </w:tcPr>
-          <w:p>
-            <w:pPr>
-              <w:pStyle w:val="Celda"/>
-            </w:pPr>
-            <w:r>
-              <w:t>RF</w:t>
-            </w:r>
-            <w:r>
-              <w:noBreakHyphen/>
-            </w:r>
-            <w:r>
-              <w:t>4.1</w:t>
-            </w:r>
-          </w:p>
-        </w:tc>
-        <w:tc>
-          <w:tcPr>
-            <w:tcW w:w="337" w:type="pct"/>
-          </w:tcPr>
-          <w:p/>
-        </w:tc>
-        <w:tc>
-          <w:tcPr>
-            <w:tcW w:w="730" w:type="pct"/>
-          </w:tcPr>
-          <w:p>
-            <w:pPr>
-              <w:pStyle w:val="Celda"/>
-            </w:pPr>
-            <w:r>
-              <w:t>RF</w:t>
-            </w:r>
-            <w:r>
-              <w:noBreakHyphen/>
-            </w:r>
-            <w:r>
-              <w:t>59</w:t>
-            </w:r>
-          </w:p>
-        </w:tc>
-        <w:tc>
-          <w:tcPr>
-            <w:tcW w:w="2642" w:type="pct"/>
-          </w:tcPr>
-          <w:p>
-            <w:pPr>
-              <w:pStyle w:val="Celda"/>
-            </w:pPr>
-            <w:r>
-              <w:t>RF-4.9</w:t>
-            </w:r>
-          </w:p>
-        </w:tc>
-      </w:tr>
-      <w:tr>
-        <w:trPr>
-          <w:cantSplit/>
-        </w:trPr>
-        <w:tc>
-          <w:tcPr>
-            <w:tcW w:w="730" w:type="pct"/>
-          </w:tcPr>
-          <w:p>
-            <w:pPr>
-              <w:pStyle w:val="Celda"/>
-            </w:pPr>
-            <w:r>
-              <w:t>RF</w:t>
-            </w:r>
-            <w:r>
-              <w:noBreakHyphen/>
-            </w:r>
-            <w:r>
-              <w:t>18</w:t>
-            </w:r>
-          </w:p>
-        </w:tc>
-        <w:tc>
-          <w:tcPr>
-            <w:tcW w:w="562" w:type="pct"/>
-          </w:tcPr>
-          <w:p>
-            <w:pPr>
-              <w:pStyle w:val="Celda"/>
-            </w:pPr>
-            <w:r>
-              <w:t>RF</w:t>
-            </w:r>
-            <w:r>
-              <w:noBreakHyphen/>
-            </w:r>
-            <w:r>
-              <w:t>4.2</w:t>
-            </w:r>
-          </w:p>
-        </w:tc>
-        <w:tc>
-          <w:tcPr>
-            <w:tcW w:w="337" w:type="pct"/>
-          </w:tcPr>
-          <w:p/>
-        </w:tc>
-        <w:tc>
-          <w:tcPr>
-            <w:tcW w:w="730" w:type="pct"/>
-          </w:tcPr>
-          <w:p>
-            <w:pPr>
-              <w:pStyle w:val="Celda"/>
-            </w:pPr>
-            <w:r>
-              <w:t>RF</w:t>
-            </w:r>
-            <w:r>
-              <w:noBreakHyphen/>
-            </w:r>
-            <w:r>
-              <w:t>60</w:t>
-            </w:r>
-          </w:p>
-        </w:tc>
-        <w:tc>
-          <w:tcPr>
-            <w:tcW w:w="2642" w:type="pct"/>
-          </w:tcPr>
-          <w:p>
-            <w:pPr>
-              <w:pStyle w:val="Celda"/>
-            </w:pPr>
-            <w:r>
-              <w:t>RF-5.3</w:t>
-            </w:r>
-          </w:p>
-        </w:tc>
-      </w:tr>
-      <w:tr>
-        <w:trPr>
-          <w:cantSplit/>
-        </w:trPr>
-        <w:tc>
-          <w:tcPr>
-            <w:tcW w:w="730" w:type="pct"/>
-          </w:tcPr>
-          <w:p>
-            <w:pPr>
-              <w:pStyle w:val="Celda"/>
-            </w:pPr>
-            <w:r>
               <w:lastRenderedPageBreak/>
               <w:t>RF</w:t>
             </w:r>
@@ -21179,6 +20991,411 @@
               <w:noBreakHyphen/>
             </w:r>
             <w:r>
+              <w:t>13</w:t>
+            </w:r>
+          </w:p>
+        </w:tc>
+        <w:tc>
+          <w:tcPr>
+            <w:tcW w:w="562" w:type="pct"/>
+          </w:tcPr>
+          <w:p>
+            <w:pPr>
+              <w:pStyle w:val="Celda"/>
+            </w:pPr>
+            <w:r>
+              <w:t>RF</w:t>
+            </w:r>
+            <w:r>
+              <w:noBreakHyphen/>
+            </w:r>
+            <w:r>
+              <w:t>3.2</w:t>
+            </w:r>
+          </w:p>
+        </w:tc>
+        <w:tc>
+          <w:tcPr>
+            <w:tcW w:w="337" w:type="pct"/>
+          </w:tcPr>
+          <w:p/>
+        </w:tc>
+        <w:tc>
+          <w:tcPr>
+            <w:tcW w:w="730" w:type="pct"/>
+          </w:tcPr>
+          <w:p>
+            <w:pPr>
+              <w:pStyle w:val="Celda"/>
+            </w:pPr>
+            <w:r>
+              <w:t>RF</w:t>
+            </w:r>
+            <w:r>
+              <w:noBreakHyphen/>
+            </w:r>
+            <w:r>
+              <w:t>56</w:t>
+            </w:r>
+          </w:p>
+        </w:tc>
+        <w:tc>
+          <w:tcPr>
+            <w:tcW w:w="2642" w:type="pct"/>
+          </w:tcPr>
+          <w:p>
+            <w:pPr>
+              <w:pStyle w:val="Celda"/>
+            </w:pPr>
+            <w:r>
+              <w:t>RF-8.6</w:t>
+            </w:r>
+          </w:p>
+        </w:tc>
+      </w:tr>
+      <w:tr>
+        <w:trPr>
+          <w:cantSplit/>
+        </w:trPr>
+        <w:tc>
+          <w:tcPr>
+            <w:tcW w:w="730" w:type="pct"/>
+          </w:tcPr>
+          <w:p>
+            <w:pPr>
+              <w:pStyle w:val="Celda"/>
+            </w:pPr>
+            <w:r>
+              <w:t>RF</w:t>
+            </w:r>
+            <w:r>
+              <w:noBreakHyphen/>
+            </w:r>
+            <w:r>
+              <w:t>15</w:t>
+            </w:r>
+          </w:p>
+        </w:tc>
+        <w:tc>
+          <w:tcPr>
+            <w:tcW w:w="562" w:type="pct"/>
+          </w:tcPr>
+          <w:p>
+            <w:pPr>
+              <w:pStyle w:val="Celda"/>
+            </w:pPr>
+            <w:r>
+              <w:t>RF</w:t>
+            </w:r>
+            <w:r>
+              <w:noBreakHyphen/>
+            </w:r>
+            <w:r>
+              <w:t>3.3</w:t>
+            </w:r>
+          </w:p>
+        </w:tc>
+        <w:tc>
+          <w:tcPr>
+            <w:tcW w:w="337" w:type="pct"/>
+          </w:tcPr>
+          <w:p/>
+        </w:tc>
+        <w:tc>
+          <w:tcPr>
+            <w:tcW w:w="730" w:type="pct"/>
+          </w:tcPr>
+          <w:p>
+            <w:pPr>
+              <w:pStyle w:val="Celda"/>
+            </w:pPr>
+            <w:r>
+              <w:t>RF</w:t>
+            </w:r>
+            <w:r>
+              <w:noBreakHyphen/>
+            </w:r>
+            <w:r>
+              <w:t>57</w:t>
+            </w:r>
+          </w:p>
+        </w:tc>
+        <w:tc>
+          <w:tcPr>
+            <w:tcW w:w="2642" w:type="pct"/>
+          </w:tcPr>
+          <w:p>
+            <w:pPr>
+              <w:pStyle w:val="Celda"/>
+            </w:pPr>
+            <w:r>
+              <w:t>RF-8.7</w:t>
+            </w:r>
+          </w:p>
+        </w:tc>
+      </w:tr>
+      <w:tr>
+        <w:trPr>
+          <w:cantSplit/>
+        </w:trPr>
+        <w:tc>
+          <w:tcPr>
+            <w:tcW w:w="730" w:type="pct"/>
+          </w:tcPr>
+          <w:p>
+            <w:pPr>
+              <w:pStyle w:val="Celda"/>
+            </w:pPr>
+            <w:r>
+              <w:t>RF</w:t>
+            </w:r>
+            <w:r>
+              <w:noBreakHyphen/>
+            </w:r>
+            <w:r>
+              <w:t>16</w:t>
+            </w:r>
+          </w:p>
+        </w:tc>
+        <w:tc>
+          <w:tcPr>
+            <w:tcW w:w="562" w:type="pct"/>
+          </w:tcPr>
+          <w:p>
+            <w:pPr>
+              <w:pStyle w:val="Celda"/>
+            </w:pPr>
+            <w:r>
+              <w:t>RF</w:t>
+            </w:r>
+            <w:r>
+              <w:noBreakHyphen/>
+            </w:r>
+            <w:r>
+              <w:t>3.4</w:t>
+            </w:r>
+          </w:p>
+        </w:tc>
+        <w:tc>
+          <w:tcPr>
+            <w:tcW w:w="337" w:type="pct"/>
+          </w:tcPr>
+          <w:p/>
+        </w:tc>
+        <w:tc>
+          <w:tcPr>
+            <w:tcW w:w="730" w:type="pct"/>
+          </w:tcPr>
+          <w:p>
+            <w:pPr>
+              <w:pStyle w:val="Celda"/>
+            </w:pPr>
+            <w:r>
+              <w:t>RF</w:t>
+            </w:r>
+            <w:r>
+              <w:noBreakHyphen/>
+            </w:r>
+            <w:r>
+              <w:t>58</w:t>
+            </w:r>
+          </w:p>
+        </w:tc>
+        <w:tc>
+          <w:tcPr>
+            <w:tcW w:w="2642" w:type="pct"/>
+          </w:tcPr>
+          <w:p>
+            <w:pPr>
+              <w:pStyle w:val="Celda"/>
+            </w:pPr>
+            <w:r>
+              <w:t>RF-4.8</w:t>
+            </w:r>
+          </w:p>
+        </w:tc>
+      </w:tr>
+      <w:tr>
+        <w:trPr>
+          <w:cantSplit/>
+        </w:trPr>
+        <w:tc>
+          <w:tcPr>
+            <w:tcW w:w="730" w:type="pct"/>
+          </w:tcPr>
+          <w:p>
+            <w:pPr>
+              <w:pStyle w:val="Celda"/>
+            </w:pPr>
+            <w:r>
+              <w:t>RF</w:t>
+            </w:r>
+            <w:r>
+              <w:noBreakHyphen/>
+            </w:r>
+            <w:r>
+              <w:t>17</w:t>
+            </w:r>
+          </w:p>
+        </w:tc>
+        <w:tc>
+          <w:tcPr>
+            <w:tcW w:w="562" w:type="pct"/>
+          </w:tcPr>
+          <w:p>
+            <w:pPr>
+              <w:pStyle w:val="Celda"/>
+            </w:pPr>
+            <w:r>
+              <w:t>RF</w:t>
+            </w:r>
+            <w:r>
+              <w:noBreakHyphen/>
+            </w:r>
+            <w:r>
+              <w:t>4.1</w:t>
+            </w:r>
+          </w:p>
+        </w:tc>
+        <w:tc>
+          <w:tcPr>
+            <w:tcW w:w="337" w:type="pct"/>
+          </w:tcPr>
+          <w:p/>
+        </w:tc>
+        <w:tc>
+          <w:tcPr>
+            <w:tcW w:w="730" w:type="pct"/>
+          </w:tcPr>
+          <w:p>
+            <w:pPr>
+              <w:pStyle w:val="Celda"/>
+            </w:pPr>
+            <w:r>
+              <w:t>RF</w:t>
+            </w:r>
+            <w:r>
+              <w:noBreakHyphen/>
+            </w:r>
+            <w:r>
+              <w:t>59</w:t>
+            </w:r>
+          </w:p>
+        </w:tc>
+        <w:tc>
+          <w:tcPr>
+            <w:tcW w:w="2642" w:type="pct"/>
+          </w:tcPr>
+          <w:p>
+            <w:pPr>
+              <w:pStyle w:val="Celda"/>
+            </w:pPr>
+            <w:r>
+              <w:t>RF-4.9</w:t>
+            </w:r>
+          </w:p>
+        </w:tc>
+      </w:tr>
+      <w:tr>
+        <w:trPr>
+          <w:cantSplit/>
+        </w:trPr>
+        <w:tc>
+          <w:tcPr>
+            <w:tcW w:w="730" w:type="pct"/>
+          </w:tcPr>
+          <w:p>
+            <w:pPr>
+              <w:pStyle w:val="Celda"/>
+            </w:pPr>
+            <w:r>
+              <w:t>RF</w:t>
+            </w:r>
+            <w:r>
+              <w:noBreakHyphen/>
+            </w:r>
+            <w:r>
+              <w:t>18</w:t>
+            </w:r>
+          </w:p>
+        </w:tc>
+        <w:tc>
+          <w:tcPr>
+            <w:tcW w:w="562" w:type="pct"/>
+          </w:tcPr>
+          <w:p>
+            <w:pPr>
+              <w:pStyle w:val="Celda"/>
+            </w:pPr>
+            <w:r>
+              <w:t>RF</w:t>
+            </w:r>
+            <w:r>
+              <w:noBreakHyphen/>
+            </w:r>
+            <w:r>
+              <w:t>4.2</w:t>
+            </w:r>
+          </w:p>
+        </w:tc>
+        <w:tc>
+          <w:tcPr>
+            <w:tcW w:w="337" w:type="pct"/>
+          </w:tcPr>
+          <w:p/>
+        </w:tc>
+        <w:tc>
+          <w:tcPr>
+            <w:tcW w:w="730" w:type="pct"/>
+          </w:tcPr>
+          <w:p>
+            <w:pPr>
+              <w:pStyle w:val="Celda"/>
+            </w:pPr>
+            <w:r>
+              <w:t>RF</w:t>
+            </w:r>
+            <w:r>
+              <w:noBreakHyphen/>
+            </w:r>
+            <w:r>
+              <w:t>60</w:t>
+            </w:r>
+          </w:p>
+        </w:tc>
+        <w:tc>
+          <w:tcPr>
+            <w:tcW w:w="2642" w:type="pct"/>
+          </w:tcPr>
+          <w:p>
+            <w:pPr>
+              <w:pStyle w:val="Celda"/>
+            </w:pPr>
+            <w:r>
+              <w:t>RF-5.3</w:t>
+            </w:r>
+          </w:p>
+        </w:tc>
+      </w:tr>
+      <w:tr>
+        <w:trPr>
+          <w:cantSplit/>
+        </w:trPr>
+        <w:tc>
+          <w:tcPr>
+            <w:tcW w:w="730" w:type="pct"/>
+          </w:tcPr>
+          <w:p>
+            <w:pPr>
+              <w:pStyle w:val="Celda"/>
+            </w:pPr>
+            <w:r>
+              <w:t>RF</w:t>
+            </w:r>
+            <w:r>
+              <w:noBreakHyphen/>
+            </w:r>
+            <w:r>
               <w:t>19</w:t>
             </w:r>
           </w:p>
@@ -22631,6 +22848,7 @@
               <w:pStyle w:val="Celda"/>
             </w:pPr>
             <w:r>
+              <w:lastRenderedPageBreak/>
               <w:t>RF</w:t>
             </w:r>
             <w:r>
@@ -22943,7 +23161,6 @@
         <w:pStyle w:val="Rotulo"/>
       </w:pPr>
       <w:r>
-        <w:lastRenderedPageBreak/>
         <w:t>Tabla 27</w:t>
       </w:r>
     </w:p>
@@ -24006,7 +24223,7 @@
               <w:noProof/>
             </w:rPr>
             <w:drawing>
-              <wp:inline distT="0" distB="0" distL="0" distR="0" wp14:anchorId="10970B17" wp14:editId="10970B18">
+              <wp:inline distT="0" distB="0" distL="0" distR="0" wp14:anchorId="510D88C4" wp14:editId="510D88C5">
                 <wp:extent cx="324000" cy="324000"/>
                 <wp:effectExtent l="0" t="0" r="0" b="0"/>
                 <wp:docPr id="9001" name="Logo Zooki"/>
@@ -24100,7 +24317,7 @@
               <w:sz w:val="17"/>
               <w:szCs w:val="17"/>
             </w:rPr>
-            <w:t>Rev. 3.4</w:t>
+            <w:t>Rev. 3.5</w:t>
           </w:r>
         </w:p>
         <w:p>
@@ -24173,7 +24390,7 @@
   <w:abstractNum w:abstractNumId="0" w15:restartNumberingAfterBreak="0">
     <w:nsid w:val="0000A990"/>
     <w:multiLevelType w:val="multilevel"/>
-    <w:tmpl w:val="193A0458"/>
+    <w:tmpl w:val="1C9AC2F6"/>
     <w:lvl w:ilvl="0">
       <w:numFmt w:val="bullet"/>
       <w:lvlText w:val=" "/>
@@ -24250,7 +24467,7 @@
   <w:abstractNum w:abstractNumId="1" w15:restartNumberingAfterBreak="0">
     <w:nsid w:val="0000A991"/>
     <w:multiLevelType w:val="multilevel"/>
-    <w:tmpl w:val="3EFE22C0"/>
+    <w:tmpl w:val="C3DEAAC6"/>
     <w:lvl w:ilvl="0">
       <w:numFmt w:val="bullet"/>
       <w:lvlText w:val=""/>
@@ -24351,22 +24568,22 @@
       </w:rPr>
     </w:lvl>
   </w:abstractNum>
-  <w:num w:numId="1" w16cid:durableId="1835418199">
+  <w:num w:numId="1" w16cid:durableId="1431076208">
     <w:abstractNumId w:val="0"/>
   </w:num>
-  <w:num w:numId="2" w16cid:durableId="1534423190">
+  <w:num w:numId="2" w16cid:durableId="2089305851">
     <w:abstractNumId w:val="1"/>
   </w:num>
-  <w:num w:numId="3" w16cid:durableId="1348360897">
+  <w:num w:numId="3" w16cid:durableId="1144933261">
     <w:abstractNumId w:val="1"/>
   </w:num>
-  <w:num w:numId="4" w16cid:durableId="572352942">
+  <w:num w:numId="4" w16cid:durableId="1692756352">
     <w:abstractNumId w:val="1"/>
   </w:num>
-  <w:num w:numId="5" w16cid:durableId="817964640">
+  <w:num w:numId="5" w16cid:durableId="963316910">
     <w:abstractNumId w:val="1"/>
   </w:num>
-  <w:num w:numId="6" w16cid:durableId="353574753">
+  <w:num w:numId="6" w16cid:durableId="1490246357">
     <w:abstractNumId w:val="1"/>
   </w:num>
 </w:numbering>

</xml_diff>

<commit_message>
docs(release): v2.1.0 con Inicio del administrador y suscripcion con Wompi; revision de S4 (HU-6.2, HU-0.5)
</commit_message>
<xml_diff>
--- a/public/docs/descargas/ers.docx
+++ b/public/docs/descargas/ers.docx
@@ -21,7 +21,7 @@
         <w:pStyle w:val="PortadaProyecto"/>
       </w:pPr>
       <w:r>
-        <w:t>Proyecto: Zooki v2.0</w:t>
+        <w:t>Proyecto: Zooki v2.1</w:t>
       </w:r>
     </w:p>
     <w:p>
@@ -29,7 +29,7 @@
         <w:pStyle w:val="PortadaRevision"/>
       </w:pPr>
       <w:r>
-        <w:t>Revisión 3.6 · ISO/IEC/IEEE 29148:2018</w:t>
+        <w:t>Revisión 3.7 · ISO/IEC/IEEE 29148:2018</w:t>
       </w:r>
     </w:p>
     <w:p>
@@ -93,7 +93,7 @@
           <w:noProof/>
         </w:rPr>
         <w:drawing>
-          <wp:inline distT="0" distB="0" distL="0" distR="0" wp14:anchorId="55595945" wp14:editId="55595946">
+          <wp:inline distT="0" distB="0" distL="0" distR="0" wp14:anchorId="284607B5" wp14:editId="284607B6">
             <wp:extent cx="395999" cy="405503"/>
             <wp:effectExtent l="0" t="0" r="0" b="0"/>
             <wp:docPr id="10" name="Picture"/>
@@ -791,6 +791,7 @@
           <w:p>
             <w:pPr>
               <w:pStyle w:val="Celda"/>
+              <w:keepNext/>
             </w:pPr>
             <w:r>
               <w:t>23/10/2026</w:t>
@@ -804,9 +805,69 @@
           <w:p>
             <w:pPr>
               <w:pStyle w:val="Celda"/>
+              <w:keepNext/>
             </w:pPr>
             <w:r>
               <w:t>3.6</w:t>
+            </w:r>
+          </w:p>
+        </w:tc>
+        <w:tc>
+          <w:tcPr>
+            <w:tcW w:w="1623" w:type="pct"/>
+          </w:tcPr>
+          <w:p>
+            <w:pPr>
+              <w:pStyle w:val="Celda"/>
+              <w:keepNext/>
+            </w:pPr>
+            <w:r>
+              <w:t>ISO/IEC/IEEE 29148:2018</w:t>
+            </w:r>
+          </w:p>
+        </w:tc>
+        <w:tc>
+          <w:tcPr>
+            <w:tcW w:w="1948" w:type="pct"/>
+          </w:tcPr>
+          <w:p>
+            <w:pPr>
+              <w:pStyle w:val="Celda"/>
+              <w:keepNext/>
+            </w:pPr>
+            <w:r>
+              <w:t>Juan Sebastián Carvajal Home</w:t>
+            </w:r>
+          </w:p>
+        </w:tc>
+      </w:tr>
+      <w:tr>
+        <w:trPr>
+          <w:cantSplit/>
+        </w:trPr>
+        <w:tc>
+          <w:tcPr>
+            <w:tcW w:w="779" w:type="pct"/>
+          </w:tcPr>
+          <w:p>
+            <w:pPr>
+              <w:pStyle w:val="Celda"/>
+            </w:pPr>
+            <w:r>
+              <w:t>25/10/2026</w:t>
+            </w:r>
+          </w:p>
+        </w:tc>
+        <w:tc>
+          <w:tcPr>
+            <w:tcW w:w="649" w:type="pct"/>
+          </w:tcPr>
+          <w:p>
+            <w:pPr>
+              <w:pStyle w:val="Celda"/>
+            </w:pPr>
+            <w:r>
+              <w:t>3.7</w:t>
             </w:r>
           </w:p>
         </w:tc>
@@ -986,7 +1047,7 @@
       <w:r>
         <w:fldChar w:fldCharType="separate"/>
       </w:r>
-      <w:hyperlink w:anchor="_Toc243683898" w:history="1">
+      <w:hyperlink w:anchor="_Toc243862750" w:history="1">
         <w:r>
           <w:rPr>
             <w:rStyle w:val="Hipervnculo"/>
@@ -1013,7 +1074,7 @@
             <w:noProof/>
             <w:webHidden/>
           </w:rPr>
-          <w:instrText xml:space="preserve"> PAGEREF _Toc243683898 \h </w:instrText>
+          <w:instrText xml:space="preserve"> PAGEREF _Toc243862750 \h </w:instrText>
         </w:r>
         <w:r>
           <w:rPr>
@@ -1056,7 +1117,7 @@
           <w14:ligatures w14:val="standardContextual"/>
         </w:rPr>
       </w:pPr>
-      <w:hyperlink w:anchor="_Toc243683899" w:history="1">
+      <w:hyperlink w:anchor="_Toc243862751" w:history="1">
         <w:r>
           <w:rPr>
             <w:rStyle w:val="Hipervnculo"/>
@@ -1083,7 +1144,7 @@
             <w:noProof/>
             <w:webHidden/>
           </w:rPr>
-          <w:instrText xml:space="preserve"> PAGEREF _Toc243683899 \h </w:instrText>
+          <w:instrText xml:space="preserve"> PAGEREF _Toc243862751 \h </w:instrText>
         </w:r>
         <w:r>
           <w:rPr>
@@ -1126,7 +1187,7 @@
           <w14:ligatures w14:val="standardContextual"/>
         </w:rPr>
       </w:pPr>
-      <w:hyperlink w:anchor="_Toc243683900" w:history="1">
+      <w:hyperlink w:anchor="_Toc243862752" w:history="1">
         <w:r>
           <w:rPr>
             <w:rStyle w:val="Hipervnculo"/>
@@ -1153,7 +1214,7 @@
             <w:noProof/>
             <w:webHidden/>
           </w:rPr>
-          <w:instrText xml:space="preserve"> PAGEREF _Toc243683900 \h </w:instrText>
+          <w:instrText xml:space="preserve"> PAGEREF _Toc243862752 \h </w:instrText>
         </w:r>
         <w:r>
           <w:rPr>
@@ -1196,7 +1257,7 @@
           <w14:ligatures w14:val="standardContextual"/>
         </w:rPr>
       </w:pPr>
-      <w:hyperlink w:anchor="_Toc243683901" w:history="1">
+      <w:hyperlink w:anchor="_Toc243862753" w:history="1">
         <w:r>
           <w:rPr>
             <w:rStyle w:val="Hipervnculo"/>
@@ -1223,7 +1284,7 @@
             <w:noProof/>
             <w:webHidden/>
           </w:rPr>
-          <w:instrText xml:space="preserve"> PAGEREF _Toc243683901 \h </w:instrText>
+          <w:instrText xml:space="preserve"> PAGEREF _Toc243862753 \h </w:instrText>
         </w:r>
         <w:r>
           <w:rPr>
@@ -1266,7 +1327,7 @@
           <w14:ligatures w14:val="standardContextual"/>
         </w:rPr>
       </w:pPr>
-      <w:hyperlink w:anchor="_Toc243683902" w:history="1">
+      <w:hyperlink w:anchor="_Toc243862754" w:history="1">
         <w:r>
           <w:rPr>
             <w:rStyle w:val="Hipervnculo"/>
@@ -1293,7 +1354,7 @@
             <w:noProof/>
             <w:webHidden/>
           </w:rPr>
-          <w:instrText xml:space="preserve"> PAGEREF _Toc243683902 \h </w:instrText>
+          <w:instrText xml:space="preserve"> PAGEREF _Toc243862754 \h </w:instrText>
         </w:r>
         <w:r>
           <w:rPr>
@@ -1336,7 +1397,7 @@
           <w14:ligatures w14:val="standardContextual"/>
         </w:rPr>
       </w:pPr>
-      <w:hyperlink w:anchor="_Toc243683903" w:history="1">
+      <w:hyperlink w:anchor="_Toc243862755" w:history="1">
         <w:r>
           <w:rPr>
             <w:rStyle w:val="Hipervnculo"/>
@@ -1363,7 +1424,7 @@
             <w:noProof/>
             <w:webHidden/>
           </w:rPr>
-          <w:instrText xml:space="preserve"> PAGEREF _Toc243683903 \h </w:instrText>
+          <w:instrText xml:space="preserve"> PAGEREF _Toc243862755 \h </w:instrText>
         </w:r>
         <w:r>
           <w:rPr>
@@ -1409,7 +1470,7 @@
           <w14:ligatures w14:val="standardContextual"/>
         </w:rPr>
       </w:pPr>
-      <w:hyperlink w:anchor="_Toc243683904" w:history="1">
+      <w:hyperlink w:anchor="_Toc243862756" w:history="1">
         <w:r>
           <w:rPr>
             <w:rStyle w:val="Hipervnculo"/>
@@ -1436,7 +1497,7 @@
             <w:noProof/>
             <w:webHidden/>
           </w:rPr>
-          <w:instrText xml:space="preserve"> PAGEREF _Toc243683904 \h </w:instrText>
+          <w:instrText xml:space="preserve"> PAGEREF _Toc243862756 \h </w:instrText>
         </w:r>
         <w:r>
           <w:rPr>
@@ -1479,7 +1540,7 @@
           <w14:ligatures w14:val="standardContextual"/>
         </w:rPr>
       </w:pPr>
-      <w:hyperlink w:anchor="_Toc243683905" w:history="1">
+      <w:hyperlink w:anchor="_Toc243862757" w:history="1">
         <w:r>
           <w:rPr>
             <w:rStyle w:val="Hipervnculo"/>
@@ -1506,7 +1567,7 @@
             <w:noProof/>
             <w:webHidden/>
           </w:rPr>
-          <w:instrText xml:space="preserve"> PAGEREF _Toc243683905 \h </w:instrText>
+          <w:instrText xml:space="preserve"> PAGEREF _Toc243862757 \h </w:instrText>
         </w:r>
         <w:r>
           <w:rPr>
@@ -1549,7 +1610,7 @@
           <w14:ligatures w14:val="standardContextual"/>
         </w:rPr>
       </w:pPr>
-      <w:hyperlink w:anchor="_Toc243683906" w:history="1">
+      <w:hyperlink w:anchor="_Toc243862758" w:history="1">
         <w:r>
           <w:rPr>
             <w:rStyle w:val="Hipervnculo"/>
@@ -1576,7 +1637,7 @@
             <w:noProof/>
             <w:webHidden/>
           </w:rPr>
-          <w:instrText xml:space="preserve"> PAGEREF _Toc243683906 \h </w:instrText>
+          <w:instrText xml:space="preserve"> PAGEREF _Toc243862758 \h </w:instrText>
         </w:r>
         <w:r>
           <w:rPr>
@@ -1619,7 +1680,7 @@
           <w14:ligatures w14:val="standardContextual"/>
         </w:rPr>
       </w:pPr>
-      <w:hyperlink w:anchor="_Toc243683907" w:history="1">
+      <w:hyperlink w:anchor="_Toc243862759" w:history="1">
         <w:r>
           <w:rPr>
             <w:rStyle w:val="Hipervnculo"/>
@@ -1646,7 +1707,7 @@
             <w:noProof/>
             <w:webHidden/>
           </w:rPr>
-          <w:instrText xml:space="preserve"> PAGEREF _Toc243683907 \h </w:instrText>
+          <w:instrText xml:space="preserve"> PAGEREF _Toc243862759 \h </w:instrText>
         </w:r>
         <w:r>
           <w:rPr>
@@ -1689,7 +1750,7 @@
           <w14:ligatures w14:val="standardContextual"/>
         </w:rPr>
       </w:pPr>
-      <w:hyperlink w:anchor="_Toc243683908" w:history="1">
+      <w:hyperlink w:anchor="_Toc243862760" w:history="1">
         <w:r>
           <w:rPr>
             <w:rStyle w:val="Hipervnculo"/>
@@ -1716,7 +1777,7 @@
             <w:noProof/>
             <w:webHidden/>
           </w:rPr>
-          <w:instrText xml:space="preserve"> PAGEREF _Toc243683908 \h </w:instrText>
+          <w:instrText xml:space="preserve"> PAGEREF _Toc243862760 \h </w:instrText>
         </w:r>
         <w:r>
           <w:rPr>
@@ -1759,7 +1820,7 @@
           <w14:ligatures w14:val="standardContextual"/>
         </w:rPr>
       </w:pPr>
-      <w:hyperlink w:anchor="_Toc243683909" w:history="1">
+      <w:hyperlink w:anchor="_Toc243862761" w:history="1">
         <w:r>
           <w:rPr>
             <w:rStyle w:val="Hipervnculo"/>
@@ -1786,7 +1847,7 @@
             <w:noProof/>
             <w:webHidden/>
           </w:rPr>
-          <w:instrText xml:space="preserve"> PAGEREF _Toc243683909 \h </w:instrText>
+          <w:instrText xml:space="preserve"> PAGEREF _Toc243862761 \h </w:instrText>
         </w:r>
         <w:r>
           <w:rPr>
@@ -1829,7 +1890,7 @@
           <w14:ligatures w14:val="standardContextual"/>
         </w:rPr>
       </w:pPr>
-      <w:hyperlink w:anchor="_Toc243683910" w:history="1">
+      <w:hyperlink w:anchor="_Toc243862762" w:history="1">
         <w:r>
           <w:rPr>
             <w:rStyle w:val="Hipervnculo"/>
@@ -1856,7 +1917,7 @@
             <w:noProof/>
             <w:webHidden/>
           </w:rPr>
-          <w:instrText xml:space="preserve"> PAGEREF _Toc243683910 \h </w:instrText>
+          <w:instrText xml:space="preserve"> PAGEREF _Toc243862762 \h </w:instrText>
         </w:r>
         <w:r>
           <w:rPr>
@@ -1902,7 +1963,7 @@
           <w14:ligatures w14:val="standardContextual"/>
         </w:rPr>
       </w:pPr>
-      <w:hyperlink w:anchor="_Toc243683911" w:history="1">
+      <w:hyperlink w:anchor="_Toc243862763" w:history="1">
         <w:r>
           <w:rPr>
             <w:rStyle w:val="Hipervnculo"/>
@@ -1929,7 +1990,7 @@
             <w:noProof/>
             <w:webHidden/>
           </w:rPr>
-          <w:instrText xml:space="preserve"> PAGEREF _Toc243683911 \h </w:instrText>
+          <w:instrText xml:space="preserve"> PAGEREF _Toc243862763 \h </w:instrText>
         </w:r>
         <w:r>
           <w:rPr>
@@ -1972,7 +2033,7 @@
           <w14:ligatures w14:val="standardContextual"/>
         </w:rPr>
       </w:pPr>
-      <w:hyperlink w:anchor="_Toc243683912" w:history="1">
+      <w:hyperlink w:anchor="_Toc243862764" w:history="1">
         <w:r>
           <w:rPr>
             <w:rStyle w:val="Hipervnculo"/>
@@ -1999,7 +2060,7 @@
             <w:noProof/>
             <w:webHidden/>
           </w:rPr>
-          <w:instrText xml:space="preserve"> PAGEREF _Toc243683912 \h </w:instrText>
+          <w:instrText xml:space="preserve"> PAGEREF _Toc243862764 \h </w:instrText>
         </w:r>
         <w:r>
           <w:rPr>
@@ -2042,7 +2103,7 @@
           <w14:ligatures w14:val="standardContextual"/>
         </w:rPr>
       </w:pPr>
-      <w:hyperlink w:anchor="_Toc243683913" w:history="1">
+      <w:hyperlink w:anchor="_Toc243862765" w:history="1">
         <w:r>
           <w:rPr>
             <w:rStyle w:val="Hipervnculo"/>
@@ -2069,7 +2130,7 @@
             <w:noProof/>
             <w:webHidden/>
           </w:rPr>
-          <w:instrText xml:space="preserve"> PAGEREF _Toc243683913 \h </w:instrText>
+          <w:instrText xml:space="preserve"> PAGEREF _Toc243862765 \h </w:instrText>
         </w:r>
         <w:r>
           <w:rPr>
@@ -2112,7 +2173,7 @@
           <w14:ligatures w14:val="standardContextual"/>
         </w:rPr>
       </w:pPr>
-      <w:hyperlink w:anchor="_Toc243683914" w:history="1">
+      <w:hyperlink w:anchor="_Toc243862766" w:history="1">
         <w:r>
           <w:rPr>
             <w:rStyle w:val="Hipervnculo"/>
@@ -2139,7 +2200,7 @@
             <w:noProof/>
             <w:webHidden/>
           </w:rPr>
-          <w:instrText xml:space="preserve"> PAGEREF _Toc243683914 \h </w:instrText>
+          <w:instrText xml:space="preserve"> PAGEREF _Toc243862766 \h </w:instrText>
         </w:r>
         <w:r>
           <w:rPr>
@@ -2185,7 +2246,7 @@
           <w14:ligatures w14:val="standardContextual"/>
         </w:rPr>
       </w:pPr>
-      <w:hyperlink w:anchor="_Toc243683915" w:history="1">
+      <w:hyperlink w:anchor="_Toc243862767" w:history="1">
         <w:r>
           <w:rPr>
             <w:rStyle w:val="Hipervnculo"/>
@@ -2212,7 +2273,7 @@
             <w:noProof/>
             <w:webHidden/>
           </w:rPr>
-          <w:instrText xml:space="preserve"> PAGEREF _Toc243683915 \h </w:instrText>
+          <w:instrText xml:space="preserve"> PAGEREF _Toc243862767 \h </w:instrText>
         </w:r>
         <w:r>
           <w:rPr>
@@ -2258,7 +2319,7 @@
           <w14:ligatures w14:val="standardContextual"/>
         </w:rPr>
       </w:pPr>
-      <w:hyperlink w:anchor="_Toc243683916" w:history="1">
+      <w:hyperlink w:anchor="_Toc243862768" w:history="1">
         <w:r>
           <w:rPr>
             <w:rStyle w:val="Hipervnculo"/>
@@ -2285,7 +2346,7 @@
             <w:noProof/>
             <w:webHidden/>
           </w:rPr>
-          <w:instrText xml:space="preserve"> PAGEREF _Toc243683916 \h </w:instrText>
+          <w:instrText xml:space="preserve"> PAGEREF _Toc243862768 \h </w:instrText>
         </w:r>
         <w:r>
           <w:rPr>
@@ -2328,7 +2389,7 @@
           <w14:ligatures w14:val="standardContextual"/>
         </w:rPr>
       </w:pPr>
-      <w:hyperlink w:anchor="_Toc243683917" w:history="1">
+      <w:hyperlink w:anchor="_Toc243862769" w:history="1">
         <w:r>
           <w:rPr>
             <w:rStyle w:val="Hipervnculo"/>
@@ -2355,7 +2416,7 @@
             <w:noProof/>
             <w:webHidden/>
           </w:rPr>
-          <w:instrText xml:space="preserve"> PAGEREF _Toc243683917 \h </w:instrText>
+          <w:instrText xml:space="preserve"> PAGEREF _Toc243862769 \h </w:instrText>
         </w:r>
         <w:r>
           <w:rPr>
@@ -2398,7 +2459,7 @@
           <w14:ligatures w14:val="standardContextual"/>
         </w:rPr>
       </w:pPr>
-      <w:hyperlink w:anchor="_Toc243683918" w:history="1">
+      <w:hyperlink w:anchor="_Toc243862770" w:history="1">
         <w:r>
           <w:rPr>
             <w:rStyle w:val="Hipervnculo"/>
@@ -2425,7 +2486,7 @@
             <w:noProof/>
             <w:webHidden/>
           </w:rPr>
-          <w:instrText xml:space="preserve"> PAGEREF _Toc243683918 \h </w:instrText>
+          <w:instrText xml:space="preserve"> PAGEREF _Toc243862770 \h </w:instrText>
         </w:r>
         <w:r>
           <w:rPr>
@@ -2468,7 +2529,7 @@
           <w14:ligatures w14:val="standardContextual"/>
         </w:rPr>
       </w:pPr>
-      <w:hyperlink w:anchor="_Toc243683919" w:history="1">
+      <w:hyperlink w:anchor="_Toc243862771" w:history="1">
         <w:r>
           <w:rPr>
             <w:rStyle w:val="Hipervnculo"/>
@@ -2495,7 +2556,7 @@
             <w:noProof/>
             <w:webHidden/>
           </w:rPr>
-          <w:instrText xml:space="preserve"> PAGEREF _Toc243683919 \h </w:instrText>
+          <w:instrText xml:space="preserve"> PAGEREF _Toc243862771 \h </w:instrText>
         </w:r>
         <w:r>
           <w:rPr>
@@ -2538,7 +2599,7 @@
           <w14:ligatures w14:val="standardContextual"/>
         </w:rPr>
       </w:pPr>
-      <w:hyperlink w:anchor="_Toc243683920" w:history="1">
+      <w:hyperlink w:anchor="_Toc243862772" w:history="1">
         <w:r>
           <w:rPr>
             <w:rStyle w:val="Hipervnculo"/>
@@ -2565,7 +2626,7 @@
             <w:noProof/>
             <w:webHidden/>
           </w:rPr>
-          <w:instrText xml:space="preserve"> PAGEREF _Toc243683920 \h </w:instrText>
+          <w:instrText xml:space="preserve"> PAGEREF _Toc243862772 \h </w:instrText>
         </w:r>
         <w:r>
           <w:rPr>
@@ -2608,7 +2669,7 @@
           <w14:ligatures w14:val="standardContextual"/>
         </w:rPr>
       </w:pPr>
-      <w:hyperlink w:anchor="_Toc243683921" w:history="1">
+      <w:hyperlink w:anchor="_Toc243862773" w:history="1">
         <w:r>
           <w:rPr>
             <w:rStyle w:val="Hipervnculo"/>
@@ -2635,7 +2696,7 @@
             <w:noProof/>
             <w:webHidden/>
           </w:rPr>
-          <w:instrText xml:space="preserve"> PAGEREF _Toc243683921 \h </w:instrText>
+          <w:instrText xml:space="preserve"> PAGEREF _Toc243862773 \h </w:instrText>
         </w:r>
         <w:r>
           <w:rPr>
@@ -2655,7 +2716,7 @@
             <w:noProof/>
             <w:webHidden/>
           </w:rPr>
-          <w:t>34</w:t>
+          <w:t>35</w:t>
         </w:r>
         <w:r>
           <w:rPr>
@@ -2681,7 +2742,7 @@
     </w:p>
     <w:p>
       <w:pPr>
-        <w:pStyle w:val="FirstParagraph"/>
+        <w:pStyle w:val="Textodebloque"/>
       </w:pPr>
       <w:r>
         <w:rPr>
@@ -2689,13 +2750,25 @@
           <w:bCs/>
         </w:rPr>
         <w:lastRenderedPageBreak/>
+        <w:t>Cierre M0-S — 2026-10-25:</w:t>
+      </w:r>
+      <w:r>
+        <w:t xml:space="preserve"> versión 2.1.0 preparada para revisión e integración; HU-0.5 implementada, 96 HU, 464 RE, 126 RN y 65 tablas. Migraciones 12/13, Inicio del administrador (HU-6.2) y panel financiero de plataforma. D8/D10 pendientes antes de dinero real.</w:t>
+      </w:r>
+    </w:p>
+    <w:p>
+      <w:pPr>
+        <w:pStyle w:val="FirstParagraph"/>
+      </w:pPr>
+      <w:r>
+        <w:rPr>
+          <w:b/>
+          <w:bCs/>
+        </w:rPr>
         <w:t>Historial.</w:t>
       </w:r>
       <w:r>
-        <w:t xml:space="preserve"> </w:t>
-      </w:r>
-      <w:r>
-        <w:t xml:space="preserve">Las revisiones 1.0–2.1 documentaron el producto de instalación única hasta la versión estable </w:t>
+        <w:t xml:space="preserve"> Las revisiones 1.0–2.1 documentaron el producto de instalación única hasta la versión estable </w:t>
       </w:r>
       <w:r>
         <w:rPr>
@@ -2783,16 +2856,7 @@
         <w:t>id_usuario</w:t>
       </w:r>
       <w:r>
-        <w:t xml:space="preserve"> </w:t>
-      </w:r>
-      <w:r>
-        <w:t>numérico como clave (§5.2); especifica el cálculo del triage y la agenda inteligente completa (RF-2.12, RF-4.11 a RF-4.15, RF-7.5); protege el registro de clínicas, el carnet QR y la reputación (RF-0.3, RF-5.7, RF-5.8, RF-8.3); fija los límites del plan gratuito, el comportamiento al bajar de plan y la excepción de las urgencias (RF-0.4 a RF-0.6); agrega el derecho de supresión, el dashboard y la página pública (RF-5.9, RF-6.1, RF-6.2, RF-9.1); endurece la sesión (RNF-12 a RNF-15); completa el modelo de dat</w:t>
-      </w:r>
-      <w:r>
-        <w:t>os (§5.2) y registra las capas avanzadas del plan profesional como requisito futuro (RF-F.8). La</w:t>
-      </w:r>
-      <w:r>
-        <w:t xml:space="preserve"> </w:t>
+        <w:t xml:space="preserve"> numérico como clave (§5.2); especifica el cálculo del triage y la agenda inteligente completa (RF-2.12, RF-4.11 a RF-4.15, RF-7.5); protege el registro de clínicas, el carnet QR y la reputación (RF-0.3, RF-5.7, RF-5.8, RF-8.3); fija los límites del plan gratuito, el comportamiento al bajar de plan y la excepción de las urgencias (RF-0.4 a RF-0.6); agrega el derecho de supresión, el dashboard y la página pública (RF-5.9, RF-6.1, RF-6.2, RF-9.1); endurece la sesión (RNF-12 a RNF-15); completa el modelo de datos (§5.2) y registra las capas avanzadas del plan profesional como requisito futuro (RF-F.8). La </w:t>
       </w:r>
       <w:r>
         <w:rPr>
@@ -2802,16 +2866,7 @@
         <w:t>revisión 3.2</w:t>
       </w:r>
       <w:r>
-        <w:t xml:space="preserve"> </w:t>
-      </w:r>
-      <w:r>
-        <w:t>corrige las incoherencias detectadas al preparar la construcción: el alcance se reparte entre las entregas v2.0 y v2.1 y los criterios de aceptación se evalúan por entrega (§5.4); el aislamiento declara sus excepciones globales y la alerta genérica de interacción con medicación protegida de otra clínica (RNF-11); la urgencia presencial sin identidad verificada usa una ficha provisional (RF-4.10); entre sobrecupos naranja rige el orden de llegada (RF-4.7); y las ausencias del veterinario se registran por fec</w:t>
-      </w:r>
-      <w:r>
-        <w:t>ha y hora (§5.2). La</w:t>
-      </w:r>
-      <w:r>
-        <w:t xml:space="preserve"> </w:t>
+        <w:t xml:space="preserve"> corrige las incoherencias detectadas al preparar la construcción: el alcance se reparte entre las entregas v2.0 y v2.1 y los criterios de aceptación se evalúan por entrega (§5.4); el aislamiento declara sus excepciones globales y la alerta genérica de interacción con medicación protegida de otra clínica (RNF-11); la urgencia presencial sin identidad verificada usa una ficha provisional (RF-4.10); entre sobrecupos naranja rige el orden de llegada (RF-4.7); y las ausencias del veterinario se registran por fecha y hora (§5.2). La </w:t>
       </w:r>
       <w:r>
         <w:rPr>
@@ -2841,10 +2896,7 @@
         <w:t>revisión 3.4</w:t>
       </w:r>
       <w:r>
-        <w:t xml:space="preserve"> </w:t>
-      </w:r>
-      <w:r>
-        <w:t xml:space="preserve">(14 de octubre de 2026) acompaña la versión </w:t>
+        <w:t xml:space="preserve"> (14 de octubre de 2026) acompaña la versión </w:t>
       </w:r>
       <w:r>
         <w:rPr>
@@ -2878,10 +2930,7 @@
         <w:t>schema_migraciones</w:t>
       </w:r>
       <w:r>
-        <w:t xml:space="preserve"> </w:t>
-      </w:r>
-      <w:r>
-        <w:t>es una tabla técnica adicional del migrador. Se completan síntomas, sugerencias, prescripción, alergias y mapa; el triage operativo sigue en M4. Validación veterinaria del conocimiento pendiente.</w:t>
+        <w:t xml:space="preserve"> es una tabla técnica adicional del migrador. Se completan síntomas, sugerencias, prescripción, alergias y mapa; el triage operativo sigue en M4. Validación veterinaria del conocimiento pendiente.</w:t>
       </w:r>
     </w:p>
     <w:p>
@@ -2893,6 +2942,7 @@
           <w:b/>
           <w:bCs/>
         </w:rPr>
+        <w:lastRenderedPageBreak/>
         <w:t>Preparación M4/B2 — 2026-10-18:</w:t>
       </w:r>
       <w:r>
@@ -2908,7 +2958,6 @@
           <w:b/>
           <w:bCs/>
         </w:rPr>
-        <w:lastRenderedPageBreak/>
         <w:t>Cierre 2.0.0 (23 de octubre de 2026):</w:t>
       </w:r>
       <w:r>
@@ -2927,10 +2976,7 @@
         <w:t>Salvedad confirmada por el dueño (23/10/2026):</w:t>
       </w:r>
       <w:r>
-        <w:t xml:space="preserve"> </w:t>
-      </w:r>
-      <w:r>
-        <w:t>el QR del portal enviado en el correo de alta (RF-5.3, RE-5.8.4) sigue pendiente para una entrega aparte. El correo conserva el enlace de acceso; Carnet B entrega el QR de emergencia de la mascota sin ampliar ese envío.</w:t>
+        <w:t xml:space="preserve"> el QR del portal enviado en el correo de alta (RF-5.3, RE-5.8.4) sigue pendiente para una entrega aparte. El correo conserva el enlace de acceso; Carnet B entrega el QR de emergencia de la mascota sin ampliar ese envío.</w:t>
       </w:r>
     </w:p>
     <w:p>
@@ -2938,7 +2984,7 @@
         <w:pStyle w:val="Ttulo1"/>
       </w:pPr>
       <w:bookmarkStart w:id="0" w:name="_0e2973c2e3c317285bf344b2034a52754788c6d"/>
-      <w:bookmarkStart w:id="1" w:name="_Toc243683898"/>
+      <w:bookmarkStart w:id="1" w:name="_Toc243862750"/>
       <w:r>
         <w:lastRenderedPageBreak/>
         <w:t>1. Introducción</w:t>
@@ -2950,7 +2996,7 @@
         <w:pStyle w:val="Ttulo2"/>
       </w:pPr>
       <w:bookmarkStart w:id="2" w:name="_53ca1eb396407438b910fbafb578b446b614ca3"/>
-      <w:bookmarkStart w:id="3" w:name="_Toc243683899"/>
+      <w:bookmarkStart w:id="3" w:name="_Toc243862751"/>
       <w:r>
         <w:t>1.1 Propósito</w:t>
       </w:r>
@@ -2991,10 +3037,7 @@
         <w:t>v2.1</w:t>
       </w:r>
       <w:r>
-        <w:t xml:space="preserve"> </w:t>
-      </w:r>
-      <w:r>
-        <w:t>del plan de historias. Sirve como referente para el diseño, la implementación, las pruebas y la validación. Cada requisito se enuncia siguiendo las características de calidad del estándar ISO/IEC/IEEE 29148:2018 (necesario, verificable, no ambiguo, singular y trazable), con un identificador único y un criterio de verificación asociado.</w:t>
+        <w:t xml:space="preserve"> del plan de historias. Sirve como referente para el diseño, la implementación, las pruebas y la validación. Cada requisito se enuncia siguiendo las características de calidad del estándar ISO/IEC/IEEE 29148:2018 (necesario, verificable, no ambiguo, singular y trazable), con un identificador único y un criterio de verificación asociado.</w:t>
       </w:r>
     </w:p>
     <w:p>
@@ -3002,7 +3045,7 @@
         <w:pStyle w:val="Ttulo2"/>
       </w:pPr>
       <w:bookmarkStart w:id="4" w:name="_807e0e4b2e93a972a9fa0860b3c406e1abe614d"/>
-      <w:bookmarkStart w:id="5" w:name="_Toc243683900"/>
+      <w:bookmarkStart w:id="5" w:name="_Toc243862752"/>
       <w:bookmarkEnd w:id="2"/>
       <w:r>
         <w:t>1.2 Alcance</w:t>
@@ -3024,10 +3067,7 @@
         <w:t>aplicación web SaaS multi-inquilino</w:t>
       </w:r>
       <w:r>
-        <w:t xml:space="preserve"> </w:t>
-      </w:r>
-      <w:r>
-        <w:t>que permite a varias clínicas veterinarias pequeñas gestionar su operación clínica sobre una misma plataforma, con los datos de cada clínica aislados entre sí. El alcance completo de la v2 abarca las capacidades siguientes. Su reparto entre v2.0 y v2.1 lo fija el plan de entregas; una capacidad descrita aquí no se presume incluida en la primera entrega.</w:t>
+        <w:t xml:space="preserve"> que permite a varias clínicas veterinarias pequeñas gestionar su operación clínica sobre una misma plataforma, con los datos de cada clínica aislados entre sí. El alcance completo de la v2 abarca las capacidades siguientes. Su reparto entre v2.0 y v2.1 lo fija el plan de entregas; una capacidad descrita aquí no se presume incluida en la primera entrega.</w:t>
       </w:r>
     </w:p>
     <w:p>
@@ -3046,10 +3086,7 @@
         <w:t>Plataforma y clínicas:</w:t>
       </w:r>
       <w:r>
-        <w:t xml:space="preserve"> </w:t>
-      </w:r>
-      <w:r>
-        <w:t>registro autónomo (self-service) de clínicas, panel del super-administrador, suscripción por planes con control de límites (freemium) y configuración por clínica.</w:t>
+        <w:t xml:space="preserve"> registro autónomo (self-service) de clínicas, panel del super-administrador, suscripción por planes con control de límites (freemium) y configuración por clínica.</w:t>
       </w:r>
     </w:p>
     <w:p>
@@ -3097,10 +3134,7 @@
         <w:t>Soporte a la decisión clínica (Grafo I):</w:t>
       </w:r>
       <w:r>
-        <w:t xml:space="preserve"> </w:t>
-      </w:r>
-      <w:r>
-        <w:t>copiloto que, durante la consulta, sugiere diagnósticos ordenados por peso y advierte sobre toxicidades e interacciones mediante un grafo de conocimiento con signo.</w:t>
+        <w:t xml:space="preserve"> copiloto que, durante la consulta, sugiere diagnósticos ordenados por peso y advierte sobre toxicidades e interacciones mediante un grafo de conocimiento con signo.</w:t>
       </w:r>
     </w:p>
     <w:p>
@@ -3157,10 +3191,7 @@
         <w:t>Portal del propietario:</w:t>
       </w:r>
       <w:r>
-        <w:t xml:space="preserve"> </w:t>
-      </w:r>
-      <w:r>
-        <w:t xml:space="preserve">auto-registro, vinculación a las clínicas que él elige, auto-agendamiento y cancelación de citas, centro de notificaciones, </w:t>
+        <w:t xml:space="preserve"> auto-registro, vinculación a las clínicas que él elige, auto-agendamiento y cancelación de citas, centro de notificaciones, </w:t>
       </w:r>
       <w:r>
         <w:rPr>
@@ -3227,10 +3258,7 @@
         <w:t>Acceso y seguridad:</w:t>
       </w:r>
       <w:r>
-        <w:t xml:space="preserve"> </w:t>
-      </w:r>
-      <w:r>
-        <w:t xml:space="preserve">autenticación local y federada (Google), control de acceso por roles y </w:t>
+        <w:t xml:space="preserve"> autenticación local y federada (Google), control de acceso por roles y </w:t>
       </w:r>
       <w:r>
         <w:rPr>
@@ -3256,17 +3284,7 @@
         <w:t>Fuera del alcance de la v2:</w:t>
       </w:r>
       <w:r>
-        <w:t xml:space="preserve"> inventario de medicamentos completo, facturación electrónica / punto de venta y telemedicina con video. El </w:t>
-      </w:r>
-      <w:r>
-        <w:rPr>
-          <w:b/>
-          <w:bCs/>
-        </w:rPr>
-        <w:t>cobro real mediante pasarela de pago</w:t>
-      </w:r>
-      <w:r>
-        <w:t xml:space="preserve"> y los entregables </w:t>
+        <w:t xml:space="preserve"> inventario de medicamentos completo, facturación electrónica / punto de venta y telemedicina con video. Los entregables </w:t>
       </w:r>
       <w:r>
         <w:rPr>
@@ -3276,7 +3294,7 @@
         <w:t>deseables</w:t>
       </w:r>
       <w:r>
-        <w:t xml:space="preserve"> (recetas en PDF, motor de salud preventiva por protocolos y PWA instalable) se contemplan como evolución (§2.6).</w:t>
+        <w:t xml:space="preserve"> (recetas en PDF, motor de salud preventiva por protocolos y PWA instalable) se contemplan como evolución (§2.6). El cobro de suscripción con Wompi es RF-0.7, implementado en 2.1.0; sustituye la exclusión anterior de RF-F.1. La activación con dinero real requiere resolver D8/D10 y la validación operativa del proveedor.</w:t>
       </w:r>
     </w:p>
     <w:p>
@@ -3284,7 +3302,7 @@
         <w:pStyle w:val="Ttulo2"/>
       </w:pPr>
       <w:bookmarkStart w:id="6" w:name="_3c32702167a50f9f1e47f548e3fd9a17f4efae6"/>
-      <w:bookmarkStart w:id="7" w:name="_Toc243683901"/>
+      <w:bookmarkStart w:id="7" w:name="_Toc243862753"/>
       <w:bookmarkEnd w:id="4"/>
       <w:r>
         <w:t>1.3 Personal involucrado</w:t>
@@ -3534,7 +3552,7 @@
         <w:pStyle w:val="Ttulo2"/>
       </w:pPr>
       <w:bookmarkStart w:id="8" w:name="_202ce33122313366988e60811cd45f2e3fac5ed"/>
-      <w:bookmarkStart w:id="9" w:name="_Toc243683902"/>
+      <w:bookmarkStart w:id="9" w:name="_Toc243862754"/>
       <w:bookmarkEnd w:id="6"/>
       <w:r>
         <w:lastRenderedPageBreak/>
@@ -4210,7 +4228,7 @@
         <w:pStyle w:val="Ttulo2"/>
       </w:pPr>
       <w:bookmarkStart w:id="10" w:name="_f02bdecee650c876b7f695bd90111aab7702c00"/>
-      <w:bookmarkStart w:id="11" w:name="_Toc243683903"/>
+      <w:bookmarkStart w:id="11" w:name="_Toc243862755"/>
       <w:bookmarkEnd w:id="8"/>
       <w:r>
         <w:t>1.5 Referencias normativas</w:t>
@@ -4233,10 +4251,7 @@
         <w:t>ISO/IEC/IEEE 29148:2018</w:t>
       </w:r>
       <w:r>
-        <w:t xml:space="preserve"> </w:t>
-      </w:r>
-      <w:r>
-        <w:t>— Systems and software engineering — Requirements engineering (estándar principal de este documento).</w:t>
+        <w:t xml:space="preserve"> — Systems and software engineering — Requirements engineering (estándar principal de este documento).</w:t>
       </w:r>
     </w:p>
     <w:p>
@@ -4293,7 +4308,7 @@
         <w:pStyle w:val="Ttulo1"/>
       </w:pPr>
       <w:bookmarkStart w:id="12" w:name="_272b38cfc2ff6ab53ecdbfe24b7ba0e5f181bd6"/>
-      <w:bookmarkStart w:id="13" w:name="_Toc243683904"/>
+      <w:bookmarkStart w:id="13" w:name="_Toc243862756"/>
       <w:bookmarkEnd w:id="0"/>
       <w:bookmarkEnd w:id="10"/>
       <w:r>
@@ -4307,7 +4322,7 @@
         <w:pStyle w:val="Ttulo2"/>
       </w:pPr>
       <w:bookmarkStart w:id="14" w:name="_530c4174996bbc2c9398cdddea6478430b49400"/>
-      <w:bookmarkStart w:id="15" w:name="_Toc243683905"/>
+      <w:bookmarkStart w:id="15" w:name="_Toc243862757"/>
       <w:r>
         <w:t>2.1 Perspectiva del producto</w:t>
       </w:r>
@@ -4400,7 +4415,7 @@
           <w:noProof/>
         </w:rPr>
         <w:drawing>
-          <wp:inline distT="0" distB="0" distL="0" distR="0" wp14:anchorId="55595947" wp14:editId="55595948">
+          <wp:inline distT="0" distB="0" distL="0" distR="0" wp14:anchorId="284607B7" wp14:editId="284607B8">
             <wp:extent cx="5939999" cy="2903365"/>
             <wp:effectExtent l="0" t="0" r="0" b="0"/>
             <wp:docPr id="20" name="Picture"/>
@@ -4409,7 +4424,7 @@
               <a:graphicData uri="http://schemas.openxmlformats.org/drawingml/2006/picture">
                 <pic:pic xmlns:pic="http://schemas.openxmlformats.org/drawingml/2006/picture">
                   <pic:nvPicPr>
-                    <pic:cNvPr id="21" name="Picture" descr="C:\Users\Usuario\AppData\Local\Temp\zooki-docs-pGC66O\ers-figura-1.png"/>
+                    <pic:cNvPr id="21" name="Picture" descr="C:\Users\Usuario\AppData\Local\Temp\zooki-docs-n4cm6I\ers-figura-1.png"/>
                     <pic:cNvPicPr>
                       <a:picLocks noChangeAspect="1" noChangeArrowheads="1"/>
                     </pic:cNvPicPr>
@@ -4483,7 +4498,7 @@
           <w:noProof/>
         </w:rPr>
         <w:drawing>
-          <wp:inline distT="0" distB="0" distL="0" distR="0" wp14:anchorId="55595949" wp14:editId="5559594A">
+          <wp:inline distT="0" distB="0" distL="0" distR="0" wp14:anchorId="284607B9" wp14:editId="284607BA">
             <wp:extent cx="5939999" cy="3650624"/>
             <wp:effectExtent l="0" t="0" r="0" b="0"/>
             <wp:docPr id="23" name="Picture"/>
@@ -4492,7 +4507,7 @@
               <a:graphicData uri="http://schemas.openxmlformats.org/drawingml/2006/picture">
                 <pic:pic xmlns:pic="http://schemas.openxmlformats.org/drawingml/2006/picture">
                   <pic:nvPicPr>
-                    <pic:cNvPr id="24" name="Picture" descr="C:\Users\Usuario\AppData\Local\Temp\zooki-docs-pGC66O\ers-figura-2.png"/>
+                    <pic:cNvPr id="24" name="Picture" descr="C:\Users\Usuario\AppData\Local\Temp\zooki-docs-n4cm6I\ers-figura-2.png"/>
                     <pic:cNvPicPr>
                       <a:picLocks noChangeAspect="1" noChangeArrowheads="1"/>
                     </pic:cNvPicPr>
@@ -4530,7 +4545,7 @@
         <w:pStyle w:val="Ttulo2"/>
       </w:pPr>
       <w:bookmarkStart w:id="16" w:name="_8fb72911118d5239a4ddf916fa7f6994c841597"/>
-      <w:bookmarkStart w:id="17" w:name="_Toc243683906"/>
+      <w:bookmarkStart w:id="17" w:name="_Toc243862758"/>
       <w:bookmarkEnd w:id="14"/>
       <w:r>
         <w:t>2.2 Funciones principales</w:t>
@@ -4599,10 +4614,7 @@
         <w:t>Historia clínica + ★ soporte a la decisión clínica (Grafo I):</w:t>
       </w:r>
       <w:r>
-        <w:t xml:space="preserve"> </w:t>
-      </w:r>
-      <w:r>
-        <w:t>consultas, tratamientos y archivos; sugerencia de diagnósticos y alertas de toxicidad/interacción.</w:t>
+        <w:t xml:space="preserve"> consultas, tratamientos y archivos; sugerencia de diagnósticos y alertas de toxicidad/interacción.</w:t>
       </w:r>
     </w:p>
     <w:p>
@@ -4764,7 +4776,7 @@
         <w:pStyle w:val="Ttulo2"/>
       </w:pPr>
       <w:bookmarkStart w:id="18" w:name="_a6c21597a6595bc146d22c17741d693a713bfb2"/>
-      <w:bookmarkStart w:id="19" w:name="_Toc243683907"/>
+      <w:bookmarkStart w:id="19" w:name="_Toc243862759"/>
       <w:bookmarkEnd w:id="16"/>
       <w:r>
         <w:t>2.3 Características de los usuarios (clases de usuario)</w:t>
@@ -5238,7 +5250,7 @@
         <w:pStyle w:val="Ttulo2"/>
       </w:pPr>
       <w:bookmarkStart w:id="20" w:name="_11fda6f447d6f2a37cc502977dae18f9e3ad8b3"/>
-      <w:bookmarkStart w:id="21" w:name="_Toc243683908"/>
+      <w:bookmarkStart w:id="21" w:name="_Toc243862760"/>
       <w:bookmarkEnd w:id="18"/>
       <w:r>
         <w:t>2.4 Restricciones</w:t>
@@ -5390,7 +5402,7 @@
         <w:pStyle w:val="Ttulo2"/>
       </w:pPr>
       <w:bookmarkStart w:id="22" w:name="_26d80a1bad7ec0339e80ed2e634398510a6938c"/>
-      <w:bookmarkStart w:id="23" w:name="_Toc243683909"/>
+      <w:bookmarkStart w:id="23" w:name="_Toc243862761"/>
       <w:bookmarkEnd w:id="20"/>
       <w:r>
         <w:t>2.5 Suposiciones y dependencias</w:t>
@@ -5474,7 +5486,7 @@
         <w:pStyle w:val="Ttulo2"/>
       </w:pPr>
       <w:bookmarkStart w:id="24" w:name="_fdd8f268017d5796a6252a81775e10e2c2202be"/>
-      <w:bookmarkStart w:id="25" w:name="_Toc243683910"/>
+      <w:bookmarkStart w:id="25" w:name="_Toc243862762"/>
       <w:bookmarkEnd w:id="22"/>
       <w:r>
         <w:t>2.6 Requisitos futuros y evolución previsible</w:t>
@@ -5585,59 +5597,6 @@
               <w:noBreakHyphen/>
             </w:r>
             <w:r>
-              <w:t>F.1</w:t>
-            </w:r>
-          </w:p>
-        </w:tc>
-        <w:tc>
-          <w:tcPr>
-            <w:tcW w:w="3561" w:type="pct"/>
-          </w:tcPr>
-          <w:p>
-            <w:pPr>
-              <w:pStyle w:val="Celda"/>
-              <w:keepNext/>
-            </w:pPr>
-            <w:r>
-              <w:t>Cobro real de la suscripción mediante pasarela de pago.</w:t>
-            </w:r>
-          </w:p>
-        </w:tc>
-        <w:tc>
-          <w:tcPr>
-            <w:tcW w:w="833" w:type="pct"/>
-          </w:tcPr>
-          <w:p>
-            <w:pPr>
-              <w:pStyle w:val="Celda"/>
-              <w:keepNext/>
-            </w:pPr>
-            <w:r>
-              <w:t>Futura</w:t>
-            </w:r>
-          </w:p>
-        </w:tc>
-      </w:tr>
-      <w:tr>
-        <w:trPr>
-          <w:cantSplit/>
-        </w:trPr>
-        <w:tc>
-          <w:tcPr>
-            <w:tcW w:w="606" w:type="pct"/>
-          </w:tcPr>
-          <w:p>
-            <w:pPr>
-              <w:pStyle w:val="Celda"/>
-              <w:keepNext/>
-            </w:pPr>
-            <w:r>
-              <w:t>RF</w:t>
-            </w:r>
-            <w:r>
-              <w:noBreakHyphen/>
-            </w:r>
-            <w:r>
               <w:t>F.2</w:t>
             </w:r>
           </w:p>
@@ -5992,7 +5951,7 @@
         <w:pStyle w:val="Ttulo1"/>
       </w:pPr>
       <w:bookmarkStart w:id="26" w:name="_e16cbc17efb9516401e41690962f9175e4cde1d"/>
-      <w:bookmarkStart w:id="27" w:name="_Toc243683911"/>
+      <w:bookmarkStart w:id="27" w:name="_Toc243862763"/>
       <w:bookmarkEnd w:id="12"/>
       <w:bookmarkEnd w:id="24"/>
       <w:r>
@@ -6033,10 +5992,7 @@
         <w:t>RF-F.&lt;n&gt;</w:t>
       </w:r>
       <w:r>
-        <w:t xml:space="preserve"> </w:t>
-      </w:r>
-      <w:r>
-        <w:t xml:space="preserve">y los no funcionales </w:t>
+        <w:t xml:space="preserve"> y los no funcionales </w:t>
       </w:r>
       <w:r>
         <w:rPr>
@@ -6053,7 +6009,7 @@
         <w:pStyle w:val="Ttulo2"/>
       </w:pPr>
       <w:bookmarkStart w:id="28" w:name="_b1c2f4b7e2eba5d64c8f3d3850d1e5e5653bfa3"/>
-      <w:bookmarkStart w:id="29" w:name="_Toc243683912"/>
+      <w:bookmarkStart w:id="29" w:name="_Toc243862764"/>
       <w:r>
         <w:t>3.1 Interfaces externas</w:t>
       </w:r>
@@ -6859,10 +6815,7 @@
         <w:t>id_clinica</w:t>
       </w:r>
       <w:r>
-        <w:t xml:space="preserve"> </w:t>
-      </w:r>
-      <w:r>
-        <w:t xml:space="preserve">y toda consulta lo filtra. Las excepciones son los catálogos globales, el grafo de conocimiento clínico, el propietario y la mascota, que son globales y se vinculan a cada clínica por tablas puente. El modelo entidad-relación completo de la v2.0 (con las entidades nuevas de clínicas, planes, suscripciones, grafos y reseñas) se especifica en el apéndice §5.2 y en el documento </w:t>
+        <w:t xml:space="preserve"> y toda consulta lo filtra. Las excepciones son los catálogos globales, el grafo de conocimiento clínico, el propietario y la mascota, que son globales y se vinculan a cada clínica por tablas puente. El modelo entidad-relación completo de la v2.0 (con las entidades nuevas de clínicas, planes, suscripciones, grafos y reseñas) se especifica en el apéndice §5.2 y en el documento </w:t>
       </w:r>
       <w:r>
         <w:rPr>
@@ -6880,7 +6833,7 @@
         <w:pStyle w:val="Ttulo2"/>
       </w:pPr>
       <w:bookmarkStart w:id="33" w:name="_965d05d004114bc2ee0e90669218ec0da0e554f"/>
-      <w:bookmarkStart w:id="34" w:name="_Toc243683913"/>
+      <w:bookmarkStart w:id="34" w:name="_Toc243862765"/>
       <w:bookmarkEnd w:id="28"/>
       <w:bookmarkEnd w:id="32"/>
       <w:r>
@@ -6903,10 +6856,7 @@
         <w:t>misma numeración en todos los documentos</w:t>
       </w:r>
       <w:r>
-        <w:t xml:space="preserve"> </w:t>
-      </w:r>
-      <w:r>
-        <w:t>(Historias de Usuario, Requisitos Específicos, Reglas de Negocio y Modelos).</w:t>
+        <w:t xml:space="preserve"> (Historias de Usuario, Requisitos Específicos, Reglas de Negocio y Modelos).</w:t>
       </w:r>
     </w:p>
     <w:p>
@@ -7312,7 +7262,7 @@
               <w:keepNext/>
             </w:pPr>
             <w:r>
-              <w:t>Asignar y controlar el estado de la suscripción por clínica; congelar beneficios si no está al día. Al bajar de plan o caer en mora no se oculta ni se borra ningún dato: solo se bloquea lo nuevo por encima de los límites del plan gratuito.</w:t>
+              <w:t>Asignar y controlar por clínica el plan contratado y el efectivo, su vigencia y gracia parametrizada; congelar los beneficios de pago al terminar la gracia y recuperarlos al acreditar un periodo. La mora o la bajada al gratuito no ocultan ni borran datos: solo limitan nuevas altas a los cupos gratuitos, con excepción de urgencias rojas</w:t>
             </w:r>
           </w:p>
         </w:tc>
@@ -7340,7 +7290,7 @@
               <w:keepNext/>
             </w:pPr>
             <w:r>
-              <w:t>Una clínica en mora ve restringidas las funciones del plan de pago, pero sigue atendiendo a sus mascotas actuales.</w:t>
+              <w:t>Bordes de vigencia/gracia y gratuito efectivo sin depender de cron; suspensión administrativa intacta.</w:t>
             </w:r>
           </w:p>
         </w:tc>
@@ -7356,6 +7306,7 @@
           <w:p>
             <w:pPr>
               <w:pStyle w:val="Celda"/>
+              <w:keepNext/>
             </w:pPr>
             <w:r>
               <w:t>RF</w:t>
@@ -7375,15 +7326,10 @@
           <w:p>
             <w:pPr>
               <w:pStyle w:val="Celda"/>
-            </w:pPr>
-            <w:r>
-              <w:t xml:space="preserve">Aplicar los límites del plan al operar (p. ej. máximo de mascotas y de citas/consultas por período en el plan gratuito), excepto en las urgencias </w:t>
-            </w:r>
-            <w:r>
-              <w:t>🔴</w:t>
-            </w:r>
-            <w:r>
-              <w:t>, que nunca se bloquean por límite ni por mora.</w:t>
+              <w:keepNext/>
+            </w:pPr>
+            <w:r>
+              <w:t>Aplicar los límites del plan al operar (p. ej. máximo de mascotas y de citas/consultas por período en el plan gratuito), excepto en las urgencias 🔴, que nunca se bloquean por límite ni por mora.</w:t>
             </w:r>
           </w:p>
         </w:tc>
@@ -7394,6 +7340,7 @@
           <w:p>
             <w:pPr>
               <w:pStyle w:val="Celda"/>
+              <w:keepNext/>
             </w:pPr>
             <w:r>
               <w:t>Alta</w:t>
@@ -7407,15 +7354,80 @@
           <w:p>
             <w:pPr>
               <w:pStyle w:val="Celda"/>
-            </w:pPr>
-            <w:r>
-              <w:t xml:space="preserve">Al superar el límite, el sistema impide la acción e informa el motivo; un caso </w:t>
-            </w:r>
-            <w:r>
-              <w:t>🔴</w:t>
-            </w:r>
-            <w:r>
-              <w:t xml:space="preserve"> se atiende igual.</w:t>
+              <w:keepNext/>
+            </w:pPr>
+            <w:r>
+              <w:t>Al superar el límite, el sistema impide la acción e informa el motivo; un caso 🔴 se atiende igual.</w:t>
+            </w:r>
+          </w:p>
+        </w:tc>
+      </w:tr>
+      <w:tr>
+        <w:trPr>
+          <w:cantSplit/>
+        </w:trPr>
+        <w:tc>
+          <w:tcPr>
+            <w:tcW w:w="467" w:type="pct"/>
+          </w:tcPr>
+          <w:p>
+            <w:pPr>
+              <w:pStyle w:val="Celda"/>
+            </w:pPr>
+            <w:r>
+              <w:t>RF</w:t>
+            </w:r>
+            <w:r>
+              <w:noBreakHyphen/>
+            </w:r>
+            <w:r>
+              <w:t>0.7</w:t>
+            </w:r>
+          </w:p>
+        </w:tc>
+        <w:tc>
+          <w:tcPr>
+            <w:tcW w:w="1947" w:type="pct"/>
+          </w:tcPr>
+          <w:p>
+            <w:pPr>
+              <w:pStyle w:val="Celda"/>
+            </w:pPr>
+            <w:r>
+              <w:t xml:space="preserve">Cobrar la suscripción mediante Wompi: primero pago voluntario con botón y, posteriormente, renovación automática mensual autorizada con fuente guardada; verificar y conciliar transacciones en servidor, aplicar cada periodo una sola vez y mostrar el historial al administrador y al super-administrador </w:t>
+            </w:r>
+            <w:r>
+              <w:rPr>
+                <w:i/>
+                <w:iCs/>
+              </w:rPr>
+              <w:t>Implementado (2.1.0).</w:t>
+            </w:r>
+          </w:p>
+        </w:tc>
+        <w:tc>
+          <w:tcPr>
+            <w:tcW w:w="639" w:type="pct"/>
+          </w:tcPr>
+          <w:p>
+            <w:pPr>
+              <w:pStyle w:val="Celda"/>
+            </w:pPr>
+            <w:r>
+              <w:t>Alta</w:t>
+            </w:r>
+          </w:p>
+        </w:tc>
+        <w:tc>
+          <w:tcPr>
+            <w:tcW w:w="1947" w:type="pct"/>
+          </w:tcPr>
+          <w:p>
+            <w:pPr>
+              <w:pStyle w:val="Celda"/>
+            </w:pPr>
+            <w:r>
+              <w:t>Evento firmado o recuperación por ID desde retorno propio/plataforma, siempre con API privada concordante; periodo único, recibo por outbox y cliente falso.</w:t>
             </w:r>
           </w:p>
         </w:tc>
@@ -8738,10 +8750,7 @@
               <w:t>identidad global</w:t>
             </w:r>
             <w:r>
-              <w:t xml:space="preserve"> </w:t>
-            </w:r>
-            <w:r>
-              <w:t>del propietario, vinculable a varias clínicas: una sola ficha, un solo carnet y un solo QR; antes de registrar, ofrecer vincular una mascota existente del propietario; cada clínica asigna su propio número de historia clínica.</w:t>
+              <w:t xml:space="preserve"> del propietario, vinculable a varias clínicas: una sola ficha, un solo carnet y un solo QR; antes de registrar, ofrecer vincular una mascota existente del propietario; cada clínica asigna su propio número de historia clínica.</w:t>
             </w:r>
           </w:p>
         </w:tc>
@@ -9692,10 +9701,7 @@
         <w:t>apoyo</w:t>
       </w:r>
       <w:r>
-        <w:t xml:space="preserve">, no diagnóstico automático: la decisión final es del veterinario. Su cobertura depende del conocimiento cargado (acotado inicialmente a perros y gatos). Cada elemento tiene fuente y validación pendiente; las pruebas de software no certifican validez clínica. </w:t>
-      </w:r>
-      <w:r>
-        <w:t>En 2.0.0-alpha.4 están implementados el formato/cargador, el conocimiento inicial con fuentes, el mapa, el apoyo diagnóstico y las alertas al prescribir. El motor de triage, buscador y batería están hechos; su captura y operación en agenda, urgencias y ajuste veterinario se integran en M4. Carnet y QR con alertas siguen para el final de la v2.0.</w:t>
+        <w:t>, no diagnóstico automático: la decisión final es del veterinario. Su cobertura depende del conocimiento cargado (acotado inicialmente a perros y gatos). Cada elemento tiene fuente y validación pendiente; las pruebas de software no certifican validez clínica. En 2.0.0-alpha.4 están implementados el formato/cargador, el conocimiento inicial con fuentes, el mapa, el apoyo diagnóstico y las alertas al prescribir. El motor de triage, buscador y batería están hechos; su captura y operación en agenda, urgencias y ajuste veterinario se integran en M4. Carnet y QR con alertas siguen para el final de la v2.0.</w:t>
       </w:r>
     </w:p>
     <w:p>
@@ -11012,13 +11018,7 @@
               <w:keepNext/>
             </w:pPr>
             <w:r>
-              <w:t xml:space="preserve">Ante un caso </w:t>
-            </w:r>
-            <w:r>
-              <w:t>🔴</w:t>
-            </w:r>
-            <w:r>
-              <w:t xml:space="preserve"> fuera del horario de la clínica, informar que está cerrada, mostrar su teléfono de urgencias y recomendar un servicio de urgencias 24 horas.</w:t>
+              <w:t>Ante un caso 🔴 fuera del horario de la clínica, informar que está cerrada, mostrar su teléfono de urgencias y recomendar un servicio de urgencias 24 horas.</w:t>
             </w:r>
           </w:p>
         </w:tc>
@@ -13343,7 +13343,7 @@
         <w:pStyle w:val="Ttulo2"/>
       </w:pPr>
       <w:bookmarkStart w:id="46" w:name="_91faa842a79df0e34112c2e349ad0681a2800df"/>
-      <w:bookmarkStart w:id="47" w:name="_Toc243683914"/>
+      <w:bookmarkStart w:id="47" w:name="_Toc243862766"/>
       <w:bookmarkEnd w:id="33"/>
       <w:bookmarkEnd w:id="45"/>
       <w:r>
@@ -14282,10 +14282,7 @@
               <w:t>Aislamiento multi-inquilino:</w:t>
             </w:r>
             <w:r>
-              <w:t xml:space="preserve"> </w:t>
-            </w:r>
-            <w:r>
-              <w:t>ninguna operación devuelve ni modifica registros de otra clínica fuera de las excepciones explícitas. Son globales usuarios, mascotas, catálogos taxonómicos y Grafo I. Toda clínica vinculada ve alergias, alertas, vacunas y desparasitaciones de la mascota; las consultas y tratamientos de otra clínica se muestran solo con autorización del propietario (RF-2.6). El motor de prescripción puede leer internamente medicación protegida solo para emitir la alerta genérica de RN-211, sin devolver el tratamiento.</w:t>
+              <w:t xml:space="preserve"> ninguna operación devuelve ni modifica registros de otra clínica fuera de las excepciones explícitas. Son globales usuarios, mascotas, catálogos taxonómicos y Grafo I. Toda clínica vinculada ve alergias, alertas, vacunas y desparasitaciones de la mascota; las consultas y tratamientos de otra clínica se muestran solo con autorización del propietario (RF-2.6). El motor de prescripción puede leer internamente medicación protegida solo para emitir la alerta genérica de RN-211, sin devolver el tratamiento.</w:t>
             </w:r>
           </w:p>
         </w:tc>
@@ -15352,7 +15349,7 @@
         <w:pStyle w:val="Ttulo1"/>
       </w:pPr>
       <w:bookmarkStart w:id="53" w:name="_8872f59400eca311bb7b0740442423f0a836d6f"/>
-      <w:bookmarkStart w:id="54" w:name="_Toc243683915"/>
+      <w:bookmarkStart w:id="54" w:name="_Toc243862767"/>
       <w:bookmarkEnd w:id="26"/>
       <w:bookmarkEnd w:id="46"/>
       <w:bookmarkEnd w:id="52"/>
@@ -15679,7 +15676,7 @@
         <w:pStyle w:val="Ttulo1"/>
       </w:pPr>
       <w:bookmarkStart w:id="55" w:name="_11f3dc26fe4f135be80b976bfe46d60e018a5ba"/>
-      <w:bookmarkStart w:id="56" w:name="_Toc243683916"/>
+      <w:bookmarkStart w:id="56" w:name="_Toc243862768"/>
       <w:bookmarkEnd w:id="53"/>
       <w:r>
         <w:lastRenderedPageBreak/>
@@ -15692,7 +15689,7 @@
         <w:pStyle w:val="Ttulo2"/>
       </w:pPr>
       <w:bookmarkStart w:id="57" w:name="_f7580e8bc275eea58d00a0ff871ef60674ed780"/>
-      <w:bookmarkStart w:id="58" w:name="_Toc243683917"/>
+      <w:bookmarkStart w:id="58" w:name="_Toc243862769"/>
       <w:r>
         <w:t>5.1 Casos de uso</w:t>
       </w:r>
@@ -15730,10 +15727,10 @@
       </w:tblPr>
       <w:tblGrid>
         <w:gridCol w:w="784"/>
-        <w:gridCol w:w="2692"/>
-        <w:gridCol w:w="2545"/>
+        <w:gridCol w:w="2644"/>
+        <w:gridCol w:w="2644"/>
         <w:gridCol w:w="893"/>
-        <w:gridCol w:w="2646"/>
+        <w:gridCol w:w="2595"/>
       </w:tblGrid>
       <w:tr>
         <w:trPr>
@@ -15756,7 +15753,7 @@
         </w:tc>
         <w:tc>
           <w:tcPr>
-            <w:tcW w:w="1408" w:type="pct"/>
+            <w:tcW w:w="1383" w:type="pct"/>
           </w:tcPr>
           <w:p>
             <w:pPr>
@@ -15769,7 +15766,7 @@
         </w:tc>
         <w:tc>
           <w:tcPr>
-            <w:tcW w:w="1331" w:type="pct"/>
+            <w:tcW w:w="1383" w:type="pct"/>
           </w:tcPr>
           <w:p>
             <w:pPr>
@@ -15795,7 +15792,7 @@
         </w:tc>
         <w:tc>
           <w:tcPr>
-            <w:tcW w:w="1384" w:type="pct"/>
+            <w:tcW w:w="1358" w:type="pct"/>
           </w:tcPr>
           <w:p>
             <w:pPr>
@@ -15832,7 +15829,7 @@
         </w:tc>
         <w:tc>
           <w:tcPr>
-            <w:tcW w:w="1408" w:type="pct"/>
+            <w:tcW w:w="1383" w:type="pct"/>
           </w:tcPr>
           <w:p>
             <w:pPr>
@@ -15845,7 +15842,7 @@
         </w:tc>
         <w:tc>
           <w:tcPr>
-            <w:tcW w:w="1331" w:type="pct"/>
+            <w:tcW w:w="1383" w:type="pct"/>
           </w:tcPr>
           <w:p>
             <w:pPr>
@@ -15871,7 +15868,7 @@
         </w:tc>
         <w:tc>
           <w:tcPr>
-            <w:tcW w:w="1384" w:type="pct"/>
+            <w:tcW w:w="1358" w:type="pct"/>
           </w:tcPr>
           <w:p>
             <w:pPr>
@@ -15908,7 +15905,7 @@
         </w:tc>
         <w:tc>
           <w:tcPr>
-            <w:tcW w:w="1408" w:type="pct"/>
+            <w:tcW w:w="1383" w:type="pct"/>
           </w:tcPr>
           <w:p>
             <w:pPr>
@@ -15921,14 +15918,14 @@
         </w:tc>
         <w:tc>
           <w:tcPr>
-            <w:tcW w:w="1331" w:type="pct"/>
-          </w:tcPr>
-          <w:p>
-            <w:pPr>
-              <w:pStyle w:val="Celda"/>
-            </w:pPr>
-            <w:r>
-              <w:t>Super-administrador</w:t>
+            <w:tcW w:w="1383" w:type="pct"/>
+          </w:tcPr>
+          <w:p>
+            <w:pPr>
+              <w:pStyle w:val="Celda"/>
+            </w:pPr>
+            <w:r>
+              <w:t>Super-administrador (gestión); administrador de clínica (solo su suscripción)</w:t>
             </w:r>
           </w:p>
         </w:tc>
@@ -15947,14 +15944,14 @@
         </w:tc>
         <w:tc>
           <w:tcPr>
-            <w:tcW w:w="1384" w:type="pct"/>
-          </w:tcPr>
-          <w:p>
-            <w:pPr>
-              <w:pStyle w:val="Celda"/>
-            </w:pPr>
-            <w:r>
-              <w:t>RF-0.2, RF-0.4, RF-0.5, RF-0.6</w:t>
+            <w:tcW w:w="1358" w:type="pct"/>
+          </w:tcPr>
+          <w:p>
+            <w:pPr>
+              <w:pStyle w:val="Celda"/>
+            </w:pPr>
+            <w:r>
+              <w:t>RF-0.2, RF-0.4, RF-0.5, RF-0.6, RF-0.7</w:t>
             </w:r>
           </w:p>
         </w:tc>
@@ -15984,7 +15981,7 @@
         </w:tc>
         <w:tc>
           <w:tcPr>
-            <w:tcW w:w="1408" w:type="pct"/>
+            <w:tcW w:w="1383" w:type="pct"/>
           </w:tcPr>
           <w:p>
             <w:pPr>
@@ -15997,7 +15994,7 @@
         </w:tc>
         <w:tc>
           <w:tcPr>
-            <w:tcW w:w="1331" w:type="pct"/>
+            <w:tcW w:w="1383" w:type="pct"/>
           </w:tcPr>
           <w:p>
             <w:pPr>
@@ -16023,7 +16020,7 @@
         </w:tc>
         <w:tc>
           <w:tcPr>
-            <w:tcW w:w="1384" w:type="pct"/>
+            <w:tcW w:w="1358" w:type="pct"/>
           </w:tcPr>
           <w:p>
             <w:pPr>
@@ -16060,7 +16057,7 @@
         </w:tc>
         <w:tc>
           <w:tcPr>
-            <w:tcW w:w="1408" w:type="pct"/>
+            <w:tcW w:w="1383" w:type="pct"/>
           </w:tcPr>
           <w:p>
             <w:pPr>
@@ -16073,7 +16070,7 @@
         </w:tc>
         <w:tc>
           <w:tcPr>
-            <w:tcW w:w="1331" w:type="pct"/>
+            <w:tcW w:w="1383" w:type="pct"/>
           </w:tcPr>
           <w:p>
             <w:pPr>
@@ -16099,7 +16096,7 @@
         </w:tc>
         <w:tc>
           <w:tcPr>
-            <w:tcW w:w="1384" w:type="pct"/>
+            <w:tcW w:w="1358" w:type="pct"/>
           </w:tcPr>
           <w:p>
             <w:pPr>
@@ -16136,7 +16133,7 @@
         </w:tc>
         <w:tc>
           <w:tcPr>
-            <w:tcW w:w="1408" w:type="pct"/>
+            <w:tcW w:w="1383" w:type="pct"/>
           </w:tcPr>
           <w:p>
             <w:pPr>
@@ -16149,7 +16146,7 @@
         </w:tc>
         <w:tc>
           <w:tcPr>
-            <w:tcW w:w="1331" w:type="pct"/>
+            <w:tcW w:w="1383" w:type="pct"/>
           </w:tcPr>
           <w:p>
             <w:pPr>
@@ -16175,7 +16172,7 @@
         </w:tc>
         <w:tc>
           <w:tcPr>
-            <w:tcW w:w="1384" w:type="pct"/>
+            <w:tcW w:w="1358" w:type="pct"/>
           </w:tcPr>
           <w:p>
             <w:pPr>
@@ -16212,7 +16209,7 @@
         </w:tc>
         <w:tc>
           <w:tcPr>
-            <w:tcW w:w="1408" w:type="pct"/>
+            <w:tcW w:w="1383" w:type="pct"/>
           </w:tcPr>
           <w:p>
             <w:pPr>
@@ -16225,7 +16222,7 @@
         </w:tc>
         <w:tc>
           <w:tcPr>
-            <w:tcW w:w="1331" w:type="pct"/>
+            <w:tcW w:w="1383" w:type="pct"/>
           </w:tcPr>
           <w:p>
             <w:pPr>
@@ -16251,7 +16248,7 @@
         </w:tc>
         <w:tc>
           <w:tcPr>
-            <w:tcW w:w="1384" w:type="pct"/>
+            <w:tcW w:w="1358" w:type="pct"/>
           </w:tcPr>
           <w:p>
             <w:pPr>
@@ -16288,7 +16285,7 @@
         </w:tc>
         <w:tc>
           <w:tcPr>
-            <w:tcW w:w="1408" w:type="pct"/>
+            <w:tcW w:w="1383" w:type="pct"/>
           </w:tcPr>
           <w:p>
             <w:pPr>
@@ -16301,7 +16298,7 @@
         </w:tc>
         <w:tc>
           <w:tcPr>
-            <w:tcW w:w="1331" w:type="pct"/>
+            <w:tcW w:w="1383" w:type="pct"/>
           </w:tcPr>
           <w:p>
             <w:pPr>
@@ -16327,7 +16324,7 @@
         </w:tc>
         <w:tc>
           <w:tcPr>
-            <w:tcW w:w="1384" w:type="pct"/>
+            <w:tcW w:w="1358" w:type="pct"/>
           </w:tcPr>
           <w:p>
             <w:pPr>
@@ -16364,7 +16361,7 @@
         </w:tc>
         <w:tc>
           <w:tcPr>
-            <w:tcW w:w="1408" w:type="pct"/>
+            <w:tcW w:w="1383" w:type="pct"/>
           </w:tcPr>
           <w:p>
             <w:pPr>
@@ -16377,7 +16374,7 @@
         </w:tc>
         <w:tc>
           <w:tcPr>
-            <w:tcW w:w="1331" w:type="pct"/>
+            <w:tcW w:w="1383" w:type="pct"/>
           </w:tcPr>
           <w:p>
             <w:pPr>
@@ -16403,7 +16400,7 @@
         </w:tc>
         <w:tc>
           <w:tcPr>
-            <w:tcW w:w="1384" w:type="pct"/>
+            <w:tcW w:w="1358" w:type="pct"/>
           </w:tcPr>
           <w:p>
             <w:pPr>
@@ -16440,7 +16437,7 @@
         </w:tc>
         <w:tc>
           <w:tcPr>
-            <w:tcW w:w="1408" w:type="pct"/>
+            <w:tcW w:w="1383" w:type="pct"/>
           </w:tcPr>
           <w:p>
             <w:pPr>
@@ -16453,7 +16450,7 @@
         </w:tc>
         <w:tc>
           <w:tcPr>
-            <w:tcW w:w="1331" w:type="pct"/>
+            <w:tcW w:w="1383" w:type="pct"/>
           </w:tcPr>
           <w:p>
             <w:pPr>
@@ -16479,7 +16476,7 @@
         </w:tc>
         <w:tc>
           <w:tcPr>
-            <w:tcW w:w="1384" w:type="pct"/>
+            <w:tcW w:w="1358" w:type="pct"/>
           </w:tcPr>
           <w:p>
             <w:pPr>
@@ -16516,7 +16513,7 @@
         </w:tc>
         <w:tc>
           <w:tcPr>
-            <w:tcW w:w="1408" w:type="pct"/>
+            <w:tcW w:w="1383" w:type="pct"/>
           </w:tcPr>
           <w:p>
             <w:pPr>
@@ -16529,7 +16526,7 @@
         </w:tc>
         <w:tc>
           <w:tcPr>
-            <w:tcW w:w="1331" w:type="pct"/>
+            <w:tcW w:w="1383" w:type="pct"/>
           </w:tcPr>
           <w:p>
             <w:pPr>
@@ -16555,7 +16552,7 @@
         </w:tc>
         <w:tc>
           <w:tcPr>
-            <w:tcW w:w="1384" w:type="pct"/>
+            <w:tcW w:w="1358" w:type="pct"/>
           </w:tcPr>
           <w:p>
             <w:pPr>
@@ -16592,7 +16589,7 @@
         </w:tc>
         <w:tc>
           <w:tcPr>
-            <w:tcW w:w="1408" w:type="pct"/>
+            <w:tcW w:w="1383" w:type="pct"/>
           </w:tcPr>
           <w:p>
             <w:pPr>
@@ -16605,7 +16602,7 @@
         </w:tc>
         <w:tc>
           <w:tcPr>
-            <w:tcW w:w="1331" w:type="pct"/>
+            <w:tcW w:w="1383" w:type="pct"/>
           </w:tcPr>
           <w:p>
             <w:pPr>
@@ -16631,7 +16628,7 @@
         </w:tc>
         <w:tc>
           <w:tcPr>
-            <w:tcW w:w="1384" w:type="pct"/>
+            <w:tcW w:w="1358" w:type="pct"/>
           </w:tcPr>
           <w:p>
             <w:pPr>
@@ -16668,7 +16665,7 @@
         </w:tc>
         <w:tc>
           <w:tcPr>
-            <w:tcW w:w="1408" w:type="pct"/>
+            <w:tcW w:w="1383" w:type="pct"/>
           </w:tcPr>
           <w:p>
             <w:pPr>
@@ -16681,7 +16678,7 @@
         </w:tc>
         <w:tc>
           <w:tcPr>
-            <w:tcW w:w="1331" w:type="pct"/>
+            <w:tcW w:w="1383" w:type="pct"/>
           </w:tcPr>
           <w:p>
             <w:pPr>
@@ -16707,7 +16704,7 @@
         </w:tc>
         <w:tc>
           <w:tcPr>
-            <w:tcW w:w="1384" w:type="pct"/>
+            <w:tcW w:w="1358" w:type="pct"/>
           </w:tcPr>
           <w:p>
             <w:pPr>
@@ -16744,7 +16741,7 @@
         </w:tc>
         <w:tc>
           <w:tcPr>
-            <w:tcW w:w="1408" w:type="pct"/>
+            <w:tcW w:w="1383" w:type="pct"/>
           </w:tcPr>
           <w:p>
             <w:pPr>
@@ -16757,7 +16754,7 @@
         </w:tc>
         <w:tc>
           <w:tcPr>
-            <w:tcW w:w="1331" w:type="pct"/>
+            <w:tcW w:w="1383" w:type="pct"/>
           </w:tcPr>
           <w:p>
             <w:pPr>
@@ -16783,7 +16780,7 @@
         </w:tc>
         <w:tc>
           <w:tcPr>
-            <w:tcW w:w="1384" w:type="pct"/>
+            <w:tcW w:w="1358" w:type="pct"/>
           </w:tcPr>
           <w:p>
             <w:pPr>
@@ -16820,7 +16817,7 @@
         </w:tc>
         <w:tc>
           <w:tcPr>
-            <w:tcW w:w="1408" w:type="pct"/>
+            <w:tcW w:w="1383" w:type="pct"/>
           </w:tcPr>
           <w:p>
             <w:pPr>
@@ -16833,7 +16830,7 @@
         </w:tc>
         <w:tc>
           <w:tcPr>
-            <w:tcW w:w="1331" w:type="pct"/>
+            <w:tcW w:w="1383" w:type="pct"/>
           </w:tcPr>
           <w:p>
             <w:pPr>
@@ -16859,7 +16856,7 @@
         </w:tc>
         <w:tc>
           <w:tcPr>
-            <w:tcW w:w="1384" w:type="pct"/>
+            <w:tcW w:w="1358" w:type="pct"/>
           </w:tcPr>
           <w:p>
             <w:pPr>
@@ -16896,7 +16893,7 @@
         </w:tc>
         <w:tc>
           <w:tcPr>
-            <w:tcW w:w="1408" w:type="pct"/>
+            <w:tcW w:w="1383" w:type="pct"/>
           </w:tcPr>
           <w:p>
             <w:pPr>
@@ -16909,7 +16906,7 @@
         </w:tc>
         <w:tc>
           <w:tcPr>
-            <w:tcW w:w="1331" w:type="pct"/>
+            <w:tcW w:w="1383" w:type="pct"/>
           </w:tcPr>
           <w:p>
             <w:pPr>
@@ -16935,7 +16932,7 @@
         </w:tc>
         <w:tc>
           <w:tcPr>
-            <w:tcW w:w="1384" w:type="pct"/>
+            <w:tcW w:w="1358" w:type="pct"/>
           </w:tcPr>
           <w:p>
             <w:pPr>
@@ -16972,7 +16969,7 @@
         </w:tc>
         <w:tc>
           <w:tcPr>
-            <w:tcW w:w="1408" w:type="pct"/>
+            <w:tcW w:w="1383" w:type="pct"/>
           </w:tcPr>
           <w:p>
             <w:pPr>
@@ -16985,7 +16982,7 @@
         </w:tc>
         <w:tc>
           <w:tcPr>
-            <w:tcW w:w="1331" w:type="pct"/>
+            <w:tcW w:w="1383" w:type="pct"/>
           </w:tcPr>
           <w:p>
             <w:pPr>
@@ -17011,7 +17008,7 @@
         </w:tc>
         <w:tc>
           <w:tcPr>
-            <w:tcW w:w="1384" w:type="pct"/>
+            <w:tcW w:w="1358" w:type="pct"/>
           </w:tcPr>
           <w:p>
             <w:pPr>
@@ -17048,7 +17045,7 @@
         </w:tc>
         <w:tc>
           <w:tcPr>
-            <w:tcW w:w="1408" w:type="pct"/>
+            <w:tcW w:w="1383" w:type="pct"/>
           </w:tcPr>
           <w:p>
             <w:pPr>
@@ -17061,7 +17058,7 @@
         </w:tc>
         <w:tc>
           <w:tcPr>
-            <w:tcW w:w="1331" w:type="pct"/>
+            <w:tcW w:w="1383" w:type="pct"/>
           </w:tcPr>
           <w:p>
             <w:pPr>
@@ -17087,7 +17084,7 @@
         </w:tc>
         <w:tc>
           <w:tcPr>
-            <w:tcW w:w="1384" w:type="pct"/>
+            <w:tcW w:w="1358" w:type="pct"/>
           </w:tcPr>
           <w:p>
             <w:pPr>
@@ -17095,82 +17092,6 @@
             </w:pPr>
             <w:r>
               <w:t>RF-5.9</w:t>
-            </w:r>
-          </w:p>
-        </w:tc>
-      </w:tr>
-      <w:tr>
-        <w:trPr>
-          <w:cantSplit/>
-        </w:trPr>
-        <w:tc>
-          <w:tcPr>
-            <w:tcW w:w="410" w:type="pct"/>
-          </w:tcPr>
-          <w:p>
-            <w:pPr>
-              <w:pStyle w:val="Celda"/>
-            </w:pPr>
-            <w:r>
-              <w:t>CU</w:t>
-            </w:r>
-            <w:r>
-              <w:noBreakHyphen/>
-            </w:r>
-            <w:r>
-              <w:t>18</w:t>
-            </w:r>
-          </w:p>
-        </w:tc>
-        <w:tc>
-          <w:tcPr>
-            <w:tcW w:w="1408" w:type="pct"/>
-          </w:tcPr>
-          <w:p>
-            <w:pPr>
-              <w:pStyle w:val="Celda"/>
-            </w:pPr>
-            <w:r>
-              <w:t>Consultar el dashboard y las estadísticas</w:t>
-            </w:r>
-          </w:p>
-        </w:tc>
-        <w:tc>
-          <w:tcPr>
-            <w:tcW w:w="1331" w:type="pct"/>
-          </w:tcPr>
-          <w:p>
-            <w:pPr>
-              <w:pStyle w:val="Celda"/>
-            </w:pPr>
-            <w:r>
-              <w:t>Administrador / Veterinario</w:t>
-            </w:r>
-          </w:p>
-        </w:tc>
-        <w:tc>
-          <w:tcPr>
-            <w:tcW w:w="467" w:type="pct"/>
-          </w:tcPr>
-          <w:p>
-            <w:pPr>
-              <w:pStyle w:val="Celda"/>
-            </w:pPr>
-            <w:r>
-              <w:t>6</w:t>
-            </w:r>
-          </w:p>
-        </w:tc>
-        <w:tc>
-          <w:tcPr>
-            <w:tcW w:w="1384" w:type="pct"/>
-          </w:tcPr>
-          <w:p>
-            <w:pPr>
-              <w:pStyle w:val="Celda"/>
-            </w:pPr>
-            <w:r>
-              <w:t>RF-6.1, RF-6.2</w:t>
             </w:r>
           </w:p>
         </w:tc>
@@ -17195,13 +17116,89 @@
               <w:noBreakHyphen/>
             </w:r>
             <w:r>
+              <w:t>18</w:t>
+            </w:r>
+          </w:p>
+        </w:tc>
+        <w:tc>
+          <w:tcPr>
+            <w:tcW w:w="1383" w:type="pct"/>
+          </w:tcPr>
+          <w:p>
+            <w:pPr>
+              <w:pStyle w:val="Celda"/>
+            </w:pPr>
+            <w:r>
+              <w:t>Consultar el dashboard y las estadísticas</w:t>
+            </w:r>
+          </w:p>
+        </w:tc>
+        <w:tc>
+          <w:tcPr>
+            <w:tcW w:w="1383" w:type="pct"/>
+          </w:tcPr>
+          <w:p>
+            <w:pPr>
+              <w:pStyle w:val="Celda"/>
+            </w:pPr>
+            <w:r>
+              <w:t>Administrador / Veterinario</w:t>
+            </w:r>
+          </w:p>
+        </w:tc>
+        <w:tc>
+          <w:tcPr>
+            <w:tcW w:w="467" w:type="pct"/>
+          </w:tcPr>
+          <w:p>
+            <w:pPr>
+              <w:pStyle w:val="Celda"/>
+            </w:pPr>
+            <w:r>
+              <w:t>6</w:t>
+            </w:r>
+          </w:p>
+        </w:tc>
+        <w:tc>
+          <w:tcPr>
+            <w:tcW w:w="1358" w:type="pct"/>
+          </w:tcPr>
+          <w:p>
+            <w:pPr>
+              <w:pStyle w:val="Celda"/>
+            </w:pPr>
+            <w:r>
+              <w:t>RF-6.1, RF-6.2</w:t>
+            </w:r>
+          </w:p>
+        </w:tc>
+      </w:tr>
+      <w:tr>
+        <w:trPr>
+          <w:cantSplit/>
+        </w:trPr>
+        <w:tc>
+          <w:tcPr>
+            <w:tcW w:w="410" w:type="pct"/>
+          </w:tcPr>
+          <w:p>
+            <w:pPr>
+              <w:pStyle w:val="Celda"/>
+            </w:pPr>
+            <w:r>
+              <w:t>CU</w:t>
+            </w:r>
+            <w:r>
+              <w:noBreakHyphen/>
+            </w:r>
+            <w:r>
               <w:t>19</w:t>
             </w:r>
           </w:p>
         </w:tc>
         <w:tc>
           <w:tcPr>
-            <w:tcW w:w="1408" w:type="pct"/>
+            <w:tcW w:w="1383" w:type="pct"/>
           </w:tcPr>
           <w:p>
             <w:pPr>
@@ -17214,7 +17211,7 @@
         </w:tc>
         <w:tc>
           <w:tcPr>
-            <w:tcW w:w="1331" w:type="pct"/>
+            <w:tcW w:w="1383" w:type="pct"/>
           </w:tcPr>
           <w:p>
             <w:pPr>
@@ -17240,7 +17237,7 @@
         </w:tc>
         <w:tc>
           <w:tcPr>
-            <w:tcW w:w="1384" w:type="pct"/>
+            <w:tcW w:w="1358" w:type="pct"/>
           </w:tcPr>
           <w:p>
             <w:pPr>
@@ -17277,7 +17274,7 @@
         </w:tc>
         <w:tc>
           <w:tcPr>
-            <w:tcW w:w="1408" w:type="pct"/>
+            <w:tcW w:w="1383" w:type="pct"/>
           </w:tcPr>
           <w:p>
             <w:pPr>
@@ -17290,7 +17287,7 @@
         </w:tc>
         <w:tc>
           <w:tcPr>
-            <w:tcW w:w="1331" w:type="pct"/>
+            <w:tcW w:w="1383" w:type="pct"/>
           </w:tcPr>
           <w:p>
             <w:pPr>
@@ -17316,7 +17313,7 @@
         </w:tc>
         <w:tc>
           <w:tcPr>
-            <w:tcW w:w="1384" w:type="pct"/>
+            <w:tcW w:w="1358" w:type="pct"/>
           </w:tcPr>
           <w:p>
             <w:pPr>
@@ -17353,7 +17350,7 @@
         </w:tc>
         <w:tc>
           <w:tcPr>
-            <w:tcW w:w="1408" w:type="pct"/>
+            <w:tcW w:w="1383" w:type="pct"/>
           </w:tcPr>
           <w:p>
             <w:pPr>
@@ -17366,7 +17363,7 @@
         </w:tc>
         <w:tc>
           <w:tcPr>
-            <w:tcW w:w="1331" w:type="pct"/>
+            <w:tcW w:w="1383" w:type="pct"/>
           </w:tcPr>
           <w:p>
             <w:pPr>
@@ -17392,7 +17389,7 @@
         </w:tc>
         <w:tc>
           <w:tcPr>
-            <w:tcW w:w="1384" w:type="pct"/>
+            <w:tcW w:w="1358" w:type="pct"/>
           </w:tcPr>
           <w:p>
             <w:pPr>
@@ -17429,7 +17426,7 @@
         </w:tc>
         <w:tc>
           <w:tcPr>
-            <w:tcW w:w="1408" w:type="pct"/>
+            <w:tcW w:w="1383" w:type="pct"/>
           </w:tcPr>
           <w:p>
             <w:pPr>
@@ -17442,7 +17439,7 @@
         </w:tc>
         <w:tc>
           <w:tcPr>
-            <w:tcW w:w="1331" w:type="pct"/>
+            <w:tcW w:w="1383" w:type="pct"/>
           </w:tcPr>
           <w:p>
             <w:pPr>
@@ -17468,7 +17465,7 @@
         </w:tc>
         <w:tc>
           <w:tcPr>
-            <w:tcW w:w="1384" w:type="pct"/>
+            <w:tcW w:w="1358" w:type="pct"/>
           </w:tcPr>
           <w:p>
             <w:pPr>
@@ -17486,7 +17483,7 @@
         <w:pStyle w:val="Ttulo2"/>
       </w:pPr>
       <w:bookmarkStart w:id="59" w:name="_5580fd549b2ecd3c29ad00fe23a279932ebe402"/>
-      <w:bookmarkStart w:id="60" w:name="_Toc243683918"/>
+      <w:bookmarkStart w:id="60" w:name="_Toc243862770"/>
       <w:bookmarkEnd w:id="57"/>
       <w:r>
         <w:t>5.2 Modelo de datos y diccionario de datos (v2.0)</w:t>
@@ -17507,10 +17504,7 @@
         <w:t>id_clinica</w:t>
       </w:r>
       <w:r>
-        <w:t xml:space="preserve"> </w:t>
-      </w:r>
-      <w:r>
-        <w:t>en los registros que pertenecen a una clínica, con excepciones globales explícitas para personas, mascotas, catálogos y Grafo I, y (b) nuevas entidades para la plataforma, los grafos, la reputación y las comunicaciones. El MER completo en Mermaid se especifica en el documento Modelo Entidad-Relación (MER).</w:t>
+        <w:t xml:space="preserve"> en los registros que pertenecen a una clínica, con excepciones globales explícitas para personas, mascotas, catálogos y Grafo I, y (b) nuevas entidades para la plataforma, los grafos, la reputación y las comunicaciones. El MER completo en Mermaid se especifica en el documento Modelo Entidad-Relación (MER).</w:t>
       </w:r>
     </w:p>
     <w:p>
@@ -17672,7 +17666,7 @@
               <w:pStyle w:val="Celda"/>
             </w:pPr>
             <w:r>
-              <w:t>Estado de la suscripción por clínica. (id_suscripcion PK, id_clinica FK, id_plan FK, estado, fecha_inicio, fecha_fin, al_dia)</w:t>
+              <w:t>Contrato y proyección de vigencia por clínica. (id_suscripcion PK, id_clinica FK, id_plan FK, estado, ciclo, gestion_cobro, periodo_inicio/fin exclusivo, estado_cobro, version_periodo, cobro_automatico, motivo_automatico_apagado, id_fuente_activa FK, autorizado_por FK, autorizado_en, retirado_en; fechas y al_dia compatibles)</w:t>
             </w:r>
           </w:p>
         </w:tc>
@@ -17690,6 +17684,193 @@
               <w:pStyle w:val="Celda"/>
             </w:pPr>
             <w:r>
+              <w:t>pagos_suscripcion</w:t>
+            </w:r>
+          </w:p>
+        </w:tc>
+        <w:tc>
+          <w:tcPr>
+            <w:tcW w:w="2901" w:type="pct"/>
+          </w:tcPr>
+          <w:p>
+            <w:pPr>
+              <w:pStyle w:val="Celda"/>
+            </w:pPr>
+            <w:r>
+              <w:t>Obligación y cotización inmutables, clínica/suscripción/plan, ciclo, moneda y centavos calculados en servidor; claves únicas de obligación y operación.</w:t>
+            </w:r>
+          </w:p>
+        </w:tc>
+      </w:tr>
+      <w:tr>
+        <w:trPr>
+          <w:cantSplit/>
+        </w:trPr>
+        <w:tc>
+          <w:tcPr>
+            <w:tcW w:w="2099" w:type="pct"/>
+          </w:tcPr>
+          <w:p>
+            <w:pPr>
+              <w:pStyle w:val="Celda"/>
+            </w:pPr>
+            <w:r>
+              <w:t>intentos_pago</w:t>
+            </w:r>
+          </w:p>
+        </w:tc>
+        <w:tc>
+          <w:tcPr>
+            <w:tcW w:w="2901" w:type="pct"/>
+          </w:tcPr>
+          <w:p>
+            <w:pPr>
+              <w:pStyle w:val="Celda"/>
+            </w:pPr>
+            <w:r>
+              <w:t>Intentos de la orden con referencia y transacción únicas por entorno, origen manual/automático, estado e incertidumbre; nunca datos completos del medio.</w:t>
+            </w:r>
+          </w:p>
+        </w:tc>
+      </w:tr>
+      <w:tr>
+        <w:trPr>
+          <w:cantSplit/>
+        </w:trPr>
+        <w:tc>
+          <w:tcPr>
+            <w:tcW w:w="2099" w:type="pct"/>
+          </w:tcPr>
+          <w:p>
+            <w:pPr>
+              <w:pStyle w:val="Celda"/>
+            </w:pPr>
+            <w:r>
+              <w:t>wompi_eventos</w:t>
+            </w:r>
+          </w:p>
+        </w:tc>
+        <w:tc>
+          <w:tcPr>
+            <w:tcW w:w="2901" w:type="pct"/>
+          </w:tcPr>
+          <w:p>
+            <w:pPr>
+              <w:pStyle w:val="Celda"/>
+            </w:pPr>
+            <w:r>
+              <w:t>Inbox durable deduplicado por huella canónica, entorno, transacción, checksum verificado y estado; vínculo a intento local. Revisión con revisado_por FK, fecha y nota, sin borrar la incidencia.</w:t>
+            </w:r>
+          </w:p>
+        </w:tc>
+      </w:tr>
+      <w:tr>
+        <w:trPr>
+          <w:cantSplit/>
+        </w:trPr>
+        <w:tc>
+          <w:tcPr>
+            <w:tcW w:w="2099" w:type="pct"/>
+          </w:tcPr>
+          <w:p>
+            <w:pPr>
+              <w:pStyle w:val="Celda"/>
+            </w:pPr>
+            <w:r>
+              <w:t>fuentes_pago</w:t>
+            </w:r>
+          </w:p>
+        </w:tc>
+        <w:tc>
+          <w:tcPr>
+            <w:tcW w:w="2901" w:type="pct"/>
+          </w:tcPr>
+          <w:p>
+            <w:pPr>
+              <w:pStyle w:val="Celda"/>
+            </w:pPr>
+            <w:r>
+              <w:t>Vínculo de clínica y fuente externa CARD/NEQUI, marca/últimos cuatro y prueba de aceptación/mandato; sin PAN, CVC, teléfono, tokens efímeros ni JWT.</w:t>
+            </w:r>
+          </w:p>
+        </w:tc>
+      </w:tr>
+      <w:tr>
+        <w:trPr>
+          <w:cantSplit/>
+        </w:trPr>
+        <w:tc>
+          <w:tcPr>
+            <w:tcW w:w="2099" w:type="pct"/>
+          </w:tcPr>
+          <w:p>
+            <w:pPr>
+              <w:pStyle w:val="Celda"/>
+            </w:pPr>
+            <w:r>
+              <w:lastRenderedPageBreak/>
+              <w:t>suscripcion_periodos</w:t>
+            </w:r>
+          </w:p>
+        </w:tc>
+        <w:tc>
+          <w:tcPr>
+            <w:tcW w:w="2901" w:type="pct"/>
+          </w:tcPr>
+          <w:p>
+            <w:pPr>
+              <w:pStyle w:val="Celda"/>
+            </w:pPr>
+            <w:r>
+              <w:t>Libro de concesiones inmutables por clínica/suscripción; origen Wompi, administrativo o legado. Un solo periodo por pago; motivo y actor en concesiones manuales.</w:t>
+            </w:r>
+          </w:p>
+        </w:tc>
+      </w:tr>
+      <w:tr>
+        <w:trPr>
+          <w:cantSplit/>
+        </w:trPr>
+        <w:tc>
+          <w:tcPr>
+            <w:tcW w:w="2099" w:type="pct"/>
+          </w:tcPr>
+          <w:p>
+            <w:pPr>
+              <w:pStyle w:val="Celda"/>
+            </w:pPr>
+            <w:r>
+              <w:t>avisos_suscripcion</w:t>
+            </w:r>
+          </w:p>
+        </w:tc>
+        <w:tc>
+          <w:tcPr>
+            <w:tcW w:w="2901" w:type="pct"/>
+          </w:tcPr>
+          <w:p>
+            <w:pPr>
+              <w:pStyle w:val="Celda"/>
+            </w:pPr>
+            <w:r>
+              <w:t>Outbox con unicidad por destinatario/tipo/obligación, programación, reclamación durable y resultado; SMTP posterior al commit.</w:t>
+            </w:r>
+          </w:p>
+        </w:tc>
+      </w:tr>
+      <w:tr>
+        <w:trPr>
+          <w:cantSplit/>
+        </w:trPr>
+        <w:tc>
+          <w:tcPr>
+            <w:tcW w:w="2099" w:type="pct"/>
+          </w:tcPr>
+          <w:p>
+            <w:pPr>
+              <w:pStyle w:val="Celda"/>
+            </w:pPr>
+            <w:r>
               <w:t>grafo_nodos</w:t>
             </w:r>
           </w:p>
@@ -17845,317 +18026,317 @@
               <w:pStyle w:val="Celda"/>
             </w:pPr>
             <w:r>
+              <w:t>usuario_clinica</w:t>
+            </w:r>
+          </w:p>
+        </w:tc>
+        <w:tc>
+          <w:tcPr>
+            <w:tcW w:w="2901" w:type="pct"/>
+          </w:tcPr>
+          <w:p>
+            <w:pPr>
+              <w:pStyle w:val="Celda"/>
+            </w:pPr>
+            <w:r>
+              <w:t>Roles de personal de cada persona en cada clínica. (id_usuario PK/FK, id_clinica PK/FK, id_rol FK, estado, fecha_vinculo)</w:t>
+            </w:r>
+          </w:p>
+        </w:tc>
+      </w:tr>
+      <w:tr>
+        <w:trPr>
+          <w:cantSplit/>
+        </w:trPr>
+        <w:tc>
+          <w:tcPr>
+            <w:tcW w:w="2099" w:type="pct"/>
+          </w:tcPr>
+          <w:p>
+            <w:pPr>
+              <w:pStyle w:val="Celda"/>
+            </w:pPr>
+            <w:r>
+              <w:t>veterinario_perfil</w:t>
+            </w:r>
+          </w:p>
+        </w:tc>
+        <w:tc>
+          <w:tcPr>
+            <w:tcW w:w="2901" w:type="pct"/>
+          </w:tcPr>
+          <w:p>
+            <w:pPr>
+              <w:pStyle w:val="Celda"/>
+            </w:pPr>
+            <w:r>
+              <w:t>Datos públicos del veterinario. (id_veterinario PK/FK, bio, url_foto)</w:t>
+            </w:r>
+          </w:p>
+        </w:tc>
+      </w:tr>
+      <w:tr>
+        <w:trPr>
+          <w:cantSplit/>
+        </w:trPr>
+        <w:tc>
+          <w:tcPr>
+            <w:tcW w:w="2099" w:type="pct"/>
+          </w:tcPr>
+          <w:p>
+            <w:pPr>
+              <w:pStyle w:val="Celda"/>
+            </w:pPr>
+            <w:r>
+              <w:t>especialidades</w:t>
+            </w:r>
+          </w:p>
+        </w:tc>
+        <w:tc>
+          <w:tcPr>
+            <w:tcW w:w="2901" w:type="pct"/>
+          </w:tcPr>
+          <w:p>
+            <w:pPr>
+              <w:pStyle w:val="Celda"/>
+            </w:pPr>
+            <w:r>
+              <w:t>Catálogo global de especialidades. (id_especialidad PK, nombre)</w:t>
+            </w:r>
+          </w:p>
+        </w:tc>
+      </w:tr>
+      <w:tr>
+        <w:trPr>
+          <w:cantSplit/>
+        </w:trPr>
+        <w:tc>
+          <w:tcPr>
+            <w:tcW w:w="2099" w:type="pct"/>
+          </w:tcPr>
+          <w:p>
+            <w:pPr>
+              <w:pStyle w:val="Celda"/>
+            </w:pPr>
+            <w:r>
+              <w:t>veterinario_especialidades</w:t>
+            </w:r>
+          </w:p>
+        </w:tc>
+        <w:tc>
+          <w:tcPr>
+            <w:tcW w:w="2901" w:type="pct"/>
+          </w:tcPr>
+          <w:p>
+            <w:pPr>
+              <w:pStyle w:val="Celda"/>
+            </w:pPr>
+            <w:r>
+              <w:t>Especialidades de cada veterinario (N:M). (id_veterinario PK/FK, id_especialidad PK/FK)</w:t>
+            </w:r>
+          </w:p>
+        </w:tc>
+      </w:tr>
+      <w:tr>
+        <w:trPr>
+          <w:cantSplit/>
+        </w:trPr>
+        <w:tc>
+          <w:tcPr>
+            <w:tcW w:w="2099" w:type="pct"/>
+          </w:tcPr>
+          <w:p>
+            <w:pPr>
+              <w:pStyle w:val="Celda"/>
+            </w:pPr>
+            <w:r>
+              <w:t>consentimientos_datos</w:t>
+            </w:r>
+          </w:p>
+        </w:tc>
+        <w:tc>
+          <w:tcPr>
+            <w:tcW w:w="2901" w:type="pct"/>
+          </w:tcPr>
+          <w:p>
+            <w:pPr>
+              <w:pStyle w:val="Celda"/>
+            </w:pPr>
+            <w:r>
+              <w:t>Prueba de la autorización de tratamiento de datos. (id_consentimiento PK, id_usuario FK, version_politica, medio, ip_address, fecha)</w:t>
+            </w:r>
+          </w:p>
+        </w:tc>
+      </w:tr>
+      <w:tr>
+        <w:trPr>
+          <w:cantSplit/>
+        </w:trPr>
+        <w:tc>
+          <w:tcPr>
+            <w:tcW w:w="2099" w:type="pct"/>
+          </w:tcPr>
+          <w:p>
+            <w:pPr>
+              <w:pStyle w:val="Celda"/>
+            </w:pPr>
+            <w:r>
+              <w:t>plantillas_comunicacion</w:t>
+            </w:r>
+          </w:p>
+        </w:tc>
+        <w:tc>
+          <w:tcPr>
+            <w:tcW w:w="2901" w:type="pct"/>
+          </w:tcPr>
+          <w:p>
+            <w:pPr>
+              <w:pStyle w:val="Celda"/>
+            </w:pPr>
+            <w:r>
+              <w:t>Plantillas y tiempos de envío por clínica. (id_plantilla PK, id_clinica FK, tipo, asunto, cuerpo, dias_anticipacion, hora_envio)</w:t>
+            </w:r>
+          </w:p>
+        </w:tc>
+      </w:tr>
+      <w:tr>
+        <w:trPr>
+          <w:cantSplit/>
+        </w:trPr>
+        <w:tc>
+          <w:tcPr>
+            <w:tcW w:w="2099" w:type="pct"/>
+          </w:tcPr>
+          <w:p>
+            <w:pPr>
+              <w:pStyle w:val="Celda"/>
+            </w:pPr>
+            <w:r>
+              <w:t>propietario_clinica</w:t>
+            </w:r>
+          </w:p>
+        </w:tc>
+        <w:tc>
+          <w:tcPr>
+            <w:tcW w:w="2901" w:type="pct"/>
+          </w:tcPr>
+          <w:p>
+            <w:pPr>
+              <w:pStyle w:val="Celda"/>
+            </w:pPr>
+            <w:r>
+              <w:t>Tabla puente propietario↔clínica (identidad global del propietario, correo único). (id_propietario PK/FK, id_clinica PK/FK, estado, fecha_vinculo, autoriza_historia_compartida)</w:t>
+            </w:r>
+          </w:p>
+        </w:tc>
+      </w:tr>
+      <w:tr>
+        <w:trPr>
+          <w:cantSplit/>
+        </w:trPr>
+        <w:tc>
+          <w:tcPr>
+            <w:tcW w:w="2099" w:type="pct"/>
+          </w:tcPr>
+          <w:p>
+            <w:pPr>
+              <w:pStyle w:val="Celda"/>
+            </w:pPr>
+            <w:r>
+              <w:t>mascota_clinica</w:t>
+            </w:r>
+          </w:p>
+        </w:tc>
+        <w:tc>
+          <w:tcPr>
+            <w:tcW w:w="2901" w:type="pct"/>
+          </w:tcPr>
+          <w:p>
+            <w:pPr>
+              <w:pStyle w:val="Celda"/>
+            </w:pPr>
+            <w:r>
+              <w:t>Tabla puente mascota↔clínica (mascota global). (id_mascota PK/FK, id_clinica PK/FK, numero_historia_clinica, estado, fecha_vinculo)</w:t>
+            </w:r>
+          </w:p>
+        </w:tc>
+      </w:tr>
+      <w:tr>
+        <w:trPr>
+          <w:cantSplit/>
+        </w:trPr>
+        <w:tc>
+          <w:tcPr>
+            <w:tcW w:w="2099" w:type="pct"/>
+          </w:tcPr>
+          <w:p>
+            <w:pPr>
+              <w:pStyle w:val="Celda"/>
+            </w:pPr>
+            <w:r>
+              <w:t>carnet_escaneos</w:t>
+            </w:r>
+          </w:p>
+        </w:tc>
+        <w:tc>
+          <w:tcPr>
+            <w:tcW w:w="2901" w:type="pct"/>
+          </w:tcPr>
+          <w:p>
+            <w:pPr>
+              <w:pStyle w:val="Celda"/>
+            </w:pPr>
+            <w:r>
+              <w:t>Escaneos del carnet público. (id_escaneo PK, id_mascota FK, fecha, ip_hash, latitud, longitud, notificado)</w:t>
+            </w:r>
+          </w:p>
+        </w:tc>
+      </w:tr>
+      <w:tr>
+        <w:trPr>
+          <w:cantSplit/>
+        </w:trPr>
+        <w:tc>
+          <w:tcPr>
+            <w:tcW w:w="2099" w:type="pct"/>
+          </w:tcPr>
+          <w:p>
+            <w:pPr>
+              <w:pStyle w:val="Celda"/>
+            </w:pPr>
+            <w:r>
+              <w:t>horarios_veterinario</w:t>
+            </w:r>
+          </w:p>
+        </w:tc>
+        <w:tc>
+          <w:tcPr>
+            <w:tcW w:w="2901" w:type="pct"/>
+          </w:tcPr>
+          <w:p>
+            <w:pPr>
+              <w:pStyle w:val="Celda"/>
+            </w:pPr>
+            <w:r>
+              <w:t>Horario recurrente del veterinario por clínica y día. (id PK, id_veterinario FK, id_clinica FK, dia_semana, hora_inicio, hora_fin, activo)</w:t>
+            </w:r>
+          </w:p>
+        </w:tc>
+      </w:tr>
+      <w:tr>
+        <w:trPr>
+          <w:cantSplit/>
+        </w:trPr>
+        <w:tc>
+          <w:tcPr>
+            <w:tcW w:w="2099" w:type="pct"/>
+          </w:tcPr>
+          <w:p>
+            <w:pPr>
+              <w:pStyle w:val="Celda"/>
+            </w:pPr>
+            <w:r>
               <w:lastRenderedPageBreak/>
-              <w:t>usuario_clinica</w:t>
-            </w:r>
-          </w:p>
-        </w:tc>
-        <w:tc>
-          <w:tcPr>
-            <w:tcW w:w="2901" w:type="pct"/>
-          </w:tcPr>
-          <w:p>
-            <w:pPr>
-              <w:pStyle w:val="Celda"/>
-            </w:pPr>
-            <w:r>
-              <w:t>Roles de personal de cada persona en cada clínica. (id_usuario PK/FK, id_clinica PK/FK, id_rol FK, estado, fecha_vinculo)</w:t>
-            </w:r>
-          </w:p>
-        </w:tc>
-      </w:tr>
-      <w:tr>
-        <w:trPr>
-          <w:cantSplit/>
-        </w:trPr>
-        <w:tc>
-          <w:tcPr>
-            <w:tcW w:w="2099" w:type="pct"/>
-          </w:tcPr>
-          <w:p>
-            <w:pPr>
-              <w:pStyle w:val="Celda"/>
-            </w:pPr>
-            <w:r>
-              <w:t>veterinario_perfil</w:t>
-            </w:r>
-          </w:p>
-        </w:tc>
-        <w:tc>
-          <w:tcPr>
-            <w:tcW w:w="2901" w:type="pct"/>
-          </w:tcPr>
-          <w:p>
-            <w:pPr>
-              <w:pStyle w:val="Celda"/>
-            </w:pPr>
-            <w:r>
-              <w:t>Datos públicos del veterinario. (id_veterinario PK/FK, bio, url_foto)</w:t>
-            </w:r>
-          </w:p>
-        </w:tc>
-      </w:tr>
-      <w:tr>
-        <w:trPr>
-          <w:cantSplit/>
-        </w:trPr>
-        <w:tc>
-          <w:tcPr>
-            <w:tcW w:w="2099" w:type="pct"/>
-          </w:tcPr>
-          <w:p>
-            <w:pPr>
-              <w:pStyle w:val="Celda"/>
-            </w:pPr>
-            <w:r>
-              <w:t>especialidades</w:t>
-            </w:r>
-          </w:p>
-        </w:tc>
-        <w:tc>
-          <w:tcPr>
-            <w:tcW w:w="2901" w:type="pct"/>
-          </w:tcPr>
-          <w:p>
-            <w:pPr>
-              <w:pStyle w:val="Celda"/>
-            </w:pPr>
-            <w:r>
-              <w:t>Catálogo global de especialidades. (id_especialidad PK, nombre)</w:t>
-            </w:r>
-          </w:p>
-        </w:tc>
-      </w:tr>
-      <w:tr>
-        <w:trPr>
-          <w:cantSplit/>
-        </w:trPr>
-        <w:tc>
-          <w:tcPr>
-            <w:tcW w:w="2099" w:type="pct"/>
-          </w:tcPr>
-          <w:p>
-            <w:pPr>
-              <w:pStyle w:val="Celda"/>
-            </w:pPr>
-            <w:r>
-              <w:t>veterinario_especialidades</w:t>
-            </w:r>
-          </w:p>
-        </w:tc>
-        <w:tc>
-          <w:tcPr>
-            <w:tcW w:w="2901" w:type="pct"/>
-          </w:tcPr>
-          <w:p>
-            <w:pPr>
-              <w:pStyle w:val="Celda"/>
-            </w:pPr>
-            <w:r>
-              <w:t>Especialidades de cada veterinario (N:M). (id_veterinario PK/FK, id_especialidad PK/FK)</w:t>
-            </w:r>
-          </w:p>
-        </w:tc>
-      </w:tr>
-      <w:tr>
-        <w:trPr>
-          <w:cantSplit/>
-        </w:trPr>
-        <w:tc>
-          <w:tcPr>
-            <w:tcW w:w="2099" w:type="pct"/>
-          </w:tcPr>
-          <w:p>
-            <w:pPr>
-              <w:pStyle w:val="Celda"/>
-            </w:pPr>
-            <w:r>
-              <w:t>consentimientos_datos</w:t>
-            </w:r>
-          </w:p>
-        </w:tc>
-        <w:tc>
-          <w:tcPr>
-            <w:tcW w:w="2901" w:type="pct"/>
-          </w:tcPr>
-          <w:p>
-            <w:pPr>
-              <w:pStyle w:val="Celda"/>
-            </w:pPr>
-            <w:r>
-              <w:t>Prueba de la autorización de tratamiento de datos. (id_consentimiento PK, id_usuario FK, version_politica, medio, ip_address, fecha)</w:t>
-            </w:r>
-          </w:p>
-        </w:tc>
-      </w:tr>
-      <w:tr>
-        <w:trPr>
-          <w:cantSplit/>
-        </w:trPr>
-        <w:tc>
-          <w:tcPr>
-            <w:tcW w:w="2099" w:type="pct"/>
-          </w:tcPr>
-          <w:p>
-            <w:pPr>
-              <w:pStyle w:val="Celda"/>
-            </w:pPr>
-            <w:r>
-              <w:t>plantillas_comunicacion</w:t>
-            </w:r>
-          </w:p>
-        </w:tc>
-        <w:tc>
-          <w:tcPr>
-            <w:tcW w:w="2901" w:type="pct"/>
-          </w:tcPr>
-          <w:p>
-            <w:pPr>
-              <w:pStyle w:val="Celda"/>
-            </w:pPr>
-            <w:r>
-              <w:t>Plantillas y tiempos de envío por clínica. (id_plantilla PK, id_clinica FK, tipo, asunto, cuerpo, dias_anticipacion, hora_envio)</w:t>
-            </w:r>
-          </w:p>
-        </w:tc>
-      </w:tr>
-      <w:tr>
-        <w:trPr>
-          <w:cantSplit/>
-        </w:trPr>
-        <w:tc>
-          <w:tcPr>
-            <w:tcW w:w="2099" w:type="pct"/>
-          </w:tcPr>
-          <w:p>
-            <w:pPr>
-              <w:pStyle w:val="Celda"/>
-            </w:pPr>
-            <w:r>
-              <w:t>propietario_clinica</w:t>
-            </w:r>
-          </w:p>
-        </w:tc>
-        <w:tc>
-          <w:tcPr>
-            <w:tcW w:w="2901" w:type="pct"/>
-          </w:tcPr>
-          <w:p>
-            <w:pPr>
-              <w:pStyle w:val="Celda"/>
-            </w:pPr>
-            <w:r>
-              <w:t>Tabla puente propietario↔clínica (identidad global del propietario, correo único). (id_propietario PK/FK, id_clinica PK/FK, estado, fecha_vinculo, autoriza_historia_compartida)</w:t>
-            </w:r>
-          </w:p>
-        </w:tc>
-      </w:tr>
-      <w:tr>
-        <w:trPr>
-          <w:cantSplit/>
-        </w:trPr>
-        <w:tc>
-          <w:tcPr>
-            <w:tcW w:w="2099" w:type="pct"/>
-          </w:tcPr>
-          <w:p>
-            <w:pPr>
-              <w:pStyle w:val="Celda"/>
-            </w:pPr>
-            <w:r>
-              <w:t>mascota_clinica</w:t>
-            </w:r>
-          </w:p>
-        </w:tc>
-        <w:tc>
-          <w:tcPr>
-            <w:tcW w:w="2901" w:type="pct"/>
-          </w:tcPr>
-          <w:p>
-            <w:pPr>
-              <w:pStyle w:val="Celda"/>
-            </w:pPr>
-            <w:r>
-              <w:t>Tabla puente mascota↔clínica (mascota global). (id_mascota PK/FK, id_clinica PK/FK, numero_historia_clinica, estado, fecha_vinculo)</w:t>
-            </w:r>
-          </w:p>
-        </w:tc>
-      </w:tr>
-      <w:tr>
-        <w:trPr>
-          <w:cantSplit/>
-        </w:trPr>
-        <w:tc>
-          <w:tcPr>
-            <w:tcW w:w="2099" w:type="pct"/>
-          </w:tcPr>
-          <w:p>
-            <w:pPr>
-              <w:pStyle w:val="Celda"/>
-            </w:pPr>
-            <w:r>
-              <w:t>carnet_escaneos</w:t>
-            </w:r>
-          </w:p>
-        </w:tc>
-        <w:tc>
-          <w:tcPr>
-            <w:tcW w:w="2901" w:type="pct"/>
-          </w:tcPr>
-          <w:p>
-            <w:pPr>
-              <w:pStyle w:val="Celda"/>
-            </w:pPr>
-            <w:r>
-              <w:t>Escaneos del carnet público. (id_escaneo PK, id_mascota FK, fecha, ip_hash, latitud, longitud, notificado)</w:t>
-            </w:r>
-          </w:p>
-        </w:tc>
-      </w:tr>
-      <w:tr>
-        <w:trPr>
-          <w:cantSplit/>
-        </w:trPr>
-        <w:tc>
-          <w:tcPr>
-            <w:tcW w:w="2099" w:type="pct"/>
-          </w:tcPr>
-          <w:p>
-            <w:pPr>
-              <w:pStyle w:val="Celda"/>
-            </w:pPr>
-            <w:r>
-              <w:t>horarios_veterinario</w:t>
-            </w:r>
-          </w:p>
-        </w:tc>
-        <w:tc>
-          <w:tcPr>
-            <w:tcW w:w="2901" w:type="pct"/>
-          </w:tcPr>
-          <w:p>
-            <w:pPr>
-              <w:pStyle w:val="Celda"/>
-            </w:pPr>
-            <w:r>
-              <w:t>Horario recurrente del veterinario por clínica y día. (id PK, id_veterinario FK, id_clinica FK, dia_semana, hora_inicio, hora_fin, activo)</w:t>
-            </w:r>
-          </w:p>
-        </w:tc>
-      </w:tr>
-      <w:tr>
-        <w:trPr>
-          <w:cantSplit/>
-        </w:trPr>
-        <w:tc>
-          <w:tcPr>
-            <w:tcW w:w="2099" w:type="pct"/>
-          </w:tcPr>
-          <w:p>
-            <w:pPr>
-              <w:pStyle w:val="Celda"/>
-            </w:pPr>
-            <w:r>
               <w:t>propuestas_horario</w:t>
             </w:r>
           </w:p>
@@ -18373,14 +18554,7 @@
         <w:t>Destino preparatorio M4/B1:</w:t>
       </w:r>
       <w:r>
-        <w:t xml:space="preserve"> </w:t>
-      </w:r>
-      <w:r>
-        <w:t xml:space="preserve">cierres_clinica, bloques_agenda, solicitudes_agenda (revisión/derivación/espera), pausas_cita, operaciones_agenda y eventos_agenda; ampliaciones de </w:t>
-      </w:r>
-      <w:r>
-        <w:lastRenderedPageBreak/>
-        <w:t>citas, ausencias_veterinario, reasignaciones e ingresos_emergencia, con diccionario/restricciones/transición en el MER. No están instaladas en alpha.4; schema_migraciones sigue siendo técnica y no se suma al conteo de negocio.</w:t>
+        <w:t xml:space="preserve"> cierres_clinica, bloques_agenda, solicitudes_agenda (revisión/derivación/espera), pausas_cita, operaciones_agenda y eventos_agenda; ampliaciones de citas, ausencias_veterinario, reasignaciones e ingresos_emergencia, con diccionario/restricciones/transición en el MER. No están instaladas en alpha.4; schema_migraciones sigue siendo técnica y no se suma al conteo de negocio.</w:t>
       </w:r>
     </w:p>
     <w:p>
@@ -18593,10 +18767,7 @@
         <w:t>tratamientos</w:t>
       </w:r>
       <w:r>
-        <w:t xml:space="preserve"> </w:t>
-      </w:r>
-      <w:r>
-        <w:t xml:space="preserve">suma el nodo del fármaco en el Grafo I y sus fechas de inicio y fin, para conocer la medicación vigente; </w:t>
+        <w:t xml:space="preserve"> suma el nodo del fármaco en el Grafo I y sus fechas de inicio y fin, para conocer la medicación vigente; </w:t>
       </w:r>
       <w:r>
         <w:rPr>
@@ -18695,10 +18866,7 @@
         <w:t>citas.prioridad</w:t>
       </w:r>
       <w:r>
-        <w:t xml:space="preserve"> </w:t>
-      </w:r>
-      <w:r>
-        <w:t xml:space="preserve">pasa a ser el nivel de triage de 4 niveles; </w:t>
+        <w:t xml:space="preserve"> pasa a ser el nivel de triage de 4 niveles; </w:t>
       </w:r>
       <w:r>
         <w:rPr>
@@ -18832,6 +19000,7 @@
         <w:rPr>
           <w:rStyle w:val="VerbatimChar"/>
         </w:rPr>
+        <w:lastRenderedPageBreak/>
         <w:t>id_clinica</w:t>
       </w:r>
       <w:r>
@@ -18906,10 +19075,9 @@
         <w:pStyle w:val="Ttulo2"/>
       </w:pPr>
       <w:bookmarkStart w:id="61" w:name="_fbf38eebe414c78cb475c989b20e7851be1b9a4"/>
-      <w:bookmarkStart w:id="62" w:name="_Toc243683919"/>
+      <w:bookmarkStart w:id="62" w:name="_Toc243862771"/>
       <w:bookmarkEnd w:id="59"/>
       <w:r>
-        <w:lastRenderedPageBreak/>
         <w:t>5.3 Matriz de trazabilidad (requisito → módulo → verificación)</w:t>
       </w:r>
       <w:bookmarkEnd w:id="62"/>
@@ -19895,7 +20063,7 @@
         <w:pStyle w:val="Ttulo2"/>
       </w:pPr>
       <w:bookmarkStart w:id="63" w:name="_af48f3c1dcd6ad7c9bf690234a607d52526f60f"/>
-      <w:bookmarkStart w:id="64" w:name="_Toc243683920"/>
+      <w:bookmarkStart w:id="64" w:name="_Toc243862772"/>
       <w:bookmarkEnd w:id="61"/>
       <w:r>
         <w:t>5.4 Criterios de aceptación global</w:t>
@@ -19917,10 +20085,7 @@
         <w:t>v2.0</w:t>
       </w:r>
       <w:r>
-        <w:t xml:space="preserve"> </w:t>
-      </w:r>
-      <w:r>
-        <w:t xml:space="preserve">se considera conforme cuando: (a) el 100% de los RF de prioridad Alta asignados a sus historias están implementados y superan su verificación; (b) el 80% o más de los RF de prioridad Media asignados a sus historias están implementados; (c) el </w:t>
+        <w:t xml:space="preserve"> se considera conforme cuando: (a) el 100% de los RF de prioridad Alta asignados a sus historias están implementados y superan su verificación; (b) el 80% o más de los RF de prioridad Media asignados a sus historias están implementados; (c) el </w:t>
       </w:r>
       <w:r>
         <w:rPr>
@@ -19930,10 +20095,7 @@
         <w:t>aislamiento multi-inquilino (RNF-11)</w:t>
       </w:r>
       <w:r>
-        <w:t xml:space="preserve"> </w:t>
-      </w:r>
-      <w:r>
-        <w:t xml:space="preserve">se verifica sin fugas entre clínicas; (d) los dos grafos (I y II) se demuestran funcionando en el flujo de consulta y de agenda; (e) no existen defectos críticos ni mayores sin cerrar; y (f) la documentación técnica (README, ERS, MER y manual) está en el repositorio. La </w:t>
+        <w:t xml:space="preserve"> se verifica sin fugas entre clínicas; (d) los dos grafos (I y II) se demuestran funcionando en el flujo de consulta y de agenda; (e) no existen defectos críticos ni mayores sin cerrar; y (f) la documentación técnica (README, ERS, MER y manual) está en el repositorio. La </w:t>
       </w:r>
       <w:r>
         <w:rPr>
@@ -19951,9 +20113,10 @@
         <w:pStyle w:val="Ttulo2"/>
       </w:pPr>
       <w:bookmarkStart w:id="65" w:name="_0d285be43461a565caa5d7afb2af5b21132b4e6"/>
-      <w:bookmarkStart w:id="66" w:name="_Toc243683921"/>
+      <w:bookmarkStart w:id="66" w:name="_Toc243862773"/>
       <w:bookmarkEnd w:id="63"/>
       <w:r>
+        <w:lastRenderedPageBreak/>
         <w:t>5.5 Equivalencia de identificadores (Revisión 3.1)</w:t>
       </w:r>
       <w:bookmarkEnd w:id="66"/>
@@ -19971,7 +20134,6 @@
         <w:pStyle w:val="Rotulo"/>
       </w:pPr>
       <w:r>
-        <w:lastRenderedPageBreak/>
         <w:t>Tabla 26</w:t>
       </w:r>
     </w:p>
@@ -21694,6 +21856,7 @@
               <w:pStyle w:val="Celda"/>
             </w:pPr>
             <w:r>
+              <w:lastRenderedPageBreak/>
               <w:t>RF</w:t>
             </w:r>
             <w:r>
@@ -21856,7 +22019,6 @@
               <w:pStyle w:val="Celda"/>
             </w:pPr>
             <w:r>
-              <w:lastRenderedPageBreak/>
               <w:t>RF</w:t>
             </w:r>
             <w:r>
@@ -23418,6 +23580,7 @@
               <w:pStyle w:val="Celda"/>
             </w:pPr>
             <w:r>
+              <w:lastRenderedPageBreak/>
               <w:t>RNF</w:t>
             </w:r>
             <w:r>
@@ -23547,7 +23710,6 @@
               <w:pStyle w:val="Celda"/>
             </w:pPr>
             <w:r>
-              <w:lastRenderedPageBreak/>
               <w:t>RNF</w:t>
             </w:r>
             <w:r>
@@ -24148,6 +24310,21 @@
           <w:iCs/>
         </w:rPr>
         <w:t>Fin del ERS, revisión 3.4. Los modelos referenciados (MER v2, procesos de negocio, flujos del sistema y modelo de los grafos) están en MER y Modelos y diagramas.</w:t>
+      </w:r>
+    </w:p>
+    <w:p>
+      <w:pPr>
+        <w:pStyle w:val="Textoindependiente"/>
+      </w:pPr>
+      <w:r>
+        <w:rPr>
+          <w:b/>
+          <w:bCs/>
+        </w:rPr>
+        <w:t>Equivalencia M0-S:</w:t>
+      </w:r>
+      <w:r>
+        <w:t xml:space="preserve"> RF-F.1 → RF-0.7 (v2.1); se retira del catálogo futuro sin renumerar RF-F.2–8. El administrador clínico paga; el super-administrador consulta metadatos, ajusta concesiones y recupera pagos existentes por ID y motivo mediante API privada, sin elegir clínica ni crear cargos.</w:t>
       </w:r>
       <w:bookmarkEnd w:id="55"/>
       <w:bookmarkEnd w:id="65"/>
@@ -24285,7 +24462,7 @@
               <w:noProof/>
             </w:rPr>
             <w:drawing>
-              <wp:inline distT="0" distB="0" distL="0" distR="0" wp14:anchorId="55595955" wp14:editId="55595956">
+              <wp:inline distT="0" distB="0" distL="0" distR="0" wp14:anchorId="284607C5" wp14:editId="284607C6">
                 <wp:extent cx="324000" cy="324000"/>
                 <wp:effectExtent l="0" t="0" r="0" b="0"/>
                 <wp:docPr id="9001" name="Logo Zooki"/>
@@ -24345,7 +24522,7 @@
               <w:sz w:val="17"/>
               <w:szCs w:val="17"/>
             </w:rPr>
-            <w:t>Zooki v2.0</w:t>
+            <w:t>Zooki v2.1</w:t>
           </w:r>
         </w:p>
         <w:p>
@@ -24379,7 +24556,7 @@
               <w:sz w:val="17"/>
               <w:szCs w:val="17"/>
             </w:rPr>
-            <w:t>Rev. 3.6</w:t>
+            <w:t>Rev. 3.7</w:t>
           </w:r>
         </w:p>
         <w:p>
@@ -24452,7 +24629,7 @@
   <w:abstractNum w:abstractNumId="0" w15:restartNumberingAfterBreak="0">
     <w:nsid w:val="0000A990"/>
     <w:multiLevelType w:val="multilevel"/>
-    <w:tmpl w:val="BD98EF00"/>
+    <w:tmpl w:val="A9387E78"/>
     <w:lvl w:ilvl="0">
       <w:numFmt w:val="bullet"/>
       <w:lvlText w:val=" "/>
@@ -24529,7 +24706,7 @@
   <w:abstractNum w:abstractNumId="1" w15:restartNumberingAfterBreak="0">
     <w:nsid w:val="0000A991"/>
     <w:multiLevelType w:val="multilevel"/>
-    <w:tmpl w:val="EAF6631C"/>
+    <w:tmpl w:val="678A8E86"/>
     <w:lvl w:ilvl="0">
       <w:numFmt w:val="bullet"/>
       <w:lvlText w:val=""/>
@@ -24630,22 +24807,22 @@
       </w:rPr>
     </w:lvl>
   </w:abstractNum>
-  <w:num w:numId="1" w16cid:durableId="1701585668">
+  <w:num w:numId="1" w16cid:durableId="1386103666">
     <w:abstractNumId w:val="0"/>
   </w:num>
-  <w:num w:numId="2" w16cid:durableId="1452359244">
+  <w:num w:numId="2" w16cid:durableId="839544960">
     <w:abstractNumId w:val="1"/>
   </w:num>
-  <w:num w:numId="3" w16cid:durableId="649821999">
+  <w:num w:numId="3" w16cid:durableId="1551649761">
     <w:abstractNumId w:val="1"/>
   </w:num>
-  <w:num w:numId="4" w16cid:durableId="346056445">
+  <w:num w:numId="4" w16cid:durableId="616136500">
     <w:abstractNumId w:val="1"/>
   </w:num>
-  <w:num w:numId="5" w16cid:durableId="680014829">
+  <w:num w:numId="5" w16cid:durableId="700133515">
     <w:abstractNumId w:val="1"/>
   </w:num>
-  <w:num w:numId="6" w16cid:durableId="1860656566">
+  <w:num w:numId="6" w16cid:durableId="1214274782">
     <w:abstractNumId w:val="1"/>
   </w:num>
 </w:numbering>

</xml_diff>

<commit_message>
feat(plataforma): soporte con aviso por correo y detalle, y pulido P1 de interfaz (RE-0.3.4, RE-T.13.2, RE-6.2.4)
</commit_message>
<xml_diff>
--- a/public/docs/descargas/ers.docx
+++ b/public/docs/descargas/ers.docx
@@ -21,7 +21,7 @@
         <w:pStyle w:val="PortadaProyecto"/>
       </w:pPr>
       <w:r>
-        <w:t>Proyecto: Zooki v2.1</w:t>
+        <w:t>Proyecto: Zooki v2.2</w:t>
       </w:r>
     </w:p>
     <w:p>
@@ -93,7 +93,7 @@
           <w:noProof/>
         </w:rPr>
         <w:drawing>
-          <wp:inline distT="0" distB="0" distL="0" distR="0" wp14:anchorId="284607B5" wp14:editId="284607B6">
+          <wp:inline distT="0" distB="0" distL="0" distR="0" wp14:anchorId="390AB879" wp14:editId="390AB87A">
             <wp:extent cx="395999" cy="405503"/>
             <wp:effectExtent l="0" t="0" r="0" b="0"/>
             <wp:docPr id="10" name="Picture"/>
@@ -1047,7 +1047,7 @@
       <w:r>
         <w:fldChar w:fldCharType="separate"/>
       </w:r>
-      <w:hyperlink w:anchor="_Toc243862750" w:history="1">
+      <w:hyperlink w:anchor="_Toc243900810" w:history="1">
         <w:r>
           <w:rPr>
             <w:rStyle w:val="Hipervnculo"/>
@@ -1074,7 +1074,7 @@
             <w:noProof/>
             <w:webHidden/>
           </w:rPr>
-          <w:instrText xml:space="preserve"> PAGEREF _Toc243862750 \h </w:instrText>
+          <w:instrText xml:space="preserve"> PAGEREF _Toc243900810 \h </w:instrText>
         </w:r>
         <w:r>
           <w:rPr>
@@ -1117,7 +1117,7 @@
           <w14:ligatures w14:val="standardContextual"/>
         </w:rPr>
       </w:pPr>
-      <w:hyperlink w:anchor="_Toc243862751" w:history="1">
+      <w:hyperlink w:anchor="_Toc243900811" w:history="1">
         <w:r>
           <w:rPr>
             <w:rStyle w:val="Hipervnculo"/>
@@ -1144,7 +1144,7 @@
             <w:noProof/>
             <w:webHidden/>
           </w:rPr>
-          <w:instrText xml:space="preserve"> PAGEREF _Toc243862751 \h </w:instrText>
+          <w:instrText xml:space="preserve"> PAGEREF _Toc243900811 \h </w:instrText>
         </w:r>
         <w:r>
           <w:rPr>
@@ -1187,7 +1187,7 @@
           <w14:ligatures w14:val="standardContextual"/>
         </w:rPr>
       </w:pPr>
-      <w:hyperlink w:anchor="_Toc243862752" w:history="1">
+      <w:hyperlink w:anchor="_Toc243900812" w:history="1">
         <w:r>
           <w:rPr>
             <w:rStyle w:val="Hipervnculo"/>
@@ -1214,7 +1214,7 @@
             <w:noProof/>
             <w:webHidden/>
           </w:rPr>
-          <w:instrText xml:space="preserve"> PAGEREF _Toc243862752 \h </w:instrText>
+          <w:instrText xml:space="preserve"> PAGEREF _Toc243900812 \h </w:instrText>
         </w:r>
         <w:r>
           <w:rPr>
@@ -1257,7 +1257,7 @@
           <w14:ligatures w14:val="standardContextual"/>
         </w:rPr>
       </w:pPr>
-      <w:hyperlink w:anchor="_Toc243862753" w:history="1">
+      <w:hyperlink w:anchor="_Toc243900813" w:history="1">
         <w:r>
           <w:rPr>
             <w:rStyle w:val="Hipervnculo"/>
@@ -1284,7 +1284,7 @@
             <w:noProof/>
             <w:webHidden/>
           </w:rPr>
-          <w:instrText xml:space="preserve"> PAGEREF _Toc243862753 \h </w:instrText>
+          <w:instrText xml:space="preserve"> PAGEREF _Toc243900813 \h </w:instrText>
         </w:r>
         <w:r>
           <w:rPr>
@@ -1327,7 +1327,7 @@
           <w14:ligatures w14:val="standardContextual"/>
         </w:rPr>
       </w:pPr>
-      <w:hyperlink w:anchor="_Toc243862754" w:history="1">
+      <w:hyperlink w:anchor="_Toc243900814" w:history="1">
         <w:r>
           <w:rPr>
             <w:rStyle w:val="Hipervnculo"/>
@@ -1354,7 +1354,7 @@
             <w:noProof/>
             <w:webHidden/>
           </w:rPr>
-          <w:instrText xml:space="preserve"> PAGEREF _Toc243862754 \h </w:instrText>
+          <w:instrText xml:space="preserve"> PAGEREF _Toc243900814 \h </w:instrText>
         </w:r>
         <w:r>
           <w:rPr>
@@ -1397,7 +1397,7 @@
           <w14:ligatures w14:val="standardContextual"/>
         </w:rPr>
       </w:pPr>
-      <w:hyperlink w:anchor="_Toc243862755" w:history="1">
+      <w:hyperlink w:anchor="_Toc243900815" w:history="1">
         <w:r>
           <w:rPr>
             <w:rStyle w:val="Hipervnculo"/>
@@ -1424,7 +1424,7 @@
             <w:noProof/>
             <w:webHidden/>
           </w:rPr>
-          <w:instrText xml:space="preserve"> PAGEREF _Toc243862755 \h </w:instrText>
+          <w:instrText xml:space="preserve"> PAGEREF _Toc243900815 \h </w:instrText>
         </w:r>
         <w:r>
           <w:rPr>
@@ -1470,7 +1470,7 @@
           <w14:ligatures w14:val="standardContextual"/>
         </w:rPr>
       </w:pPr>
-      <w:hyperlink w:anchor="_Toc243862756" w:history="1">
+      <w:hyperlink w:anchor="_Toc243900816" w:history="1">
         <w:r>
           <w:rPr>
             <w:rStyle w:val="Hipervnculo"/>
@@ -1497,7 +1497,7 @@
             <w:noProof/>
             <w:webHidden/>
           </w:rPr>
-          <w:instrText xml:space="preserve"> PAGEREF _Toc243862756 \h </w:instrText>
+          <w:instrText xml:space="preserve"> PAGEREF _Toc243900816 \h </w:instrText>
         </w:r>
         <w:r>
           <w:rPr>
@@ -1540,7 +1540,7 @@
           <w14:ligatures w14:val="standardContextual"/>
         </w:rPr>
       </w:pPr>
-      <w:hyperlink w:anchor="_Toc243862757" w:history="1">
+      <w:hyperlink w:anchor="_Toc243900817" w:history="1">
         <w:r>
           <w:rPr>
             <w:rStyle w:val="Hipervnculo"/>
@@ -1567,7 +1567,7 @@
             <w:noProof/>
             <w:webHidden/>
           </w:rPr>
-          <w:instrText xml:space="preserve"> PAGEREF _Toc243862757 \h </w:instrText>
+          <w:instrText xml:space="preserve"> PAGEREF _Toc243900817 \h </w:instrText>
         </w:r>
         <w:r>
           <w:rPr>
@@ -1610,7 +1610,7 @@
           <w14:ligatures w14:val="standardContextual"/>
         </w:rPr>
       </w:pPr>
-      <w:hyperlink w:anchor="_Toc243862758" w:history="1">
+      <w:hyperlink w:anchor="_Toc243900818" w:history="1">
         <w:r>
           <w:rPr>
             <w:rStyle w:val="Hipervnculo"/>
@@ -1637,7 +1637,7 @@
             <w:noProof/>
             <w:webHidden/>
           </w:rPr>
-          <w:instrText xml:space="preserve"> PAGEREF _Toc243862758 \h </w:instrText>
+          <w:instrText xml:space="preserve"> PAGEREF _Toc243900818 \h </w:instrText>
         </w:r>
         <w:r>
           <w:rPr>
@@ -1680,7 +1680,7 @@
           <w14:ligatures w14:val="standardContextual"/>
         </w:rPr>
       </w:pPr>
-      <w:hyperlink w:anchor="_Toc243862759" w:history="1">
+      <w:hyperlink w:anchor="_Toc243900819" w:history="1">
         <w:r>
           <w:rPr>
             <w:rStyle w:val="Hipervnculo"/>
@@ -1707,7 +1707,7 @@
             <w:noProof/>
             <w:webHidden/>
           </w:rPr>
-          <w:instrText xml:space="preserve"> PAGEREF _Toc243862759 \h </w:instrText>
+          <w:instrText xml:space="preserve"> PAGEREF _Toc243900819 \h </w:instrText>
         </w:r>
         <w:r>
           <w:rPr>
@@ -1750,7 +1750,7 @@
           <w14:ligatures w14:val="standardContextual"/>
         </w:rPr>
       </w:pPr>
-      <w:hyperlink w:anchor="_Toc243862760" w:history="1">
+      <w:hyperlink w:anchor="_Toc243900820" w:history="1">
         <w:r>
           <w:rPr>
             <w:rStyle w:val="Hipervnculo"/>
@@ -1777,7 +1777,7 @@
             <w:noProof/>
             <w:webHidden/>
           </w:rPr>
-          <w:instrText xml:space="preserve"> PAGEREF _Toc243862760 \h </w:instrText>
+          <w:instrText xml:space="preserve"> PAGEREF _Toc243900820 \h </w:instrText>
         </w:r>
         <w:r>
           <w:rPr>
@@ -1820,7 +1820,7 @@
           <w14:ligatures w14:val="standardContextual"/>
         </w:rPr>
       </w:pPr>
-      <w:hyperlink w:anchor="_Toc243862761" w:history="1">
+      <w:hyperlink w:anchor="_Toc243900821" w:history="1">
         <w:r>
           <w:rPr>
             <w:rStyle w:val="Hipervnculo"/>
@@ -1847,7 +1847,7 @@
             <w:noProof/>
             <w:webHidden/>
           </w:rPr>
-          <w:instrText xml:space="preserve"> PAGEREF _Toc243862761 \h </w:instrText>
+          <w:instrText xml:space="preserve"> PAGEREF _Toc243900821 \h </w:instrText>
         </w:r>
         <w:r>
           <w:rPr>
@@ -1890,7 +1890,7 @@
           <w14:ligatures w14:val="standardContextual"/>
         </w:rPr>
       </w:pPr>
-      <w:hyperlink w:anchor="_Toc243862762" w:history="1">
+      <w:hyperlink w:anchor="_Toc243900822" w:history="1">
         <w:r>
           <w:rPr>
             <w:rStyle w:val="Hipervnculo"/>
@@ -1917,7 +1917,7 @@
             <w:noProof/>
             <w:webHidden/>
           </w:rPr>
-          <w:instrText xml:space="preserve"> PAGEREF _Toc243862762 \h </w:instrText>
+          <w:instrText xml:space="preserve"> PAGEREF _Toc243900822 \h </w:instrText>
         </w:r>
         <w:r>
           <w:rPr>
@@ -1963,7 +1963,7 @@
           <w14:ligatures w14:val="standardContextual"/>
         </w:rPr>
       </w:pPr>
-      <w:hyperlink w:anchor="_Toc243862763" w:history="1">
+      <w:hyperlink w:anchor="_Toc243900823" w:history="1">
         <w:r>
           <w:rPr>
             <w:rStyle w:val="Hipervnculo"/>
@@ -1990,7 +1990,7 @@
             <w:noProof/>
             <w:webHidden/>
           </w:rPr>
-          <w:instrText xml:space="preserve"> PAGEREF _Toc243862763 \h </w:instrText>
+          <w:instrText xml:space="preserve"> PAGEREF _Toc243900823 \h </w:instrText>
         </w:r>
         <w:r>
           <w:rPr>
@@ -2033,7 +2033,7 @@
           <w14:ligatures w14:val="standardContextual"/>
         </w:rPr>
       </w:pPr>
-      <w:hyperlink w:anchor="_Toc243862764" w:history="1">
+      <w:hyperlink w:anchor="_Toc243900824" w:history="1">
         <w:r>
           <w:rPr>
             <w:rStyle w:val="Hipervnculo"/>
@@ -2060,7 +2060,7 @@
             <w:noProof/>
             <w:webHidden/>
           </w:rPr>
-          <w:instrText xml:space="preserve"> PAGEREF _Toc243862764 \h </w:instrText>
+          <w:instrText xml:space="preserve"> PAGEREF _Toc243900824 \h </w:instrText>
         </w:r>
         <w:r>
           <w:rPr>
@@ -2103,7 +2103,7 @@
           <w14:ligatures w14:val="standardContextual"/>
         </w:rPr>
       </w:pPr>
-      <w:hyperlink w:anchor="_Toc243862765" w:history="1">
+      <w:hyperlink w:anchor="_Toc243900825" w:history="1">
         <w:r>
           <w:rPr>
             <w:rStyle w:val="Hipervnculo"/>
@@ -2130,7 +2130,7 @@
             <w:noProof/>
             <w:webHidden/>
           </w:rPr>
-          <w:instrText xml:space="preserve"> PAGEREF _Toc243862765 \h </w:instrText>
+          <w:instrText xml:space="preserve"> PAGEREF _Toc243900825 \h </w:instrText>
         </w:r>
         <w:r>
           <w:rPr>
@@ -2173,7 +2173,7 @@
           <w14:ligatures w14:val="standardContextual"/>
         </w:rPr>
       </w:pPr>
-      <w:hyperlink w:anchor="_Toc243862766" w:history="1">
+      <w:hyperlink w:anchor="_Toc243900826" w:history="1">
         <w:r>
           <w:rPr>
             <w:rStyle w:val="Hipervnculo"/>
@@ -2200,7 +2200,7 @@
             <w:noProof/>
             <w:webHidden/>
           </w:rPr>
-          <w:instrText xml:space="preserve"> PAGEREF _Toc243862766 \h </w:instrText>
+          <w:instrText xml:space="preserve"> PAGEREF _Toc243900826 \h </w:instrText>
         </w:r>
         <w:r>
           <w:rPr>
@@ -2246,7 +2246,7 @@
           <w14:ligatures w14:val="standardContextual"/>
         </w:rPr>
       </w:pPr>
-      <w:hyperlink w:anchor="_Toc243862767" w:history="1">
+      <w:hyperlink w:anchor="_Toc243900827" w:history="1">
         <w:r>
           <w:rPr>
             <w:rStyle w:val="Hipervnculo"/>
@@ -2273,7 +2273,7 @@
             <w:noProof/>
             <w:webHidden/>
           </w:rPr>
-          <w:instrText xml:space="preserve"> PAGEREF _Toc243862767 \h </w:instrText>
+          <w:instrText xml:space="preserve"> PAGEREF _Toc243900827 \h </w:instrText>
         </w:r>
         <w:r>
           <w:rPr>
@@ -2319,7 +2319,7 @@
           <w14:ligatures w14:val="standardContextual"/>
         </w:rPr>
       </w:pPr>
-      <w:hyperlink w:anchor="_Toc243862768" w:history="1">
+      <w:hyperlink w:anchor="_Toc243900828" w:history="1">
         <w:r>
           <w:rPr>
             <w:rStyle w:val="Hipervnculo"/>
@@ -2346,7 +2346,7 @@
             <w:noProof/>
             <w:webHidden/>
           </w:rPr>
-          <w:instrText xml:space="preserve"> PAGEREF _Toc243862768 \h </w:instrText>
+          <w:instrText xml:space="preserve"> PAGEREF _Toc243900828 \h </w:instrText>
         </w:r>
         <w:r>
           <w:rPr>
@@ -2389,7 +2389,7 @@
           <w14:ligatures w14:val="standardContextual"/>
         </w:rPr>
       </w:pPr>
-      <w:hyperlink w:anchor="_Toc243862769" w:history="1">
+      <w:hyperlink w:anchor="_Toc243900829" w:history="1">
         <w:r>
           <w:rPr>
             <w:rStyle w:val="Hipervnculo"/>
@@ -2416,7 +2416,7 @@
             <w:noProof/>
             <w:webHidden/>
           </w:rPr>
-          <w:instrText xml:space="preserve"> PAGEREF _Toc243862769 \h </w:instrText>
+          <w:instrText xml:space="preserve"> PAGEREF _Toc243900829 \h </w:instrText>
         </w:r>
         <w:r>
           <w:rPr>
@@ -2459,7 +2459,7 @@
           <w14:ligatures w14:val="standardContextual"/>
         </w:rPr>
       </w:pPr>
-      <w:hyperlink w:anchor="_Toc243862770" w:history="1">
+      <w:hyperlink w:anchor="_Toc243900830" w:history="1">
         <w:r>
           <w:rPr>
             <w:rStyle w:val="Hipervnculo"/>
@@ -2486,7 +2486,7 @@
             <w:noProof/>
             <w:webHidden/>
           </w:rPr>
-          <w:instrText xml:space="preserve"> PAGEREF _Toc243862770 \h </w:instrText>
+          <w:instrText xml:space="preserve"> PAGEREF _Toc243900830 \h </w:instrText>
         </w:r>
         <w:r>
           <w:rPr>
@@ -2529,7 +2529,7 @@
           <w14:ligatures w14:val="standardContextual"/>
         </w:rPr>
       </w:pPr>
-      <w:hyperlink w:anchor="_Toc243862771" w:history="1">
+      <w:hyperlink w:anchor="_Toc243900831" w:history="1">
         <w:r>
           <w:rPr>
             <w:rStyle w:val="Hipervnculo"/>
@@ -2556,7 +2556,7 @@
             <w:noProof/>
             <w:webHidden/>
           </w:rPr>
-          <w:instrText xml:space="preserve"> PAGEREF _Toc243862771 \h </w:instrText>
+          <w:instrText xml:space="preserve"> PAGEREF _Toc243900831 \h </w:instrText>
         </w:r>
         <w:r>
           <w:rPr>
@@ -2599,7 +2599,7 @@
           <w14:ligatures w14:val="standardContextual"/>
         </w:rPr>
       </w:pPr>
-      <w:hyperlink w:anchor="_Toc243862772" w:history="1">
+      <w:hyperlink w:anchor="_Toc243900832" w:history="1">
         <w:r>
           <w:rPr>
             <w:rStyle w:val="Hipervnculo"/>
@@ -2626,7 +2626,7 @@
             <w:noProof/>
             <w:webHidden/>
           </w:rPr>
-          <w:instrText xml:space="preserve"> PAGEREF _Toc243862772 \h </w:instrText>
+          <w:instrText xml:space="preserve"> PAGEREF _Toc243900832 \h </w:instrText>
         </w:r>
         <w:r>
           <w:rPr>
@@ -2669,7 +2669,7 @@
           <w14:ligatures w14:val="standardContextual"/>
         </w:rPr>
       </w:pPr>
-      <w:hyperlink w:anchor="_Toc243862773" w:history="1">
+      <w:hyperlink w:anchor="_Toc243900833" w:history="1">
         <w:r>
           <w:rPr>
             <w:rStyle w:val="Hipervnculo"/>
@@ -2696,7 +2696,7 @@
             <w:noProof/>
             <w:webHidden/>
           </w:rPr>
-          <w:instrText xml:space="preserve"> PAGEREF _Toc243862773 \h </w:instrText>
+          <w:instrText xml:space="preserve"> PAGEREF _Toc243900833 \h </w:instrText>
         </w:r>
         <w:r>
           <w:rPr>
@@ -2808,7 +2808,10 @@
         <w:t>plataforma SaaS multi-inquilino</w:t>
       </w:r>
       <w:r>
-        <w:t xml:space="preserve"> e incorpora dos capacidades diferenciadoras basadas en grafos (soporte a la decisión clínica y agendamiento inteligente), además de suscripción por planes, registro autónomo de clínicas, carnet digital con QR y reputación de veterinarios. Esta revisión se alinea al estándar </w:t>
+        <w:t xml:space="preserve"> </w:t>
+      </w:r>
+      <w:r>
+        <w:t xml:space="preserve">e incorpora dos capacidades diferenciadoras basadas en grafos (soporte a la decisión clínica y agendamiento inteligente), además de suscripción por planes, registro autónomo de clínicas, carnet digital con QR y reputación de veterinarios. Esta revisión se alinea al estándar </w:t>
       </w:r>
       <w:r>
         <w:rPr>
@@ -2838,7 +2841,10 @@
         <w:t>revisión 3.1</w:t>
       </w:r>
       <w:r>
-        <w:t xml:space="preserve"> (5 de octubre de 2026) recoge la revisión completa de la especificación: identifica cada requisito funcional con el número de su módulo (</w:t>
+        <w:t xml:space="preserve"> </w:t>
+      </w:r>
+      <w:r>
+        <w:t>(5 de octubre de 2026) recoge la revisión completa de la especificación: identifica cada requisito funcional con el número de su módulo (</w:t>
       </w:r>
       <w:r>
         <w:rPr>
@@ -2856,7 +2862,16 @@
         <w:t>id_usuario</w:t>
       </w:r>
       <w:r>
-        <w:t xml:space="preserve"> numérico como clave (§5.2); especifica el cálculo del triage y la agenda inteligente completa (RF-2.12, RF-4.11 a RF-4.15, RF-7.5); protege el registro de clínicas, el carnet QR y la reputación (RF-0.3, RF-5.7, RF-5.8, RF-8.3); fija los límites del plan gratuito, el comportamiento al bajar de plan y la excepción de las urgencias (RF-0.4 a RF-0.6); agrega el derecho de supresión, el dashboard y la página pública (RF-5.9, RF-6.1, RF-6.2, RF-9.1); endurece la sesión (RNF-12 a RNF-15); completa el modelo de datos (§5.2) y registra las capas avanzadas del plan profesional como requisito futuro (RF-F.8). La </w:t>
+        <w:t xml:space="preserve"> </w:t>
+      </w:r>
+      <w:r>
+        <w:t>numérico como clave (§5.2); especifica el cálculo del triage y la agenda inteligente completa (RF-2.12, RF-4.11 a RF-4.15, RF-7.5); protege el registro de clínicas, el carnet QR y la reputación (RF-0.3, RF-5.7, RF-5.8, RF-8.3); fija los límites del plan gratuito, el comportamiento al bajar de plan y la excepción de las urgencias (RF-0.4 a RF-0.6); agrega el derecho de supresión, el dashboard y la página pública (RF-5.9, RF-6.1, RF-6.2, RF-9.1); endurece la sesión (RNF-12 a RNF-15); completa el modelo de dat</w:t>
+      </w:r>
+      <w:r>
+        <w:t>os (§5.2) y registra las capas avanzadas del plan profesional como requisito futuro (RF-F.8). La</w:t>
+      </w:r>
+      <w:r>
+        <w:t xml:space="preserve"> </w:t>
       </w:r>
       <w:r>
         <w:rPr>
@@ -2866,7 +2881,16 @@
         <w:t>revisión 3.2</w:t>
       </w:r>
       <w:r>
-        <w:t xml:space="preserve"> corrige las incoherencias detectadas al preparar la construcción: el alcance se reparte entre las entregas v2.0 y v2.1 y los criterios de aceptación se evalúan por entrega (§5.4); el aislamiento declara sus excepciones globales y la alerta genérica de interacción con medicación protegida de otra clínica (RNF-11); la urgencia presencial sin identidad verificada usa una ficha provisional (RF-4.10); entre sobrecupos naranja rige el orden de llegada (RF-4.7); y las ausencias del veterinario se registran por fecha y hora (§5.2). La </w:t>
+        <w:t xml:space="preserve"> </w:t>
+      </w:r>
+      <w:r>
+        <w:t>corrige las incoherencias detectadas al preparar la construcción: el alcance se reparte entre las entregas v2.0 y v2.1 y los criterios de aceptación se evalúan por entrega (§5.4); el aislamiento declara sus excepciones globales y la alerta genérica de interacción con medicación protegida de otra clínica (RNF-11); la urgencia presencial sin identidad verificada usa una ficha provisional (RF-4.10); entre sobrecupos naranja rige el orden de llegada (RF-4.7); y las ausencias del veterinario se registran por fec</w:t>
+      </w:r>
+      <w:r>
+        <w:t>ha y hora (§5.2). La</w:t>
+      </w:r>
+      <w:r>
+        <w:t xml:space="preserve"> </w:t>
       </w:r>
       <w:r>
         <w:rPr>
@@ -2896,7 +2920,10 @@
         <w:t>revisión 3.4</w:t>
       </w:r>
       <w:r>
-        <w:t xml:space="preserve"> (14 de octubre de 2026) acompaña la versión </w:t>
+        <w:t xml:space="preserve"> </w:t>
+      </w:r>
+      <w:r>
+        <w:t xml:space="preserve">(14 de octubre de 2026) acompaña la versión </w:t>
       </w:r>
       <w:r>
         <w:rPr>
@@ -2930,7 +2957,10 @@
         <w:t>schema_migraciones</w:t>
       </w:r>
       <w:r>
-        <w:t xml:space="preserve"> es una tabla técnica adicional del migrador. Se completan síntomas, sugerencias, prescripción, alergias y mapa; el triage operativo sigue en M4. Validación veterinaria del conocimiento pendiente.</w:t>
+        <w:t xml:space="preserve"> </w:t>
+      </w:r>
+      <w:r>
+        <w:t>es una tabla técnica adicional del migrador. Se completan síntomas, sugerencias, prescripción, alergias y mapa; el triage operativo sigue en M4. Validación veterinaria del conocimiento pendiente.</w:t>
       </w:r>
     </w:p>
     <w:p>
@@ -2976,7 +3006,10 @@
         <w:t>Salvedad confirmada por el dueño (23/10/2026):</w:t>
       </w:r>
       <w:r>
-        <w:t xml:space="preserve"> el QR del portal enviado en el correo de alta (RF-5.3, RE-5.8.4) sigue pendiente para una entrega aparte. El correo conserva el enlace de acceso; Carnet B entrega el QR de emergencia de la mascota sin ampliar ese envío.</w:t>
+        <w:t xml:space="preserve"> </w:t>
+      </w:r>
+      <w:r>
+        <w:t>el QR del portal enviado en el correo de alta (RF-5.3, RE-5.8.4) sigue pendiente para una entrega aparte. El correo conserva el enlace de acceso; Carnet B entrega el QR de emergencia de la mascota sin ampliar ese envío.</w:t>
       </w:r>
     </w:p>
     <w:p>
@@ -2984,7 +3017,7 @@
         <w:pStyle w:val="Ttulo1"/>
       </w:pPr>
       <w:bookmarkStart w:id="0" w:name="_0e2973c2e3c317285bf344b2034a52754788c6d"/>
-      <w:bookmarkStart w:id="1" w:name="_Toc243862750"/>
+      <w:bookmarkStart w:id="1" w:name="_Toc243900810"/>
       <w:r>
         <w:lastRenderedPageBreak/>
         <w:t>1. Introducción</w:t>
@@ -2996,7 +3029,7 @@
         <w:pStyle w:val="Ttulo2"/>
       </w:pPr>
       <w:bookmarkStart w:id="2" w:name="_53ca1eb396407438b910fbafb578b446b614ca3"/>
-      <w:bookmarkStart w:id="3" w:name="_Toc243862751"/>
+      <w:bookmarkStart w:id="3" w:name="_Toc243900811"/>
       <w:r>
         <w:t>1.1 Propósito</w:t>
       </w:r>
@@ -3037,7 +3070,10 @@
         <w:t>v2.1</w:t>
       </w:r>
       <w:r>
-        <w:t xml:space="preserve"> del plan de historias. Sirve como referente para el diseño, la implementación, las pruebas y la validación. Cada requisito se enuncia siguiendo las características de calidad del estándar ISO/IEC/IEEE 29148:2018 (necesario, verificable, no ambiguo, singular y trazable), con un identificador único y un criterio de verificación asociado.</w:t>
+        <w:t xml:space="preserve"> </w:t>
+      </w:r>
+      <w:r>
+        <w:t>del plan de historias. Sirve como referente para el diseño, la implementación, las pruebas y la validación. Cada requisito se enuncia siguiendo las características de calidad del estándar ISO/IEC/IEEE 29148:2018 (necesario, verificable, no ambiguo, singular y trazable), con un identificador único y un criterio de verificación asociado.</w:t>
       </w:r>
     </w:p>
     <w:p>
@@ -3045,7 +3081,7 @@
         <w:pStyle w:val="Ttulo2"/>
       </w:pPr>
       <w:bookmarkStart w:id="4" w:name="_807e0e4b2e93a972a9fa0860b3c406e1abe614d"/>
-      <w:bookmarkStart w:id="5" w:name="_Toc243862752"/>
+      <w:bookmarkStart w:id="5" w:name="_Toc243900812"/>
       <w:bookmarkEnd w:id="2"/>
       <w:r>
         <w:t>1.2 Alcance</w:t>
@@ -3067,7 +3103,10 @@
         <w:t>aplicación web SaaS multi-inquilino</w:t>
       </w:r>
       <w:r>
-        <w:t xml:space="preserve"> que permite a varias clínicas veterinarias pequeñas gestionar su operación clínica sobre una misma plataforma, con los datos de cada clínica aislados entre sí. El alcance completo de la v2 abarca las capacidades siguientes. Su reparto entre v2.0 y v2.1 lo fija el plan de entregas; una capacidad descrita aquí no se presume incluida en la primera entrega.</w:t>
+        <w:t xml:space="preserve"> </w:t>
+      </w:r>
+      <w:r>
+        <w:t>que permite a varias clínicas veterinarias pequeñas gestionar su operación clínica sobre una misma plataforma, con los datos de cada clínica aislados entre sí. El alcance completo de la v2 abarca las capacidades siguientes. Su reparto entre v2.0 y v2.1 lo fija el plan de entregas; una capacidad descrita aquí no se presume incluida en la primera entrega.</w:t>
       </w:r>
     </w:p>
     <w:p>
@@ -3086,7 +3125,10 @@
         <w:t>Plataforma y clínicas:</w:t>
       </w:r>
       <w:r>
-        <w:t xml:space="preserve"> registro autónomo (self-service) de clínicas, panel del super-administrador, suscripción por planes con control de límites (freemium) y configuración por clínica.</w:t>
+        <w:t xml:space="preserve"> </w:t>
+      </w:r>
+      <w:r>
+        <w:t>registro autónomo (self-service) de clínicas, panel del super-administrador, suscripción por planes con control de límites (freemium) y configuración por clínica.</w:t>
       </w:r>
     </w:p>
     <w:p>
@@ -3134,7 +3176,10 @@
         <w:t>Soporte a la decisión clínica (Grafo I):</w:t>
       </w:r>
       <w:r>
-        <w:t xml:space="preserve"> copiloto que, durante la consulta, sugiere diagnósticos ordenados por peso y advierte sobre toxicidades e interacciones mediante un grafo de conocimiento con signo.</w:t>
+        <w:t xml:space="preserve"> </w:t>
+      </w:r>
+      <w:r>
+        <w:t>copiloto que, durante la consulta, sugiere diagnósticos ordenados por peso y advierte sobre toxicidades e interacciones mediante un grafo de conocimiento con signo.</w:t>
       </w:r>
     </w:p>
     <w:p>
@@ -3191,7 +3236,10 @@
         <w:t>Portal del propietario:</w:t>
       </w:r>
       <w:r>
-        <w:t xml:space="preserve"> auto-registro, vinculación a las clínicas que él elige, auto-agendamiento y cancelación de citas, centro de notificaciones, </w:t>
+        <w:t xml:space="preserve"> </w:t>
+      </w:r>
+      <w:r>
+        <w:t xml:space="preserve">auto-registro, vinculación a las clínicas que él elige, auto-agendamiento y cancelación de citas, centro de notificaciones, </w:t>
       </w:r>
       <w:r>
         <w:rPr>
@@ -3258,7 +3306,10 @@
         <w:t>Acceso y seguridad:</w:t>
       </w:r>
       <w:r>
-        <w:t xml:space="preserve"> autenticación local y federada (Google), control de acceso por roles y </w:t>
+        <w:t xml:space="preserve"> </w:t>
+      </w:r>
+      <w:r>
+        <w:t xml:space="preserve">autenticación local y federada (Google), control de acceso por roles y </w:t>
       </w:r>
       <w:r>
         <w:rPr>
@@ -3294,7 +3345,10 @@
         <w:t>deseables</w:t>
       </w:r>
       <w:r>
-        <w:t xml:space="preserve"> (recetas en PDF, motor de salud preventiva por protocolos y PWA instalable) se contemplan como evolución (§2.6). El cobro de suscripción con Wompi es RF-0.7, implementado en 2.1.0; sustituye la exclusión anterior de RF-F.1. La activación con dinero real requiere resolver D8/D10 y la validación operativa del proveedor.</w:t>
+        <w:t xml:space="preserve"> (recetas en PDF, motor de salud preventiva por protocolos y PWA instalable) se contemplan como evolución (§2.6). El cobro de suscripción con Wompi es RF-0.7, implementado en 2.1.0; sustituye la exclusión anterior de RF-F.1. </w:t>
+      </w:r>
+      <w:r>
+        <w:t>La activación con dinero real requiere resolver D8/D10 y la validación operativa del proveedor.</w:t>
       </w:r>
     </w:p>
     <w:p>
@@ -3302,7 +3356,7 @@
         <w:pStyle w:val="Ttulo2"/>
       </w:pPr>
       <w:bookmarkStart w:id="6" w:name="_3c32702167a50f9f1e47f548e3fd9a17f4efae6"/>
-      <w:bookmarkStart w:id="7" w:name="_Toc243862753"/>
+      <w:bookmarkStart w:id="7" w:name="_Toc243900813"/>
       <w:bookmarkEnd w:id="4"/>
       <w:r>
         <w:t>1.3 Personal involucrado</w:t>
@@ -3552,7 +3606,7 @@
         <w:pStyle w:val="Ttulo2"/>
       </w:pPr>
       <w:bookmarkStart w:id="8" w:name="_202ce33122313366988e60811cd45f2e3fac5ed"/>
-      <w:bookmarkStart w:id="9" w:name="_Toc243862754"/>
+      <w:bookmarkStart w:id="9" w:name="_Toc243900814"/>
       <w:bookmarkEnd w:id="6"/>
       <w:r>
         <w:lastRenderedPageBreak/>
@@ -4228,7 +4282,7 @@
         <w:pStyle w:val="Ttulo2"/>
       </w:pPr>
       <w:bookmarkStart w:id="10" w:name="_f02bdecee650c876b7f695bd90111aab7702c00"/>
-      <w:bookmarkStart w:id="11" w:name="_Toc243862755"/>
+      <w:bookmarkStart w:id="11" w:name="_Toc243900815"/>
       <w:bookmarkEnd w:id="8"/>
       <w:r>
         <w:t>1.5 Referencias normativas</w:t>
@@ -4251,7 +4305,10 @@
         <w:t>ISO/IEC/IEEE 29148:2018</w:t>
       </w:r>
       <w:r>
-        <w:t xml:space="preserve"> — Systems and software engineering — Requirements engineering (estándar principal de este documento).</w:t>
+        <w:t xml:space="preserve"> </w:t>
+      </w:r>
+      <w:r>
+        <w:t>— Systems and software engineering — Requirements engineering (estándar principal de este documento).</w:t>
       </w:r>
     </w:p>
     <w:p>
@@ -4308,7 +4365,7 @@
         <w:pStyle w:val="Ttulo1"/>
       </w:pPr>
       <w:bookmarkStart w:id="12" w:name="_272b38cfc2ff6ab53ecdbfe24b7ba0e5f181bd6"/>
-      <w:bookmarkStart w:id="13" w:name="_Toc243862756"/>
+      <w:bookmarkStart w:id="13" w:name="_Toc243900816"/>
       <w:bookmarkEnd w:id="0"/>
       <w:bookmarkEnd w:id="10"/>
       <w:r>
@@ -4322,7 +4379,7 @@
         <w:pStyle w:val="Ttulo2"/>
       </w:pPr>
       <w:bookmarkStart w:id="14" w:name="_530c4174996bbc2c9398cdddea6478430b49400"/>
-      <w:bookmarkStart w:id="15" w:name="_Toc243862757"/>
+      <w:bookmarkStart w:id="15" w:name="_Toc243900817"/>
       <w:r>
         <w:t>2.1 Perspectiva del producto</w:t>
       </w:r>
@@ -4415,7 +4472,7 @@
           <w:noProof/>
         </w:rPr>
         <w:drawing>
-          <wp:inline distT="0" distB="0" distL="0" distR="0" wp14:anchorId="284607B7" wp14:editId="284607B8">
+          <wp:inline distT="0" distB="0" distL="0" distR="0" wp14:anchorId="390AB87B" wp14:editId="390AB87C">
             <wp:extent cx="5939999" cy="2903365"/>
             <wp:effectExtent l="0" t="0" r="0" b="0"/>
             <wp:docPr id="20" name="Picture"/>
@@ -4424,7 +4481,7 @@
               <a:graphicData uri="http://schemas.openxmlformats.org/drawingml/2006/picture">
                 <pic:pic xmlns:pic="http://schemas.openxmlformats.org/drawingml/2006/picture">
                   <pic:nvPicPr>
-                    <pic:cNvPr id="21" name="Picture" descr="C:\Users\Usuario\AppData\Local\Temp\zooki-docs-n4cm6I\ers-figura-1.png"/>
+                    <pic:cNvPr id="21" name="Picture" descr="C:\Users\Usuario\AppData\Local\Temp\zooki-docs-kz6Frr\ers-figura-1.png"/>
                     <pic:cNvPicPr>
                       <a:picLocks noChangeAspect="1" noChangeArrowheads="1"/>
                     </pic:cNvPicPr>
@@ -4498,7 +4555,7 @@
           <w:noProof/>
         </w:rPr>
         <w:drawing>
-          <wp:inline distT="0" distB="0" distL="0" distR="0" wp14:anchorId="284607B9" wp14:editId="284607BA">
+          <wp:inline distT="0" distB="0" distL="0" distR="0" wp14:anchorId="390AB87D" wp14:editId="390AB87E">
             <wp:extent cx="5939999" cy="3650624"/>
             <wp:effectExtent l="0" t="0" r="0" b="0"/>
             <wp:docPr id="23" name="Picture"/>
@@ -4507,7 +4564,7 @@
               <a:graphicData uri="http://schemas.openxmlformats.org/drawingml/2006/picture">
                 <pic:pic xmlns:pic="http://schemas.openxmlformats.org/drawingml/2006/picture">
                   <pic:nvPicPr>
-                    <pic:cNvPr id="24" name="Picture" descr="C:\Users\Usuario\AppData\Local\Temp\zooki-docs-n4cm6I\ers-figura-2.png"/>
+                    <pic:cNvPr id="24" name="Picture" descr="C:\Users\Usuario\AppData\Local\Temp\zooki-docs-kz6Frr\ers-figura-2.png"/>
                     <pic:cNvPicPr>
                       <a:picLocks noChangeAspect="1" noChangeArrowheads="1"/>
                     </pic:cNvPicPr>
@@ -4545,7 +4602,7 @@
         <w:pStyle w:val="Ttulo2"/>
       </w:pPr>
       <w:bookmarkStart w:id="16" w:name="_8fb72911118d5239a4ddf916fa7f6994c841597"/>
-      <w:bookmarkStart w:id="17" w:name="_Toc243862758"/>
+      <w:bookmarkStart w:id="17" w:name="_Toc243900818"/>
       <w:bookmarkEnd w:id="14"/>
       <w:r>
         <w:t>2.2 Funciones principales</w:t>
@@ -4614,7 +4671,10 @@
         <w:t>Historia clínica + ★ soporte a la decisión clínica (Grafo I):</w:t>
       </w:r>
       <w:r>
-        <w:t xml:space="preserve"> consultas, tratamientos y archivos; sugerencia de diagnósticos y alertas de toxicidad/interacción.</w:t>
+        <w:t xml:space="preserve"> </w:t>
+      </w:r>
+      <w:r>
+        <w:t>consultas, tratamientos y archivos; sugerencia de diagnósticos y alertas de toxicidad/interacción.</w:t>
       </w:r>
     </w:p>
     <w:p>
@@ -4776,7 +4836,7 @@
         <w:pStyle w:val="Ttulo2"/>
       </w:pPr>
       <w:bookmarkStart w:id="18" w:name="_a6c21597a6595bc146d22c17741d693a713bfb2"/>
-      <w:bookmarkStart w:id="19" w:name="_Toc243862759"/>
+      <w:bookmarkStart w:id="19" w:name="_Toc243900819"/>
       <w:bookmarkEnd w:id="16"/>
       <w:r>
         <w:t>2.3 Características de los usuarios (clases de usuario)</w:t>
@@ -5250,7 +5310,7 @@
         <w:pStyle w:val="Ttulo2"/>
       </w:pPr>
       <w:bookmarkStart w:id="20" w:name="_11fda6f447d6f2a37cc502977dae18f9e3ad8b3"/>
-      <w:bookmarkStart w:id="21" w:name="_Toc243862760"/>
+      <w:bookmarkStart w:id="21" w:name="_Toc243900820"/>
       <w:bookmarkEnd w:id="18"/>
       <w:r>
         <w:t>2.4 Restricciones</w:t>
@@ -5402,7 +5462,7 @@
         <w:pStyle w:val="Ttulo2"/>
       </w:pPr>
       <w:bookmarkStart w:id="22" w:name="_26d80a1bad7ec0339e80ed2e634398510a6938c"/>
-      <w:bookmarkStart w:id="23" w:name="_Toc243862761"/>
+      <w:bookmarkStart w:id="23" w:name="_Toc243900821"/>
       <w:bookmarkEnd w:id="20"/>
       <w:r>
         <w:t>2.5 Suposiciones y dependencias</w:t>
@@ -5486,7 +5546,7 @@
         <w:pStyle w:val="Ttulo2"/>
       </w:pPr>
       <w:bookmarkStart w:id="24" w:name="_fdd8f268017d5796a6252a81775e10e2c2202be"/>
-      <w:bookmarkStart w:id="25" w:name="_Toc243862762"/>
+      <w:bookmarkStart w:id="25" w:name="_Toc243900822"/>
       <w:bookmarkEnd w:id="22"/>
       <w:r>
         <w:t>2.6 Requisitos futuros y evolución previsible</w:t>
@@ -5951,7 +6011,7 @@
         <w:pStyle w:val="Ttulo1"/>
       </w:pPr>
       <w:bookmarkStart w:id="26" w:name="_e16cbc17efb9516401e41690962f9175e4cde1d"/>
-      <w:bookmarkStart w:id="27" w:name="_Toc243862763"/>
+      <w:bookmarkStart w:id="27" w:name="_Toc243900823"/>
       <w:bookmarkEnd w:id="12"/>
       <w:bookmarkEnd w:id="24"/>
       <w:r>
@@ -6009,7 +6069,7 @@
         <w:pStyle w:val="Ttulo2"/>
       </w:pPr>
       <w:bookmarkStart w:id="28" w:name="_b1c2f4b7e2eba5d64c8f3d3850d1e5e5653bfa3"/>
-      <w:bookmarkStart w:id="29" w:name="_Toc243862764"/>
+      <w:bookmarkStart w:id="29" w:name="_Toc243900824"/>
       <w:r>
         <w:t>3.1 Interfaces externas</w:t>
       </w:r>
@@ -6815,7 +6875,10 @@
         <w:t>id_clinica</w:t>
       </w:r>
       <w:r>
-        <w:t xml:space="preserve"> y toda consulta lo filtra. Las excepciones son los catálogos globales, el grafo de conocimiento clínico, el propietario y la mascota, que son globales y se vinculan a cada clínica por tablas puente. El modelo entidad-relación completo de la v2.0 (con las entidades nuevas de clínicas, planes, suscripciones, grafos y reseñas) se especifica en el apéndice §5.2 y en el documento </w:t>
+        <w:t xml:space="preserve"> </w:t>
+      </w:r>
+      <w:r>
+        <w:t xml:space="preserve">y toda consulta lo filtra. Las excepciones son los catálogos globales, el grafo de conocimiento clínico, el propietario y la mascota, que son globales y se vinculan a cada clínica por tablas puente. El modelo entidad-relación completo de la v2.0 (con las entidades nuevas de clínicas, planes, suscripciones, grafos y reseñas) se especifica en el apéndice §5.2 y en el documento </w:t>
       </w:r>
       <w:r>
         <w:rPr>
@@ -6833,7 +6896,7 @@
         <w:pStyle w:val="Ttulo2"/>
       </w:pPr>
       <w:bookmarkStart w:id="33" w:name="_965d05d004114bc2ee0e90669218ec0da0e554f"/>
-      <w:bookmarkStart w:id="34" w:name="_Toc243862765"/>
+      <w:bookmarkStart w:id="34" w:name="_Toc243900825"/>
       <w:bookmarkEnd w:id="28"/>
       <w:bookmarkEnd w:id="32"/>
       <w:r>
@@ -6856,7 +6919,10 @@
         <w:t>misma numeración en todos los documentos</w:t>
       </w:r>
       <w:r>
-        <w:t xml:space="preserve"> (Historias de Usuario, Requisitos Específicos, Reglas de Negocio y Modelos).</w:t>
+        <w:t xml:space="preserve"> </w:t>
+      </w:r>
+      <w:r>
+        <w:t>(Historias de Usuario, Requisitos Específicos, Reglas de Negocio y Modelos).</w:t>
       </w:r>
     </w:p>
     <w:p>
@@ -7329,7 +7395,13 @@
               <w:keepNext/>
             </w:pPr>
             <w:r>
-              <w:t>Aplicar los límites del plan al operar (p. ej. máximo de mascotas y de citas/consultas por período en el plan gratuito), excepto en las urgencias 🔴, que nunca se bloquean por límite ni por mora.</w:t>
+              <w:t xml:space="preserve">Aplicar los límites del plan al operar (p. ej. máximo de mascotas y de citas/consultas por período en el plan gratuito), excepto en las urgencias </w:t>
+            </w:r>
+            <w:r>
+              <w:t>🔴</w:t>
+            </w:r>
+            <w:r>
+              <w:t>, que nunca se bloquean por límite ni por mora.</w:t>
             </w:r>
           </w:p>
         </w:tc>
@@ -7357,7 +7429,13 @@
               <w:keepNext/>
             </w:pPr>
             <w:r>
-              <w:t>Al superar el límite, el sistema impide la acción e informa el motivo; un caso 🔴 se atiende igual.</w:t>
+              <w:t xml:space="preserve">Al superar el límite, el sistema impide la acción e informa el motivo; un caso </w:t>
+            </w:r>
+            <w:r>
+              <w:t>🔴</w:t>
+            </w:r>
+            <w:r>
+              <w:t xml:space="preserve"> se atiende igual.</w:t>
             </w:r>
           </w:p>
         </w:tc>
@@ -8750,7 +8828,10 @@
               <w:t>identidad global</w:t>
             </w:r>
             <w:r>
-              <w:t xml:space="preserve"> del propietario, vinculable a varias clínicas: una sola ficha, un solo carnet y un solo QR; antes de registrar, ofrecer vincular una mascota existente del propietario; cada clínica asigna su propio número de historia clínica.</w:t>
+              <w:t xml:space="preserve"> </w:t>
+            </w:r>
+            <w:r>
+              <w:t>del propietario, vinculable a varias clínicas: una sola ficha, un solo carnet y un solo QR; antes de registrar, ofrecer vincular una mascota existente del propietario; cada clínica asigna su propio número de historia clínica.</w:t>
             </w:r>
           </w:p>
         </w:tc>
@@ -9701,7 +9782,10 @@
         <w:t>apoyo</w:t>
       </w:r>
       <w:r>
-        <w:t>, no diagnóstico automático: la decisión final es del veterinario. Su cobertura depende del conocimiento cargado (acotado inicialmente a perros y gatos). Cada elemento tiene fuente y validación pendiente; las pruebas de software no certifican validez clínica. En 2.0.0-alpha.4 están implementados el formato/cargador, el conocimiento inicial con fuentes, el mapa, el apoyo diagnóstico y las alertas al prescribir. El motor de triage, buscador y batería están hechos; su captura y operación en agenda, urgencias y ajuste veterinario se integran en M4. Carnet y QR con alertas siguen para el final de la v2.0.</w:t>
+        <w:t xml:space="preserve">, no diagnóstico automático: la decisión final es del veterinario. Su cobertura depende del conocimiento cargado (acotado inicialmente a perros y gatos). Cada elemento tiene fuente y validación pendiente; las pruebas de software no certifican validez clínica. </w:t>
+      </w:r>
+      <w:r>
+        <w:t>En 2.0.0-alpha.4 están implementados el formato/cargador, el conocimiento inicial con fuentes, el mapa, el apoyo diagnóstico y las alertas al prescribir. El motor de triage, buscador y batería están hechos; su captura y operación en agenda, urgencias y ajuste veterinario se integran en M4. Carnet y QR con alertas siguen para el final de la v2.0.</w:t>
       </w:r>
     </w:p>
     <w:p>
@@ -11018,7 +11102,13 @@
               <w:keepNext/>
             </w:pPr>
             <w:r>
-              <w:t>Ante un caso 🔴 fuera del horario de la clínica, informar que está cerrada, mostrar su teléfono de urgencias y recomendar un servicio de urgencias 24 horas.</w:t>
+              <w:t xml:space="preserve">Ante un caso </w:t>
+            </w:r>
+            <w:r>
+              <w:t>🔴</w:t>
+            </w:r>
+            <w:r>
+              <w:t xml:space="preserve"> fuera del horario de la clínica, informar que está cerrada, mostrar su teléfono de urgencias y recomendar un servicio de urgencias 24 horas.</w:t>
             </w:r>
           </w:p>
         </w:tc>
@@ -13343,7 +13433,7 @@
         <w:pStyle w:val="Ttulo2"/>
       </w:pPr>
       <w:bookmarkStart w:id="46" w:name="_91faa842a79df0e34112c2e349ad0681a2800df"/>
-      <w:bookmarkStart w:id="47" w:name="_Toc243862766"/>
+      <w:bookmarkStart w:id="47" w:name="_Toc243900826"/>
       <w:bookmarkEnd w:id="33"/>
       <w:bookmarkEnd w:id="45"/>
       <w:r>
@@ -14282,7 +14372,10 @@
               <w:t>Aislamiento multi-inquilino:</w:t>
             </w:r>
             <w:r>
-              <w:t xml:space="preserve"> ninguna operación devuelve ni modifica registros de otra clínica fuera de las excepciones explícitas. Son globales usuarios, mascotas, catálogos taxonómicos y Grafo I. Toda clínica vinculada ve alergias, alertas, vacunas y desparasitaciones de la mascota; las consultas y tratamientos de otra clínica se muestran solo con autorización del propietario (RF-2.6). El motor de prescripción puede leer internamente medicación protegida solo para emitir la alerta genérica de RN-211, sin devolver el tratamiento.</w:t>
+              <w:t xml:space="preserve"> </w:t>
+            </w:r>
+            <w:r>
+              <w:t>ninguna operación devuelve ni modifica registros de otra clínica fuera de las excepciones explícitas. Son globales usuarios, mascotas, catálogos taxonómicos y Grafo I. Toda clínica vinculada ve alergias, alertas, vacunas y desparasitaciones de la mascota; las consultas y tratamientos de otra clínica se muestran solo con autorización del propietario (RF-2.6). El motor de prescripción puede leer internamente medicación protegida solo para emitir la alerta genérica de RN-211, sin devolver el tratamiento.</w:t>
             </w:r>
           </w:p>
         </w:tc>
@@ -15349,7 +15442,7 @@
         <w:pStyle w:val="Ttulo1"/>
       </w:pPr>
       <w:bookmarkStart w:id="53" w:name="_8872f59400eca311bb7b0740442423f0a836d6f"/>
-      <w:bookmarkStart w:id="54" w:name="_Toc243862767"/>
+      <w:bookmarkStart w:id="54" w:name="_Toc243900827"/>
       <w:bookmarkEnd w:id="26"/>
       <w:bookmarkEnd w:id="46"/>
       <w:bookmarkEnd w:id="52"/>
@@ -15676,7 +15769,7 @@
         <w:pStyle w:val="Ttulo1"/>
       </w:pPr>
       <w:bookmarkStart w:id="55" w:name="_11f3dc26fe4f135be80b976bfe46d60e018a5ba"/>
-      <w:bookmarkStart w:id="56" w:name="_Toc243862768"/>
+      <w:bookmarkStart w:id="56" w:name="_Toc243900828"/>
       <w:bookmarkEnd w:id="53"/>
       <w:r>
         <w:lastRenderedPageBreak/>
@@ -15689,7 +15782,7 @@
         <w:pStyle w:val="Ttulo2"/>
       </w:pPr>
       <w:bookmarkStart w:id="57" w:name="_f7580e8bc275eea58d00a0ff871ef60674ed780"/>
-      <w:bookmarkStart w:id="58" w:name="_Toc243862769"/>
+      <w:bookmarkStart w:id="58" w:name="_Toc243900829"/>
       <w:r>
         <w:t>5.1 Casos de uso</w:t>
       </w:r>
@@ -17483,7 +17576,7 @@
         <w:pStyle w:val="Ttulo2"/>
       </w:pPr>
       <w:bookmarkStart w:id="59" w:name="_5580fd549b2ecd3c29ad00fe23a279932ebe402"/>
-      <w:bookmarkStart w:id="60" w:name="_Toc243862770"/>
+      <w:bookmarkStart w:id="60" w:name="_Toc243900830"/>
       <w:bookmarkEnd w:id="57"/>
       <w:r>
         <w:t>5.2 Modelo de datos y diccionario de datos (v2.0)</w:t>
@@ -17504,7 +17597,10 @@
         <w:t>id_clinica</w:t>
       </w:r>
       <w:r>
-        <w:t xml:space="preserve"> en los registros que pertenecen a una clínica, con excepciones globales explícitas para personas, mascotas, catálogos y Grafo I, y (b) nuevas entidades para la plataforma, los grafos, la reputación y las comunicaciones. El MER completo en Mermaid se especifica en el documento Modelo Entidad-Relación (MER).</w:t>
+        <w:t xml:space="preserve"> </w:t>
+      </w:r>
+      <w:r>
+        <w:t>en los registros que pertenecen a una clínica, con excepciones globales explícitas para personas, mascotas, catálogos y Grafo I, y (b) nuevas entidades para la plataforma, los grafos, la reputación y las comunicaciones. El MER completo en Mermaid se especifica en el documento Modelo Entidad-Relación (MER).</w:t>
       </w:r>
     </w:p>
     <w:p>
@@ -18554,7 +18650,10 @@
         <w:t>Destino preparatorio M4/B1:</w:t>
       </w:r>
       <w:r>
-        <w:t xml:space="preserve"> cierres_clinica, bloques_agenda, solicitudes_agenda (revisión/derivación/espera), pausas_cita, operaciones_agenda y eventos_agenda; ampliaciones de citas, ausencias_veterinario, reasignaciones e ingresos_emergencia, con diccionario/restricciones/transición en el MER. No están instaladas en alpha.4; schema_migraciones sigue siendo técnica y no se suma al conteo de negocio.</w:t>
+        <w:t xml:space="preserve"> </w:t>
+      </w:r>
+      <w:r>
+        <w:t>cierres_clinica, bloques_agenda, solicitudes_agenda (revisión/derivación/espera), pausas_cita, operaciones_agenda y eventos_agenda; ampliaciones de citas, ausencias_veterinario, reasignaciones e ingresos_emergencia, con diccionario/restricciones/transición en el MER. No están instaladas en alpha.4; schema_migraciones sigue siendo técnica y no se suma al conteo de negocio.</w:t>
       </w:r>
     </w:p>
     <w:p>
@@ -18767,7 +18866,10 @@
         <w:t>tratamientos</w:t>
       </w:r>
       <w:r>
-        <w:t xml:space="preserve"> suma el nodo del fármaco en el Grafo I y sus fechas de inicio y fin, para conocer la medicación vigente; </w:t>
+        <w:t xml:space="preserve"> </w:t>
+      </w:r>
+      <w:r>
+        <w:t xml:space="preserve">suma el nodo del fármaco en el Grafo I y sus fechas de inicio y fin, para conocer la medicación vigente; </w:t>
       </w:r>
       <w:r>
         <w:rPr>
@@ -18866,7 +18968,10 @@
         <w:t>citas.prioridad</w:t>
       </w:r>
       <w:r>
-        <w:t xml:space="preserve"> pasa a ser el nivel de triage de 4 niveles; </w:t>
+        <w:t xml:space="preserve"> </w:t>
+      </w:r>
+      <w:r>
+        <w:t xml:space="preserve">pasa a ser el nivel de triage de 4 niveles; </w:t>
       </w:r>
       <w:r>
         <w:rPr>
@@ -19075,7 +19180,7 @@
         <w:pStyle w:val="Ttulo2"/>
       </w:pPr>
       <w:bookmarkStart w:id="61" w:name="_fbf38eebe414c78cb475c989b20e7851be1b9a4"/>
-      <w:bookmarkStart w:id="62" w:name="_Toc243862771"/>
+      <w:bookmarkStart w:id="62" w:name="_Toc243900831"/>
       <w:bookmarkEnd w:id="59"/>
       <w:r>
         <w:t>5.3 Matriz de trazabilidad (requisito → módulo → verificación)</w:t>
@@ -20063,7 +20168,7 @@
         <w:pStyle w:val="Ttulo2"/>
       </w:pPr>
       <w:bookmarkStart w:id="63" w:name="_af48f3c1dcd6ad7c9bf690234a607d52526f60f"/>
-      <w:bookmarkStart w:id="64" w:name="_Toc243862772"/>
+      <w:bookmarkStart w:id="64" w:name="_Toc243900832"/>
       <w:bookmarkEnd w:id="61"/>
       <w:r>
         <w:t>5.4 Criterios de aceptación global</w:t>
@@ -20085,7 +20190,10 @@
         <w:t>v2.0</w:t>
       </w:r>
       <w:r>
-        <w:t xml:space="preserve"> se considera conforme cuando: (a) el 100% de los RF de prioridad Alta asignados a sus historias están implementados y superan su verificación; (b) el 80% o más de los RF de prioridad Media asignados a sus historias están implementados; (c) el </w:t>
+        <w:t xml:space="preserve"> </w:t>
+      </w:r>
+      <w:r>
+        <w:t xml:space="preserve">se considera conforme cuando: (a) el 100% de los RF de prioridad Alta asignados a sus historias están implementados y superan su verificación; (b) el 80% o más de los RF de prioridad Media asignados a sus historias están implementados; (c) el </w:t>
       </w:r>
       <w:r>
         <w:rPr>
@@ -20095,7 +20203,10 @@
         <w:t>aislamiento multi-inquilino (RNF-11)</w:t>
       </w:r>
       <w:r>
-        <w:t xml:space="preserve"> se verifica sin fugas entre clínicas; (d) los dos grafos (I y II) se demuestran funcionando en el flujo de consulta y de agenda; (e) no existen defectos críticos ni mayores sin cerrar; y (f) la documentación técnica (README, ERS, MER y manual) está en el repositorio. La </w:t>
+        <w:t xml:space="preserve"> </w:t>
+      </w:r>
+      <w:r>
+        <w:t xml:space="preserve">se verifica sin fugas entre clínicas; (d) los dos grafos (I y II) se demuestran funcionando en el flujo de consulta y de agenda; (e) no existen defectos críticos ni mayores sin cerrar; y (f) la documentación técnica (README, ERS, MER y manual) está en el repositorio. La </w:t>
       </w:r>
       <w:r>
         <w:rPr>
@@ -20113,7 +20224,7 @@
         <w:pStyle w:val="Ttulo2"/>
       </w:pPr>
       <w:bookmarkStart w:id="65" w:name="_0d285be43461a565caa5d7afb2af5b21132b4e6"/>
-      <w:bookmarkStart w:id="66" w:name="_Toc243862773"/>
+      <w:bookmarkStart w:id="66" w:name="_Toc243900833"/>
       <w:bookmarkEnd w:id="63"/>
       <w:r>
         <w:lastRenderedPageBreak/>
@@ -24462,7 +24573,7 @@
               <w:noProof/>
             </w:rPr>
             <w:drawing>
-              <wp:inline distT="0" distB="0" distL="0" distR="0" wp14:anchorId="284607C5" wp14:editId="284607C6">
+              <wp:inline distT="0" distB="0" distL="0" distR="0" wp14:anchorId="390AB889" wp14:editId="390AB88A">
                 <wp:extent cx="324000" cy="324000"/>
                 <wp:effectExtent l="0" t="0" r="0" b="0"/>
                 <wp:docPr id="9001" name="Logo Zooki"/>
@@ -24522,7 +24633,7 @@
               <w:sz w:val="17"/>
               <w:szCs w:val="17"/>
             </w:rPr>
-            <w:t>Zooki v2.1</w:t>
+            <w:t>Zooki v2.2</w:t>
           </w:r>
         </w:p>
         <w:p>
@@ -24629,7 +24740,7 @@
   <w:abstractNum w:abstractNumId="0" w15:restartNumberingAfterBreak="0">
     <w:nsid w:val="0000A990"/>
     <w:multiLevelType w:val="multilevel"/>
-    <w:tmpl w:val="A9387E78"/>
+    <w:tmpl w:val="D4B24C9E"/>
     <w:lvl w:ilvl="0">
       <w:numFmt w:val="bullet"/>
       <w:lvlText w:val=" "/>
@@ -24706,7 +24817,7 @@
   <w:abstractNum w:abstractNumId="1" w15:restartNumberingAfterBreak="0">
     <w:nsid w:val="0000A991"/>
     <w:multiLevelType w:val="multilevel"/>
-    <w:tmpl w:val="678A8E86"/>
+    <w:tmpl w:val="9500BEDA"/>
     <w:lvl w:ilvl="0">
       <w:numFmt w:val="bullet"/>
       <w:lvlText w:val=""/>
@@ -24807,22 +24918,22 @@
       </w:rPr>
     </w:lvl>
   </w:abstractNum>
-  <w:num w:numId="1" w16cid:durableId="1386103666">
+  <w:num w:numId="1" w16cid:durableId="1331566406">
     <w:abstractNumId w:val="0"/>
   </w:num>
-  <w:num w:numId="2" w16cid:durableId="839544960">
+  <w:num w:numId="2" w16cid:durableId="1984381408">
     <w:abstractNumId w:val="1"/>
   </w:num>
-  <w:num w:numId="3" w16cid:durableId="1551649761">
+  <w:num w:numId="3" w16cid:durableId="2034380639">
     <w:abstractNumId w:val="1"/>
   </w:num>
-  <w:num w:numId="4" w16cid:durableId="616136500">
+  <w:num w:numId="4" w16cid:durableId="690448401">
     <w:abstractNumId w:val="1"/>
   </w:num>
-  <w:num w:numId="5" w16cid:durableId="700133515">
+  <w:num w:numId="5" w16cid:durableId="467362237">
     <w:abstractNumId w:val="1"/>
   </w:num>
-  <w:num w:numId="6" w16cid:durableId="1214274782">
+  <w:num w:numId="6" w16cid:durableId="515928262">
     <w:abstractNumId w:val="1"/>
   </w:num>
 </w:numbering>

</xml_diff>